<commit_message>
Align interim analysis with review activity and validate models
</commit_message>
<xml_diff>
--- a/reports/Interim_Project_Report.docx
+++ b/reports/Interim_Project_Report.docx
@@ -7,7 +7,7 @@
         <w:pStyle w:val="Title"/>
       </w:pPr>
       <w:r>
-        <w:t>Melbourne Airbnb Performance</w:t>
+        <w:t>Melbourne Airbnb Review Activity</w:t>
       </w:r>
     </w:p>
     <w:p>
@@ -72,7 +72,7 @@
         <w:rPr>
           <w:sz w:val="18"/>
         </w:rPr>
-        <w:t>Report body: 1,001 words | Prepared 13 September 2026</w:t>
+        <w:t>Report body: 1,062 words | Prepared 13 September 2026</w:t>
       </w:r>
     </w:p>
     <w:p>
@@ -85,12 +85,12 @@
     </w:p>
     <w:p>
       <w:r>
-        <w:t>A prospective operator considering several Airbnb properties in Melbourne needs evidence about which property configurations attract stronger demand before committing to leases and furnishings. Our project compares existing listings using the three Inside Airbnb files supplied for the subject. The sample contains 25,728 listings, with substantial differences in prices, property types and recent review activity. These differences make a single citywide average an inadequate guide to property selection.</w:t>
+        <w:t>A prospective operator considering several Airbnb properties in Melbourne needs a way to compare locations and dwelling configurations before committing to leases and furnishings. The school-supplied Inside Airbnb snapshot contains considerable variation in quoted prices and recent guest reviews. Citywide averages conceal these differences, while comparisons between conventional apartments and specialised holiday accommodation can be misleading.</w:t>
       </w:r>
     </w:p>
     <w:p>
       <w:r>
-        <w:t>Work completed so far establishes a data-cleaning pipeline, descriptive comparisons and exploratory regression models. It also identifies a constraint that changes the project: reported revenue is estimated and operating costs are absent. We therefore focus on relative listing performance rather than profitability. The intended output is an internal benchmarking framework and a validated model for identifying listings with high estimated revenue.</w:t>
+        <w:t>Our project combines descriptive comparisons with predictive modelling of review activity. The business output is a shortlist of comparable residential segments for further investigation. Reviews provide an observable activity measure, but they do not measure profit. Because actual leases and operating costs are unavailable, we have removed external-rent scenarios from the current analysis.</w:t>
       </w:r>
     </w:p>
     <w:p>
@@ -109,17 +109,22 @@
         <w:rPr>
           <w:b/>
         </w:rPr>
-        <w:t>Which observable property characteristics are associated with high estimated annual revenue among comparable Melbourne Airbnb listings, and how accurately can models identify upper-quartile listings belonging to hosts excluded from model training?</w:t>
+        <w:t>Among Greater Melbourne standard entire-home segments with at least 50 eligible listings, which LGA × dwelling-type × bedroom configurations have the highest mean out-of-sample predicted probability of recording at least 22 guest reviews in the twelve months preceding the snapshot?</w:t>
       </w:r>
     </w:p>
     <w:p>
       <w:r>
-        <w:t>The descriptive objective is to compare revenue distributions and property characteristics across local government areas (LGAs) and dwelling configurations. The predictive objective is to classify listings above their segment's 75th revenue percentile. We propose an entire-home sample with one to three bedrooms, comparing listings within LGA, bedroom count and broad dwelling type. Segment sizes and missing classifications will be reported before modelling.</w:t>
+        <w:t>The descriptive objective is to compare review distributions, attainment rates and property attributes. The predictive objective is to assess whether property information distinguishes higher-activity listings belonging to hosts excluded from training.</w:t>
       </w:r>
     </w:p>
     <w:p>
       <w:r>
-        <w:t>The upper quartile has an industry benchmarking precedent. Cushman &amp; Wakefield Georgia (2019, pp. 13–14) compares Airbnb revenue at the median, 75th and 90th percentiles. Hawthorne (2024), writing for Rabbu, explicitly uses the 75th percentile as a short-term rental assessment benchmark. These sources motivate our choice; they do not establish a universal success or profitability threshold. Cutoffs will be calculated from the supplied data, with the 90th percentile used as a sensitivity check. No external market observations or cost estimates enter the analysis.</w:t>
+        <w:t>Eligible listings are entire homes with one to three bedrooms, quoted prices of AUD30–1,500, and one of four dwelling types: rental unit, condo, home or townhouse. Apartments and condos form one class; homes and townhouses form the other. At least 50 listings must remain in each LGA–class–bedroom cell after these filters. This defines comparable residential stock without claiming that particular properties are available to lease.</w:t>
+      </w:r>
+    </w:p>
+    <w:p>
+      <w:r>
+        <w:t>The eligible sample's observed 75th percentile is 22 reviews. We retain that fixed event across modelling and sensitivity analyses. Because of ties, 25.82% meet it. Industry reports use percentile comparisons for revenue benchmarking (Cushman &amp; Wakefield Georgia, 2019), but our review threshold comes from the supplied data. It is neither a whole-market benchmark nor a profitability threshold, and cross-validation does not independently establish the choice of 22.</w:t>
       </w:r>
     </w:p>
     <w:p>
@@ -132,22 +137,22 @@
     </w:p>
     <w:p>
       <w:r>
-        <w:t>The supplied June 2026 snapshot comprises 25,728 listing records, approximately 9.39 million calendar records and 1.03 million reviews. Listing identifiers connect the files. Relevant variables include LGA, room and property type, bedrooms, bathrooms, guest capacity, amenities, quoted nightly price, minimum stay, host characteristics and review counts. Calendar records describe availability, not confirmed bookings, and contain no price column.</w:t>
+        <w:t>The June 2026 dataset comprises 25,728 listings, approximately 9.39 million calendar records and 1.03 million reviews. Relevant variables include listing and host identifiers, LGA, dwelling type, bedrooms, capacity, bathroom descriptions, amenities, quoted price and recent review counts. Calendar availability does not establish bookings, and the calendar file contains no prices.</w:t>
       </w:r>
     </w:p>
     <w:p>
       <w:r>
-        <w:t>Cleaning scripts convert textual missing values and currency strings, parse bathroom descriptions and count listed amenities. Thirteen entirely empty columns are removed. Prices and estimated revenue are missing for 6,553 listings (25.5%); bedrooms are missing for 4,679 (18.2%). Exploratory price models use an AUD30–1,500 range, retaining 18,927 listings. This is a working filter, not a market definition: 82.0% of excluded listings have no review in the preceding year, compared with 23.7% of retained listings. Selection bias must therefore accompany any comparison.</w:t>
+        <w:t>Cleaning converts currency strings and missing values and derives bathroom counts and amenity counts. The revised parsers preserve identifiers as text, recognise half-baths and parse amenity lists without treating commas inside names as additional amenities. Price and estimated revenue are each missing for 6,553 listings; bedrooms are missing for 4,679. The median quoted price is AUD243.67 among 19,175 non-missing values, compared with AUD242.50 in the 18,927-listing price-filtered sample.</w:t>
       </w:r>
     </w:p>
     <w:p>
       <w:r>
-        <w:t>Quoted prices are positively skewed: the median is AUD243.67 and the mean AUD317.65 among 19,175 listings with a non-missing quoted price. Entire homes account for 73.2% of the full sample. Within the filtered sample, median estimated annual revenue is AUD14,664 for entire homes and AUD936 for private rooms. This motivates comparison within similar property groups rather than interpreting the difference as a return from switching property type.</w:t>
+        <w:t>The main scope contains 8,967 listings, 4,081 hosts and 35 eligible segments. It retains 1,428 listings with zero reviews in the preceding year. Excluding these would remove relevant low-activity outcomes. There are 2,315 listings with at least 22 reviews. Their median amenity count is 46, compared with 42 below the threshold; both groups have a median capacity of four guests. These pooled differences describe composition rather than causal effects.</w:t>
       </w:r>
     </w:p>
     <w:p>
       <w:r>
-        <w:t>We verified that estimated revenue equals quoted price multiplied by estimated occupied nights, allowing for rounding. Estimated nights are themselves constructed from reviews and minimum-stay assumptions. These measures are imperfect proxies, and their rankings inherit those assumptions. Actual rent, cleaning, utilities and furnishing costs are unavailable. The snapshot also cannot identify genuine rental-arbitrage operators or establish future performance.</w:t>
+        <w:t>A current reproducibility limitation is that the local links to the original CSV files are broken. This update was rerun from the saved cleaned snapshot and aggregates. Their results can be reproduced, but original identifier precision, parsing and per-listing review windows still require verification against restored source files. First-review dates also indicate review history, not opening dates or continuous operation.</w:t>
       </w:r>
     </w:p>
     <w:p>
@@ -160,17 +165,27 @@
     </w:p>
     <w:p>
       <w:r>
-        <w:t>The completed descriptive analysis uses medians, distribution plots and grouped summaries. A hedonic ordinary least squares model relates log quoted price to listing attributes. Two exploratory activity models examine whether a listing has any recent review and, among active listings, its log review count. The activity models cluster standard errors by host to account for listings sharing an operator. These models describe associations and have not been validated on held-out data.</w:t>
+        <w:t>The descriptive stage reports each segment's sample size, distinct hosts, review quantiles and observed attainment rate. Host-cluster bootstrap intervals account for listings sharing an operator. The same eligible listings and fixed outcome feed the predictive stage, linking the segment comparisons to a common classification task.</w:t>
       </w:r>
     </w:p>
     <w:p>
       <w:r>
-        <w:t>For prediction, we will compare logistic regression, providing an interpretable baseline, with a random forest that can capture nonlinear relationships. The main predictors will describe properties and amenities. Price, review counts, minimum-stay variables, estimated occupancy and their derivatives will be excluded because they construct the revenue target. Superhost status and review scores will also be excluded from the main model because they reflect prior operating outcomes and are unavailable when selecting a property before hosting.</w:t>
+        <w:t>We fitted a regularised logistic regression and a random forest using LGA, configuration, guest capacity, bathroom count and amenity count. Reviews, ratings, Superhost status and estimated occupancy or revenue are excluded as predictors. Current price and minimum stay enter only a separate operating-controls sensitivity because they describe contemporaneous business settings.</w:t>
       </w:r>
     </w:p>
     <w:p>
       <w:r>
-        <w:t>Hosts will be separated into training and test groups using an 80/20 split. Five-fold cross-validation will also keep hosts separate. Imputation, segment cutoffs and tuning will be learned within training folds and then applied to validation or test listings. Sparse or unseen segments will be flagged rather than assigned unsupported local thresholds. We will report ROC-AUC against 0.5, and precision-recall AUC and precision among the highest-ranked quarter against held-out prevalence. The task predicts held-out listings' observed-snapshot classifications, not next year's income. R, data.table, ggplot2, broom and sandwich support completed work; ranger is planned for the forest.</w:t>
+        <w:t>Five-fold cross-validation separates hosts: no host appears in both training and validation within a fold. Imputation, category encoding and standardisation are fitted inside each training fold, following the scikit-learn guidance on avoiding information leakage. Both models use the same folds and fixed settings. These are exploratory cross-validation results, with no hyperparameter search or independent final test set.</w:t>
+      </w:r>
+    </w:p>
+    <w:p>
+      <w:r>
+        <w:t>Evaluation includes ROC-AUC, average precision, Brier score, calibration summaries and precision among the highest-scored quarter. The main logistic model achieves AUC 0.649, average precision 0.361 and Brier score 0.182. Its top-quarter precision is 37.8%, compared with the sample prevalence of 25.8%. The forest achieves AUC 0.631 and average precision 0.348. Adding operating controls raises logistic AUC to 0.720; this does not establish equivalent performance using information verified before opening.</w:t>
+      </w:r>
+    </w:p>
+    <w:p>
+      <w:r>
+        <w:t>Segment rankings average out-of-fold probabilities. Melbourne three-bedroom apartments have the highest mean logistic score, 39.5%, compared with an observed attainment rate of 39.8% across 543 listings. The accompanying intervals resample hosts while holding fitted scores fixed; they omit model-fitting uncertainty and do not establish a definitive best location. R supports cleaning and descriptive analysis; Python, pandas and scikit-learn support predictive validation.</w:t>
       </w:r>
     </w:p>
     <w:p>
@@ -183,17 +198,17 @@
     </w:p>
     <w:p>
       <w:r>
-        <w:t>Cleaning, exploratory summaries and regression analyses are complete. The price model uses 12,223 listings and achieves an adjusted R-squared of 0.558 for log price. This is in-sample fit, not predictive accuracy. The review-intensity model uses 12,648 listings and an adjusted R-squared of 0.411, indicating substantial unexplained variation. Scripts and result tables provide an audit trail for these findings.</w:t>
+        <w:t>The audit of the available cleaned data, descriptive segment comparisons, two predictive baselines and three sensitivity scenarios are complete. R and Python implementations agree on the main sample and labels. Separate calculations reproduce the model metrics and grouped predictions. Earlier cleaning issues identified during review include a 91-date availability window and an incomplete final month in the seasonality calculation; the code now uses 90 dates and excludes the final observed month respectively.</w:t>
       </w:r>
     </w:p>
     <w:p>
       <w:r>
-        <w:t>The main adjustment is to replace the earlier profit and cash-return framing with internal performance benchmarking. An earlier external-rent screen is excluded from the current research question. The proposed predictive analysis remains unfinished; no test-set accuracy or classifier results are claimed.</w:t>
+        <w:t>Restricting first reviews to on or before 1 June 2025 and reapplying the 50-listing rule leaves 4,812 listings in 16 segments. Their P75 is 29, demonstrating that review-history restrictions change the benchmark. The sensitivity retains the fixed 22-review event and zero-review outcomes. Removing the price filter gives a further check on sample selection.</w:t>
       </w:r>
     </w:p>
     <w:p>
       <w:r>
-        <w:t>By the end of Week 9, we will finalise comparable segments, inspect ties at percentile cutoffs and implement the host-grouped baseline. Week 10 will cover the forest, cross-validation and threshold sensitivity. Weeks 11–12 will focus on model interpretation, limitations and final reporting. Missing data and sparse segments are the main implementation risks. The repository README reproduces this interim report and links to the scripts and supporting analyses.</w:t>
+        <w:t>Week 9 will focus on restoring raw files, verifying identifiers and review windows, and assessing sparse positive outcomes. Week 10 will test repeated host splits, broader dwelling mappings and model tuning within nested validation. Weeks 11–12 will cover ranking uncertainty and final reporting. The README reproduces this report and links to the scripts, tables and figures. The findings support screening existing comparable listings; they do not forecast a new operator's future income.</w:t>
       </w:r>
     </w:p>
     <w:p>
@@ -251,45 +266,6 @@
         <w:rPr>
           <w:sz w:val="21"/>
         </w:rPr>
-        <w:t xml:space="preserve">Hawthorne, T. (2024, December 10). </w:t>
-      </w:r>
-      <w:r>
-        <w:rPr>
-          <w:i/>
-          <w:sz w:val="21"/>
-        </w:rPr>
-        <w:t>How to accurately estimate Airbnb revenue</w:t>
-      </w:r>
-      <w:r>
-        <w:rPr>
-          <w:sz w:val="21"/>
-        </w:rPr>
-        <w:t xml:space="preserve">. Rabbu. </w:t>
-      </w:r>
-      <w:hyperlink r:id="rId11">
-        <w:r>
-          <w:rPr>
-            <w:color w:val="174A78"/>
-            <w:u w:val="single"/>
-          </w:rPr>
-          <w:t>Article</w:t>
-        </w:r>
-      </w:hyperlink>
-      <w:r>
-        <w:rPr>
-          <w:sz w:val="21"/>
-        </w:rPr>
-        <w:t>.</w:t>
-      </w:r>
-    </w:p>
-    <w:p>
-      <w:pPr>
-        <w:spacing w:after="80"/>
-      </w:pPr>
-      <w:r>
-        <w:rPr>
-          <w:sz w:val="21"/>
-        </w:rPr>
         <w:t xml:space="preserve">Inside Airbnb. (2026). </w:t>
       </w:r>
       <w:r>
@@ -306,8 +282,75 @@
         <w:t xml:space="preserve"> [June 2026 dataset supplied through CMCE30005 LMS].</w:t>
       </w:r>
     </w:p>
+    <w:p>
+      <w:pPr>
+        <w:spacing w:after="80"/>
+      </w:pPr>
+      <w:r>
+        <w:rPr>
+          <w:sz w:val="21"/>
+        </w:rPr>
+        <w:t xml:space="preserve">Scikit-learn developers. (2025). </w:t>
+      </w:r>
+      <w:r>
+        <w:rPr>
+          <w:i/>
+          <w:sz w:val="21"/>
+        </w:rPr>
+        <w:t>Cross-validation</w:t>
+      </w:r>
+      <w:r>
+        <w:rPr>
+          <w:sz w:val="21"/>
+        </w:rPr>
+        <w:t xml:space="preserve"> and </w:t>
+      </w:r>
+      <w:r>
+        <w:rPr>
+          <w:i/>
+          <w:sz w:val="21"/>
+        </w:rPr>
+        <w:t>Common pitfalls and recommended practices</w:t>
+      </w:r>
+      <w:r>
+        <w:rPr>
+          <w:sz w:val="21"/>
+        </w:rPr>
+        <w:t xml:space="preserve">. </w:t>
+      </w:r>
+      <w:hyperlink r:id="rId11">
+        <w:r>
+          <w:rPr>
+            <w:color w:val="174A78"/>
+            <w:u w:val="single"/>
+          </w:rPr>
+          <w:t>Validation guidance</w:t>
+        </w:r>
+      </w:hyperlink>
+      <w:r>
+        <w:rPr>
+          <w:sz w:val="21"/>
+        </w:rPr>
+        <w:t xml:space="preserve">; </w:t>
+      </w:r>
+      <w:hyperlink r:id="rId12">
+        <w:r>
+          <w:rPr>
+            <w:color w:val="174A78"/>
+            <w:u w:val="single"/>
+          </w:rPr>
+          <w:t>Preprocessing guidance</w:t>
+        </w:r>
+      </w:hyperlink>
+      <w:r>
+        <w:rPr>
+          <w:sz w:val="21"/>
+        </w:rPr>
+        <w:t>.</w:t>
+      </w:r>
+    </w:p>
     <w:sectPr>
-      <w:footerReference w:type="default" r:id="rId12"/>
+      <w:footerReference w:type="default" r:id="rId13"/>
       <w:pgSz w:w="11906" w:h="16838"/>
       <w:pgMar w:top="1134" w:right="1247" w:bottom="1077" w:left="1247" w:header="720" w:footer="482" w:gutter="0"/>
       <w:cols w:space="720"/>

</xml_diff>

<commit_message>
Revise research question and derive benchmark from separate hosts
</commit_message>
<xml_diff>
--- a/reports/Interim_Project_Report.docx
+++ b/reports/Interim_Project_Report.docx
@@ -72,7 +72,7 @@
         <w:rPr>
           <w:sz w:val="18"/>
         </w:rPr>
-        <w:t>Report body: 1,062 words | Prepared 13 September 2026</w:t>
+        <w:t>Report body: 1,057 words | Updated 14 September 2026</w:t>
       </w:r>
     </w:p>
     <w:p>
@@ -85,12 +85,12 @@
     </w:p>
     <w:p>
       <w:r>
-        <w:t>A prospective operator considering several Airbnb properties in Melbourne needs a way to compare locations and dwelling configurations before committing to leases and furnishings. The school-supplied Inside Airbnb snapshot contains considerable variation in quoted prices and recent guest reviews. Citywide averages conceal these differences, while comparisons between conventional apartments and specialised holiday accommodation can be misleading.</w:t>
+        <w:t>A prospective operator considering several Melbourne Airbnb properties needs to compare locations and dwelling configurations before committing to leases and furnishings. The school-supplied Inside Airbnb snapshot shows substantial variation in quoted prices and guest reviews. Comparisons across conventional apartments and specialised holiday accommodation may reflect different property mixes.</w:t>
       </w:r>
     </w:p>
     <w:p>
       <w:r>
-        <w:t>Our project combines descriptive comparisons with predictive modelling of review activity. The business output is a shortlist of comparable residential segments for further investigation. Reviews provide an observable activity measure, but they do not measure profit. Because actual leases and operating costs are unavailable, we have removed external-rent scenarios from the current analysis.</w:t>
+        <w:t>Our project combines descriptive comparisons with predictive modelling of review activity to develop a preliminary segment shortlist. Reviews are observable, but they do not measure profit. The supplied data lack actual rental and operating costs, so financial viability and externally sourced rent scenarios are outside this analysis.</w:t>
       </w:r>
     </w:p>
     <w:p>
@@ -109,22 +109,22 @@
         <w:rPr>
           <w:b/>
         </w:rPr>
-        <w:t>Among Greater Melbourne standard entire-home segments with at least 50 eligible listings, which LGA × dwelling-type × bedroom configurations have the highest mean out-of-sample predicted probability of recording at least 22 guest reviews in the twelve months preceding the snapshot?</w:t>
+        <w:t>Among established standard entire-home listings with one to three bedrooms in Greater Melbourne, which LGA × dwelling-type × bedroom-count segments with at least 50 eligible listings have the highest mean out-of-sample predicted probability of meeting a common upper-quartile review-count benchmark in the 12 months preceding the snapshot?</w:t>
       </w:r>
     </w:p>
     <w:p>
       <w:r>
-        <w:t>The descriptive objective is to compare review distributions, attainment rates and property attributes. The predictive objective is to assess whether property information distinguishes higher-activity listings belonging to hosts excluded from training.</w:t>
+        <w:t>The descriptive objective is to compare review distributions, observed benchmark attainment and property attributes. The predictive objective is to test how well property information distinguishes higher-activity listings whose hosts are excluded from training.</w:t>
       </w:r>
     </w:p>
     <w:p>
       <w:r>
-        <w:t>Eligible listings are entire homes with one to three bedrooms, quoted prices of AUD30–1,500, and one of four dwelling types: rental unit, condo, home or townhouse. Apartments and condos form one class; homes and townhouses form the other. At least 50 listings must remain in each LGA–class–bedroom cell after these filters. This defines comparable residential stock without claiming that particular properties are available to lease.</w:t>
+        <w:t>Established means first review on or before 1 June 2025, relative to the start of the June 2026 snapshot month. This indicates review history, not an opening date or continuous operation. We retain entire rental units, condos, homes and townhouses with quoted prices of AUD30–1,500. Units and condos form one dwelling class; homes and townhouses form the other. These rules define comparable residential stock without establishing lease or subletting availability. Every reported segment needs at least 50 analysis listings after all eligibility and host-partition restrictions.</w:t>
       </w:r>
     </w:p>
     <w:p>
       <w:r>
-        <w:t>The eligible sample's observed 75th percentile is 22 reviews. We retain that fixed event across modelling and sensitivity analyses. Because of ties, 25.82% meet it. Industry reports use percentile comparisons for revenue benchmarking (Cushman &amp; Wakefield Georgia, 2019), but our review threshold comes from the supplied data. It is neither a whole-market benchmark nor a profitability threshold, and cross-validation does not independently establish the choice of 22.</w:t>
+        <w:t>The common benchmark is calculated from a separate group of reference hosts. It is not hard-coded in the research question or taken from a whole-market P75. Industry percentile comparisons provide methodological context (Cushman &amp; Wakefield Georgia, 2019), but the numerical review threshold comes solely from the supplied data and does not indicate profitability.</w:t>
       </w:r>
     </w:p>
     <w:p>
@@ -137,22 +137,22 @@
     </w:p>
     <w:p>
       <w:r>
-        <w:t>The June 2026 dataset comprises 25,728 listings, approximately 9.39 million calendar records and 1.03 million reviews. Relevant variables include listing and host identifiers, LGA, dwelling type, bedrooms, capacity, bathroom descriptions, amenities, quoted price and recent review counts. Calendar availability does not establish bookings, and the calendar file contains no prices.</w:t>
+        <w:t>The saved June 2026 data contain 25,728 listings, approximately 9.39 million calendar records and 1.03 million reviews. Variables include listing and host identifiers, LGA, dwelling type, bedrooms, capacity, bathrooms, amenities, quoted price, first review and recent review counts. Calendar availability does not establish bookings, and the calendar contains no prices.</w:t>
       </w:r>
     </w:p>
     <w:p>
       <w:r>
-        <w:t>Cleaning converts currency strings and missing values and derives bathroom counts and amenity counts. The revised parsers preserve identifiers as text, recognise half-baths and parse amenity lists without treating commas inside names as additional amenities. Price and estimated revenue are each missing for 6,553 listings; bedrooms are missing for 4,679. The median quoted price is AUD243.67 among 19,175 non-missing values, compared with AUD242.50 in the 18,927-listing price-filtered sample.</w:t>
+        <w:t>Cleaning addresses currency strings, missing values, bathroom descriptions and amenity lists. Revised parsers preserve identifier text, recognise half-baths and avoid counting commas inside amenity names as extra amenities. Quoted price is missing for 6,553 listings and bedrooms for 4,679. The median quoted price is AUD243.67 among 19,175 non-missing values. Price eligibility is a scope assumption, not proof that excluded values are erroneous.</w:t>
       </w:r>
     </w:p>
     <w:p>
       <w:r>
-        <w:t>The main scope contains 8,967 listings, 4,081 hosts and 35 eligible segments. It retains 1,428 listings with zero reviews in the preceding year. Excluding these would remove relevant low-activity outcomes. There are 2,315 listings with at least 22 reviews. Their median amenity count is 46, compared with 42 below the threshold; both groups have a median capacity of four guests. These pooled differences describe composition rather than causal effects.</w:t>
+        <w:t>After dwelling, price and history restrictions, 6,786 listings remain before partition and minimum-support rules. The final reference group has 899 listings from 424 hosts; its pooled P75 is 30 reviews. The separate analysis group contains 3,810 listings, 1,699 hosts and 14 segments, including 333 zero-review listings. Of these, 957 meet the benchmark (25.12%); integer ties are retained. Their median amenity count is 44 versus 43 below the benchmark. Both groups have median guest capacity four, so these pooled contrasts offer limited separation.</w:t>
       </w:r>
     </w:p>
     <w:p>
       <w:r>
-        <w:t>A current reproducibility limitation is that the local links to the original CSV files are broken. This update was rerun from the saved cleaned snapshot and aggregates. Their results can be reproduced, but original identifier precision, parsing and per-listing review windows still require verification against restored source files. First-review dates also indicate review history, not opening dates or continuous operation.</w:t>
+        <w:t>The original CSV links remain broken. This update uses saved cleaned data and aggregates; raw identifier precision, parsing and per-listing trailing-year review windows still require source verification. The history reference date does not substitute for an actual scrape date.</w:t>
       </w:r>
     </w:p>
     <w:p>
@@ -165,27 +165,27 @@
     </w:p>
     <w:p>
       <w:r>
-        <w:t>The descriptive stage reports each segment's sample size, distinct hosts, review quantiles and observed attainment rate. Host-cluster bootstrap intervals account for listings sharing an operator. The same eligible listings and fixed outcome feed the predictive stage, linking the segment comparisons to a common classification task.</w:t>
+        <w:t>A fixed hash of host identifiers reserves approximately 20% of hosts for benchmark development. After removing those hosts, we apply the 50-listing rule to analysis cells. Reference listings satisfy the same primary eligibility and belong to those supported cells. Their pooled P75, rounded upward to an integer, supplies one common cutoff. Reference hosts enter no model training, evaluation or sensitivity analysis pool, and analysis outcomes cannot change the cutoff.</w:t>
       </w:r>
     </w:p>
     <w:p>
       <w:r>
-        <w:t>We fitted a regularised logistic regression and a random forest using LGA, configuration, guest capacity, bathroom count and amenity count. Reviews, ratings, Superhost status and estimated occupancy or revenue are excluded as predictors. Current price and minimum stay enter only a separate operating-controls sensitivity because they describe contemporaneous business settings.</w:t>
+        <w:t>Descriptive tables report listing and distinct-host counts, quantiles, actual attainment and attribute profiles. Host-cluster bootstrap intervals account for shared operators. Wider dwelling and unrestricted-history comparisons assess composition sensitivity without claiming that excluded properties cannot be rented.</w:t>
       </w:r>
     </w:p>
     <w:p>
       <w:r>
-        <w:t>Five-fold cross-validation separates hosts: no host appears in both training and validation within a fold. Imputation, category encoding and standardisation are fitted inside each training fold, following the scikit-learn guidance on avoiding information leakage. Both models use the same folds and fixed settings. These are exploratory cross-validation results, with no hyperparameter search or independent final test set.</w:t>
+        <w:t>We fitted logistic regression and random forest using LGA, dwelling–bedroom configuration, capacity, bathrooms and amenities. Five-fold cross-validation separates analysis hosts. Imputation, encoding and scaling are fitted within training folds. Review-derived fields, ratings and host badges are excluded. Current price and minimum stay enter only an operating-controls sensitivity. Both models use fixed settings; no hyperparameter search has been conducted.</w:t>
       </w:r>
     </w:p>
     <w:p>
       <w:r>
-        <w:t>Evaluation includes ROC-AUC, average precision, Brier score, calibration summaries and precision among the highest-scored quarter. The main logistic model achieves AUC 0.649, average precision 0.361 and Brier score 0.182. Its top-quarter precision is 37.8%, compared with the sample prevalence of 25.8%. The forest achieves AUC 0.631 and average precision 0.348. Adding operating controls raises logistic AUC to 0.720; this does not establish equivalent performance using information verified before opening.</w:t>
+        <w:t>Evaluation covers ROC-AUC, average precision, Brier score, calibration bins and precision among the highest-scored quarter. Main logistic AUC is 0.568, average precision 0.278 and top-quarter precision 28.8%, against prevalence 25.1%. Its Brier score is 0.188, only slightly below the training-prevalence baseline of 0.190; forest AUC is 0.553. Calibration error across ten fixed-width bins is 3.66 percentage points for logistic regression. Only 22 listings receive scores of at least 0.5; these average 57.4%, but observed attainment is 31.8%, illustrating sparse and unreliable high-score estimates. Calibration has been assessed, not corrected.</w:t>
       </w:r>
     </w:p>
     <w:p>
       <w:r>
-        <w:t>Segment rankings average out-of-fold probabilities. Melbourne three-bedroom apartments have the highest mean logistic score, 39.5%, compared with an observed attainment rate of 39.8% across 543 listings. The accompanying intervals resample hosts while holding fitted scores fixed; they omit model-fitting uncertainty and do not establish a definitive best location. R supports cleaning and descriptive analysis; Python, pandas and scikit-learn support predictive validation.</w:t>
+        <w:t>Mean out-of-fold scores rank Melbourne three-bedroom apartments first at 34.6%, versus 36.5% observed across 304 listings. Conditional 95% host-bootstrap intervals hold fitted scores and the benchmark fixed, omitting model-fitting and benchmark-estimation uncertainty. The weak discrimination and calibration results do not establish a reliable best location. R supports cleaning and descriptive analysis; Python and scikit-learn support modelling.</w:t>
       </w:r>
     </w:p>
     <w:p>
@@ -198,17 +198,17 @@
     </w:p>
     <w:p>
       <w:r>
-        <w:t>The audit of the available cleaned data, descriptive segment comparisons, two predictive baselines and three sensitivity scenarios are complete. R and Python implementations agree on the main sample and labels. Separate calculations reproduce the model metrics and grouped predictions. Earlier cleaning issues identified during review include a 91-date availability window and an incomplete final month in the seasonality calculation; the code now uses 90 dates and excludes the final observed month respectively.</w:t>
+        <w:t>The revised scope, reference partition, descriptive comparisons, two predictive baselines and three sensitivities have been implemented. Separate R and Python calculations agree on sample membership and the benchmark. Tests check host separation, minimum support and the cutoff's independence from analysis outcomes. Earlier corrections include the 90-date calendar window and exclusion of the incomplete final month from seasonality.</w:t>
       </w:r>
     </w:p>
     <w:p>
       <w:r>
-        <w:t>Restricting first reviews to on or before 1 June 2025 and reapplying the 50-listing rule leaves 4,812 listings in 16 segments. Their P75 is 29, demonstrating that review-history restrictions change the benchmark. The sensitivity retains the fixed 22-review event and zero-review outcomes. Removing the price filter gives a further check on sample selection.</w:t>
+        <w:t>Removing the history restriction gives 6,675 analysis listings in 22 segments; removing the price filter gives 5,647 in 19. Their P75 values are both 23, while the reference cutoff remains 30. Adding operating controls raises logistic AUC to 0.713, which does not establish comparable performance using pre-opening information.</w:t>
       </w:r>
     </w:p>
     <w:p>
       <w:r>
-        <w:t>Week 9 will focus on restoring raw files, verifying identifiers and review windows, and assessing sparse positive outcomes. Week 10 will test repeated host splits, broader dwelling mappings and model tuning within nested validation. Weeks 11–12 will cover ranking uncertainty and final reporting. The README reproduces this report and links to the scripts, tables and figures. The findings support screening existing comparable listings; they do not forecast a new operator's future income.</w:t>
+        <w:t>This design follows earlier exploration of the snapshot and provides no untouched final test. Week 9 will address raw-source verification and sparse outcomes. Week 10 will examine repeated host splits, broader dwelling definitions and calibration fitted within training data. Weeks 11–12 will cover nested tuning, refitted ranking uncertainty and final reporting. The README reproduces this report and links the code and outputs. Findings concern existing listings' preceding-year activity, not a new operator's future income.</w:t>
       </w:r>
     </w:p>
     <w:p>
@@ -290,7 +290,7 @@
         <w:rPr>
           <w:sz w:val="21"/>
         </w:rPr>
-        <w:t xml:space="preserve">Scikit-learn developers. (2025). </w:t>
+        <w:t xml:space="preserve">Scikit-learn developers. (n.d.). </w:t>
       </w:r>
       <w:r>
         <w:rPr>
@@ -310,21 +310,21 @@
           <w:i/>
           <w:sz w:val="21"/>
         </w:rPr>
-        <w:t>Common pitfalls and recommended practices</w:t>
+        <w:t>Probability calibration</w:t>
       </w:r>
       <w:r>
         <w:rPr>
           <w:sz w:val="21"/>
         </w:rPr>
-        <w:t xml:space="preserve">. </w:t>
+        <w:t xml:space="preserve">. Retrieved 13 September 2026. </w:t>
       </w:r>
-      <w:hyperlink r:id="rId11">
+      <w:hyperlink r:id="rId14">
         <w:r>
           <w:rPr>
             <w:color w:val="174A78"/>
             <w:u w:val="single"/>
           </w:rPr>
-          <w:t>Validation guidance</w:t>
+          <w:t>Grouped validation</w:t>
         </w:r>
       </w:hyperlink>
       <w:r>
@@ -333,13 +333,13 @@
         </w:rPr>
         <w:t xml:space="preserve">; </w:t>
       </w:r>
-      <w:hyperlink r:id="rId12">
+      <w:hyperlink r:id="rId15">
         <w:r>
           <w:rPr>
             <w:color w:val="174A78"/>
             <w:u w:val="single"/>
           </w:rPr>
-          <w:t>Preprocessing guidance</w:t>
+          <w:t>Calibration guidance</w:t>
         </w:r>
       </w:hyperlink>
       <w:r>

</xml_diff>

<commit_message>
Rebuild review outcomes from raw data and compare enhanced models
</commit_message>
<xml_diff>
--- a/reports/Interim_Project_Report.docx
+++ b/reports/Interim_Project_Report.docx
@@ -69,10 +69,7 @@
         <w:spacing w:after="140"/>
       </w:pPr>
       <w:r>
-        <w:rPr>
-          <w:sz w:val="18"/>
-        </w:rPr>
-        <w:t>Report body: 1,057 words | Updated 14 September 2026</w:t>
+        <w:t xml:space="preserve">Report body including table: 1,206 words | Updated 15 September 2026</w:t>
       </w:r>
     </w:p>
     <w:p>
@@ -85,12 +82,12 @@
     </w:p>
     <w:p>
       <w:r>
-        <w:t>A prospective operator considering several Melbourne Airbnb properties needs to compare locations and dwelling configurations before committing to leases and furnishings. The school-supplied Inside Airbnb snapshot shows substantial variation in quoted prices and guest reviews. Comparisons across conventional apartments and specialised holiday accommodation may reflect different property mixes.</w:t>
+        <w:t>A prospective operator considering several Melbourne Airbnb properties must compare locations and dwelling configurations before committing to leases, furnishings and launch costs. These choices are difficult to reverse and an unsuitable property can tie up limited capital. In this report, location is measured by Local Government Area (LGA), meaning a municipal area within Greater Melbourne. The business therefore needs a consistent way to compare similar properties rather than relying on nightly price alone.</w:t>
       </w:r>
     </w:p>
     <w:p>
       <w:r>
-        <w:t>Our project combines descriptive comparisons with predictive modelling of review activity to develop a preliminary segment shortlist. Reviews are observable, but they do not measure profit. The supplied data lack actual rental and operating costs, so financial viability and externally sourced rent scenarios are outside this analysis.</w:t>
+        <w:t>The school-supplied Inside Airbnb snapshot shows substantial variation in quoted prices and guest reviews. We combine descriptive comparisons with predictive modelling to assess which market segments are associated with stronger review activity. Reviews are observable and provide a limited indicator of guest activity, but they are not bookings or profit. Because the supplied data contain neither actual rent nor operating costs, this interim analysis supports preliminary market screening rather than a financial investment recommendation.</w:t>
       </w:r>
     </w:p>
     <w:p>
@@ -103,33 +100,29 @@
     </w:p>
     <w:p>
       <w:r>
-        <w:t xml:space="preserve">Our research question is: </w:t>
-      </w:r>
-      <w:r>
-        <w:rPr>
-          <w:b/>
-        </w:rPr>
-        <w:t>Among established standard entire-home listings with one to three bedrooms in Greater Melbourne, which LGA × dwelling-type × bedroom-count segments with at least 50 eligible listings have the highest mean out-of-sample predicted probability of meeting a common upper-quartile review-count benchmark in the 12 months preceding the snapshot?</w:t>
+        <w:t xml:space="preserve">Our research question is: Among established standard entire-home listings with one to three bedrooms in Greater Melbourne, which LGA, dwelling-class and bedroom-count segments with at least 50 eligible analysis listings have the highest mean out-of-sample predicted probability of meeting a common upper-quartile review-count benchmark over the 365 days ending on each listing’s scrape date?</w:t>
       </w:r>
     </w:p>
     <w:p>
       <w:r>
-        <w:t>The descriptive objective is to compare review distributions, observed benchmark attainment and property attributes. The predictive objective is to test how well property information distinguishes higher-activity listings whose hosts are excluded from training.</w:t>
+        <w:t>The descriptive objective is to compare review distributions, observed benchmark attainment and property attributes across eligible segments. The predictive objective is to test whether information available about a property's location, dwelling configuration, capacity, bathrooms and amenities can distinguish higher-activity listings when evaluated on hosts excluded from model training.</w:t>
       </w:r>
     </w:p>
     <w:p>
       <w:r>
-        <w:t>Established means first review on or before 1 June 2025, relative to the start of the June 2026 snapshot month. This indicates review history, not an opening date or continuous operation. We retain entire rental units, condos, homes and townhouses with quoted prices of AUD30–1,500. Units and condos form one dwelling class; homes and townhouses form the other. These rules define comparable residential stock without establishing lease or subletting availability. Every reported segment needs at least 50 analysis listings after all eligibility and host-partition restrictions.</w:t>
+        <w:t xml:space="preserve">Established means the first observed review occurred at least 365 days before that listing’s scrape date. This indicates review history, not an opening date or continuous operation. We retain entire rental units, condos, homes and townhouses with one to three bedrooms and quoted prices of AUD30–1,500. Units and condos form the apartment class; homes and townhouses form the house class. These categories identify comparable residential stock without proving lease or subletting availability. Each reported segment needs at least 50 analysis listings after all restrictions.</w:t>
       </w:r>
     </w:p>
     <w:p>
       <w:r>
-        <w:t>The common benchmark is calculated from a separate group of reference hosts. It is not hard-coded in the research question or taken from a whole-market P75. Industry percentile comparisons provide methodological context (Cushman &amp; Wakefield Georgia, 2019), but the numerical review threshold comes solely from the supplied data and does not indicate profitability.</w:t>
+        <w:t xml:space="preserve">A separate group of reference hosts supplies one common upper-quartile benchmark. Its numerical value is calculated from the supplied data, rather than fixed in the research question. It is neither a whole-market standard nor a profitability threshold.</w:t>
       </w:r>
     </w:p>
     <w:p>
       <w:pPr>
         <w:pStyle w:val="Heading1"/>
+        <w:keepNext w:val="1"/>
+        <w:pageBreakBefore w:val="1"/>
       </w:pPr>
       <w:r>
         <w:t>Data Description</w:t>
@@ -137,24 +130,749 @@
     </w:p>
     <w:p>
       <w:r>
-        <w:t>The saved June 2026 data contain 25,728 listings, approximately 9.39 million calendar records and 1.03 million reviews. Variables include listing and host identifiers, LGA, dwelling type, bedrooms, capacity, bathrooms, amenities, quoted price, first review and recent review counts. Calendar availability does not establish bookings, and the calendar contains no prices.</w:t>
+        <w:t xml:space="preserve">The school’s June 2026 files contain 25,728 listings, 9,390,720 calendar records and 1,026,690 reviews. The 90 listing variables cover identifiers, LGA, property type, capacity, bathrooms, amenities, price, minimum stay and reviews. Scrape dates range from 17 June to 1 July 2026. Calendar availability cannot establish bookings and the calendar contains no prices.</w:t>
+      </w:r>
+      <w:pPr>
+        <w:keepLines w:val="1"/>
+      </w:pPr>
+    </w:p>
+    <w:p>
+      <w:r>
+        <w:t xml:space="preserve">Cleaning converts currency strings, standardises missing values, extracts bathroom counts and parses amenity lists without splitting names containing commas. Quoted price is missing for 6,553 listings and bedrooms for 4,679. Median price is AUD243.67 across 19,175 non-missing records. The price restriction supports comparability; it does not establish that excluded prices are errors. Source identifier text is preserved because scientific notation can already contain irrecoverable rounding.</w:t>
       </w:r>
     </w:p>
     <w:p>
       <w:r>
-        <w:t>Cleaning addresses currency strings, missing values, bathroom descriptions and amenity lists. Revised parsers preserve identifier text, recognise half-baths and avoid counting commas inside amenity names as extra amenities. Quoted price is missing for 6,553 listings and bedrooms for 4,679. The median quoted price is AUD243.67 among 19,175 non-missing values. Price eligibility is a scope assumption, not proof that excluded values are erroneous.</w:t>
+        <w:t xml:space="preserve">The final reference group’s P75 is 29.75, rounded upward to a 30-review event. The separate analysis group contains 3,873 listings from 1,726 hosts across 14 segments, including 334 zero-review listings. Of these, 981 meet the benchmark (25.33%); ties are retained. Median amenity counts are 44 among listings meeting the benchmark and 43 below it, while median guest capacity is four in both groups. These pooled differences offer limited separation.</w:t>
       </w:r>
     </w:p>
     <w:p>
       <w:r>
-        <w:t>After dwelling, price and history restrictions, 6,786 listings remain before partition and minimum-support rules. The final reference group has 899 listings from 424 hosts; its pooled P75 is 30 reviews. The separate analysis group contains 3,810 listings, 1,699 hosts and 14 segments, including 333 zero-review listings. Of these, 957 meet the benchmark (25.12%); integer ties are retained. Their median amenity count is 44 versus 43 below the benchmark. Both groups have median guest capacity four, so these pooled contrasts offer limited separation.</w:t>
+        <w:t xml:space="preserve">Full-source checks revealed a one-day boundary difference: the supplied recent-review field matches the inclusive interval from scrape date minus 365 days through scrape date, covering 366 dates. We retain that field and derive reviews_365d over the strict 365-day interval, excluding its start boundary. This removes 352 reviews across 350 listings and changes one analysis listing’s target label. Independent reconstruction agrees with every derived count; original total-review counts and first/last review dates also match.</w:t>
       </w:r>
     </w:p>
     <w:p>
+      <w:pPr>
+        <w:spacing w:before="100" w:after="60"/>
+      </w:pPr>
       <w:r>
-        <w:t>The original CSV links remain broken. This update uses saved cleaned data and aggregates; raw identifier precision, parsing and per-listing trailing-year review windows still require source verification. The history reference date does not substitute for an actual scrape date.</w:t>
+        <w:rPr>
+          <w:b/>
+        </w:rPr>
+        <w:t xml:space="preserve">Table 1. Sample filters and separate host branches</w:t>
       </w:r>
     </w:p>
+    <w:tbl>
+      <w:tblPr>
+        <w:tblStyle w:val="TableGrid"/>
+        <w:tblW w:type="auto" w:w="0"/>
+        <w:tblLook w:firstColumn="1" w:firstRow="1" w:lastColumn="0" w:lastRow="0" w:noHBand="0" w:noVBand="1" w:val="04A0"/>
+      </w:tblPr>
+      <w:tblGrid>
+        <w:gridCol w:w="2232"/>
+        <w:gridCol w:w="1224"/>
+        <w:gridCol w:w="1152"/>
+        <w:gridCol w:w="4464"/>
+      </w:tblGrid>
+      <w:tr>
+        <w:tc>
+          <w:tcPr>
+            <w:tcW w:type="dxa" w:w="2353"/>
+            <w:shd w:fill="D9EAF7"/>
+            <w:vAlign w:val="center"/>
+            <w:tcMar>
+              <w:top w:w="100" w:type="dxa"/>
+              <w:start w:w="120" w:type="dxa"/>
+              <w:bottom w:w="100" w:type="dxa"/>
+              <w:end w:w="120" w:type="dxa"/>
+            </w:tcMar>
+          </w:tcPr>
+          <w:p>
+            <w:pPr>
+              <w:spacing w:after="0"/>
+              <w:jc w:val="left"/>
+            </w:pPr>
+            <w:r>
+              <w:rPr>
+                <w:b/>
+                <w:color w:val="000000"/>
+                <w:sz w:val="18"/>
+              </w:rPr>
+              <w:t xml:space="preserve">Stage</w:t>
+            </w:r>
+          </w:p>
+        </w:tc>
+        <w:tc>
+          <w:tcPr>
+            <w:tcW w:type="dxa" w:w="2353"/>
+            <w:shd w:fill="D9EAF7"/>
+            <w:vAlign w:val="center"/>
+            <w:tcMar>
+              <w:top w:w="100" w:type="dxa"/>
+              <w:start w:w="120" w:type="dxa"/>
+              <w:bottom w:w="100" w:type="dxa"/>
+              <w:end w:w="120" w:type="dxa"/>
+            </w:tcMar>
+          </w:tcPr>
+          <w:p>
+            <w:pPr>
+              <w:spacing w:after="0"/>
+              <w:jc w:val="center"/>
+            </w:pPr>
+            <w:r>
+              <w:rPr>
+                <w:b/>
+                <w:color w:val="000000"/>
+                <w:sz w:val="18"/>
+              </w:rPr>
+              <w:t xml:space="preserve">Listings</w:t>
+            </w:r>
+          </w:p>
+        </w:tc>
+        <w:tc>
+          <w:tcPr>
+            <w:tcW w:type="dxa" w:w="2353"/>
+            <w:shd w:fill="D9EAF7"/>
+            <w:vAlign w:val="center"/>
+            <w:tcMar>
+              <w:top w:w="100" w:type="dxa"/>
+              <w:start w:w="120" w:type="dxa"/>
+              <w:bottom w:w="100" w:type="dxa"/>
+              <w:end w:w="120" w:type="dxa"/>
+            </w:tcMar>
+          </w:tcPr>
+          <w:p>
+            <w:pPr>
+              <w:spacing w:after="0"/>
+              <w:jc w:val="center"/>
+            </w:pPr>
+            <w:r>
+              <w:rPr>
+                <w:b/>
+                <w:color w:val="000000"/>
+                <w:sz w:val="18"/>
+              </w:rPr>
+              <w:t xml:space="preserve">Hosts</w:t>
+            </w:r>
+          </w:p>
+        </w:tc>
+        <w:tc>
+          <w:tcPr>
+            <w:tcW w:type="dxa" w:w="2353"/>
+            <w:shd w:fill="D9EAF7"/>
+            <w:vAlign w:val="center"/>
+            <w:tcMar>
+              <w:top w:w="100" w:type="dxa"/>
+              <w:start w:w="120" w:type="dxa"/>
+              <w:bottom w:w="100" w:type="dxa"/>
+              <w:end w:w="120" w:type="dxa"/>
+            </w:tcMar>
+          </w:tcPr>
+          <w:p>
+            <w:pPr>
+              <w:spacing w:after="0"/>
+              <w:jc w:val="left"/>
+            </w:pPr>
+            <w:r>
+              <w:rPr>
+                <w:b/>
+                <w:color w:val="000000"/>
+                <w:sz w:val="18"/>
+              </w:rPr>
+              <w:t xml:space="preserve">Role</w:t>
+            </w:r>
+          </w:p>
+        </w:tc>
+      </w:tr>
+      <w:tr>
+        <w:tc>
+          <w:tcPr>
+            <w:tcW w:type="dxa" w:w="2353"/>
+            <w:vAlign w:val="center"/>
+            <w:tcMar>
+              <w:top w:w="100" w:type="dxa"/>
+              <w:start w:w="120" w:type="dxa"/>
+              <w:bottom w:w="100" w:type="dxa"/>
+              <w:end w:w="120" w:type="dxa"/>
+            </w:tcMar>
+          </w:tcPr>
+          <w:p>
+            <w:pPr>
+              <w:spacing w:after="0"/>
+              <w:jc w:val="left"/>
+            </w:pPr>
+            <w:r>
+              <w:rPr>
+                <w:sz w:val="18"/>
+              </w:rPr>
+              <w:t xml:space="preserve">Raw listings</w:t>
+            </w:r>
+          </w:p>
+        </w:tc>
+        <w:tc>
+          <w:tcPr>
+            <w:tcW w:type="dxa" w:w="2353"/>
+            <w:vAlign w:val="center"/>
+            <w:tcMar>
+              <w:top w:w="100" w:type="dxa"/>
+              <w:start w:w="120" w:type="dxa"/>
+              <w:bottom w:w="100" w:type="dxa"/>
+              <w:end w:w="120" w:type="dxa"/>
+            </w:tcMar>
+          </w:tcPr>
+          <w:p>
+            <w:pPr>
+              <w:spacing w:after="0"/>
+              <w:jc w:val="center"/>
+            </w:pPr>
+            <w:r>
+              <w:rPr>
+                <w:sz w:val="18"/>
+              </w:rPr>
+              <w:t xml:space="preserve">25,728</w:t>
+            </w:r>
+          </w:p>
+        </w:tc>
+        <w:tc>
+          <w:tcPr>
+            <w:tcW w:type="dxa" w:w="2353"/>
+            <w:vAlign w:val="center"/>
+            <w:tcMar>
+              <w:top w:w="100" w:type="dxa"/>
+              <w:start w:w="120" w:type="dxa"/>
+              <w:bottom w:w="100" w:type="dxa"/>
+              <w:end w:w="120" w:type="dxa"/>
+            </w:tcMar>
+          </w:tcPr>
+          <w:p>
+            <w:pPr>
+              <w:spacing w:after="0"/>
+              <w:jc w:val="center"/>
+            </w:pPr>
+            <w:r>
+              <w:rPr>
+                <w:sz w:val="18"/>
+              </w:rPr>
+              <w:t xml:space="preserve">14,113</w:t>
+            </w:r>
+          </w:p>
+        </w:tc>
+        <w:tc>
+          <w:tcPr>
+            <w:tcW w:type="dxa" w:w="2353"/>
+            <w:vAlign w:val="center"/>
+            <w:tcMar>
+              <w:top w:w="100" w:type="dxa"/>
+              <w:start w:w="120" w:type="dxa"/>
+              <w:bottom w:w="100" w:type="dxa"/>
+              <w:end w:w="120" w:type="dxa"/>
+            </w:tcMar>
+          </w:tcPr>
+          <w:p>
+            <w:pPr>
+              <w:spacing w:after="0"/>
+              <w:jc w:val="left"/>
+            </w:pPr>
+            <w:r>
+              <w:rPr>
+                <w:sz w:val="18"/>
+              </w:rPr>
+              <w:t xml:space="preserve">Source snapshot</w:t>
+            </w:r>
+          </w:p>
+        </w:tc>
+      </w:tr>
+      <w:tr>
+        <w:tc>
+          <w:tcPr>
+            <w:tcW w:type="dxa" w:w="2353"/>
+            <w:vAlign w:val="center"/>
+            <w:tcMar>
+              <w:top w:w="100" w:type="dxa"/>
+              <w:start w:w="120" w:type="dxa"/>
+              <w:bottom w:w="100" w:type="dxa"/>
+              <w:end w:w="120" w:type="dxa"/>
+            </w:tcMar>
+          </w:tcPr>
+          <w:p>
+            <w:pPr>
+              <w:spacing w:after="0"/>
+              <w:jc w:val="left"/>
+            </w:pPr>
+            <w:r>
+              <w:rPr>
+                <w:sz w:val="18"/>
+              </w:rPr>
+              <w:t xml:space="preserve">After scope filters</w:t>
+            </w:r>
+          </w:p>
+        </w:tc>
+        <w:tc>
+          <w:tcPr>
+            <w:tcW w:type="dxa" w:w="2353"/>
+            <w:vAlign w:val="center"/>
+            <w:tcMar>
+              <w:top w:w="100" w:type="dxa"/>
+              <w:start w:w="120" w:type="dxa"/>
+              <w:bottom w:w="100" w:type="dxa"/>
+              <w:end w:w="120" w:type="dxa"/>
+            </w:tcMar>
+          </w:tcPr>
+          <w:p>
+            <w:pPr>
+              <w:spacing w:after="0"/>
+              <w:jc w:val="center"/>
+            </w:pPr>
+            <w:r>
+              <w:rPr>
+                <w:sz w:val="18"/>
+              </w:rPr>
+              <w:t xml:space="preserve">6,891</w:t>
+            </w:r>
+          </w:p>
+        </w:tc>
+        <w:tc>
+          <w:tcPr>
+            <w:tcW w:type="dxa" w:w="2353"/>
+            <w:vAlign w:val="center"/>
+            <w:tcMar>
+              <w:top w:w="100" w:type="dxa"/>
+              <w:start w:w="120" w:type="dxa"/>
+              <w:bottom w:w="100" w:type="dxa"/>
+              <w:end w:w="120" w:type="dxa"/>
+            </w:tcMar>
+          </w:tcPr>
+          <w:p>
+            <w:pPr>
+              <w:spacing w:after="0"/>
+              <w:jc w:val="center"/>
+            </w:pPr>
+            <w:r>
+              <w:rPr>
+                <w:sz w:val="18"/>
+              </w:rPr>
+              <w:t xml:space="preserve">3,488</w:t>
+            </w:r>
+          </w:p>
+        </w:tc>
+        <w:tc>
+          <w:tcPr>
+            <w:tcW w:type="dxa" w:w="2353"/>
+            <w:vAlign w:val="center"/>
+            <w:tcMar>
+              <w:top w:w="100" w:type="dxa"/>
+              <w:start w:w="120" w:type="dxa"/>
+              <w:bottom w:w="100" w:type="dxa"/>
+              <w:end w:w="120" w:type="dxa"/>
+            </w:tcMar>
+          </w:tcPr>
+          <w:p>
+            <w:pPr>
+              <w:spacing w:after="0"/>
+              <w:jc w:val="left"/>
+            </w:pPr>
+            <w:r>
+              <w:rPr>
+                <w:sz w:val="18"/>
+              </w:rPr>
+              <w:t xml:space="preserve">Before host partition</w:t>
+            </w:r>
+          </w:p>
+        </w:tc>
+      </w:tr>
+      <w:tr>
+        <w:tc>
+          <w:tcPr>
+            <w:tcW w:type="dxa" w:w="2353"/>
+            <w:vAlign w:val="center"/>
+            <w:tcMar>
+              <w:top w:w="100" w:type="dxa"/>
+              <w:start w:w="120" w:type="dxa"/>
+              <w:bottom w:w="100" w:type="dxa"/>
+              <w:end w:w="120" w:type="dxa"/>
+            </w:tcMar>
+          </w:tcPr>
+          <w:p>
+            <w:pPr>
+              <w:spacing w:after="0"/>
+              <w:jc w:val="left"/>
+            </w:pPr>
+            <w:r>
+              <w:rPr>
+                <w:sz w:val="18"/>
+              </w:rPr>
+              <w:t xml:space="preserve">Analysis before support</w:t>
+            </w:r>
+          </w:p>
+        </w:tc>
+        <w:tc>
+          <w:tcPr>
+            <w:tcW w:type="dxa" w:w="2353"/>
+            <w:vAlign w:val="center"/>
+            <w:tcMar>
+              <w:top w:w="100" w:type="dxa"/>
+              <w:start w:w="120" w:type="dxa"/>
+              <w:bottom w:w="100" w:type="dxa"/>
+              <w:end w:w="120" w:type="dxa"/>
+            </w:tcMar>
+          </w:tcPr>
+          <w:p>
+            <w:pPr>
+              <w:spacing w:after="0"/>
+              <w:jc w:val="center"/>
+            </w:pPr>
+            <w:r>
+              <w:rPr>
+                <w:sz w:val="18"/>
+              </w:rPr>
+              <w:t xml:space="preserve">5,549</w:t>
+            </w:r>
+          </w:p>
+        </w:tc>
+        <w:tc>
+          <w:tcPr>
+            <w:tcW w:type="dxa" w:w="2353"/>
+            <w:vAlign w:val="center"/>
+            <w:tcMar>
+              <w:top w:w="100" w:type="dxa"/>
+              <w:start w:w="120" w:type="dxa"/>
+              <w:bottom w:w="100" w:type="dxa"/>
+              <w:end w:w="120" w:type="dxa"/>
+            </w:tcMar>
+          </w:tcPr>
+          <w:p>
+            <w:pPr>
+              <w:spacing w:after="0"/>
+              <w:jc w:val="center"/>
+            </w:pPr>
+            <w:r>
+              <w:rPr>
+                <w:sz w:val="18"/>
+              </w:rPr>
+              <w:t xml:space="preserve">2,809</w:t>
+            </w:r>
+          </w:p>
+        </w:tc>
+        <w:tc>
+          <w:tcPr>
+            <w:tcW w:type="dxa" w:w="2353"/>
+            <w:vAlign w:val="center"/>
+            <w:tcMar>
+              <w:top w:w="100" w:type="dxa"/>
+              <w:start w:w="120" w:type="dxa"/>
+              <w:bottom w:w="100" w:type="dxa"/>
+              <w:end w:w="120" w:type="dxa"/>
+            </w:tcMar>
+          </w:tcPr>
+          <w:p>
+            <w:pPr>
+              <w:spacing w:after="0"/>
+              <w:jc w:val="left"/>
+            </w:pPr>
+            <w:r>
+              <w:rPr>
+                <w:sz w:val="18"/>
+              </w:rPr>
+              <w:t xml:space="preserve">Before 50-listing rule</w:t>
+            </w:r>
+          </w:p>
+        </w:tc>
+      </w:tr>
+      <w:tr>
+        <w:tc>
+          <w:tcPr>
+            <w:tcW w:type="dxa" w:w="2353"/>
+            <w:vAlign w:val="center"/>
+            <w:tcMar>
+              <w:top w:w="100" w:type="dxa"/>
+              <w:start w:w="120" w:type="dxa"/>
+              <w:bottom w:w="100" w:type="dxa"/>
+              <w:end w:w="120" w:type="dxa"/>
+            </w:tcMar>
+          </w:tcPr>
+          <w:p>
+            <w:pPr>
+              <w:spacing w:after="0"/>
+              <w:jc w:val="left"/>
+            </w:pPr>
+            <w:r>
+              <w:rPr>
+                <w:sz w:val="18"/>
+              </w:rPr>
+              <w:t xml:space="preserve">Final analysis</w:t>
+            </w:r>
+          </w:p>
+        </w:tc>
+        <w:tc>
+          <w:tcPr>
+            <w:tcW w:type="dxa" w:w="2353"/>
+            <w:vAlign w:val="center"/>
+            <w:tcMar>
+              <w:top w:w="100" w:type="dxa"/>
+              <w:start w:w="120" w:type="dxa"/>
+              <w:bottom w:w="100" w:type="dxa"/>
+              <w:end w:w="120" w:type="dxa"/>
+            </w:tcMar>
+          </w:tcPr>
+          <w:p>
+            <w:pPr>
+              <w:spacing w:after="0"/>
+              <w:jc w:val="center"/>
+            </w:pPr>
+            <w:r>
+              <w:rPr>
+                <w:sz w:val="18"/>
+              </w:rPr>
+              <w:t xml:space="preserve">3,873</w:t>
+            </w:r>
+          </w:p>
+        </w:tc>
+        <w:tc>
+          <w:tcPr>
+            <w:tcW w:type="dxa" w:w="2353"/>
+            <w:vAlign w:val="center"/>
+            <w:tcMar>
+              <w:top w:w="100" w:type="dxa"/>
+              <w:start w:w="120" w:type="dxa"/>
+              <w:bottom w:w="100" w:type="dxa"/>
+              <w:end w:w="120" w:type="dxa"/>
+            </w:tcMar>
+          </w:tcPr>
+          <w:p>
+            <w:pPr>
+              <w:spacing w:after="0"/>
+              <w:jc w:val="center"/>
+            </w:pPr>
+            <w:r>
+              <w:rPr>
+                <w:sz w:val="18"/>
+              </w:rPr>
+              <w:t xml:space="preserve">1,726</w:t>
+            </w:r>
+          </w:p>
+        </w:tc>
+        <w:tc>
+          <w:tcPr>
+            <w:tcW w:type="dxa" w:w="2353"/>
+            <w:vAlign w:val="center"/>
+            <w:tcMar>
+              <w:top w:w="100" w:type="dxa"/>
+              <w:start w:w="120" w:type="dxa"/>
+              <w:bottom w:w="100" w:type="dxa"/>
+              <w:end w:w="120" w:type="dxa"/>
+            </w:tcMar>
+          </w:tcPr>
+          <w:p>
+            <w:pPr>
+              <w:spacing w:after="0"/>
+              <w:jc w:val="left"/>
+            </w:pPr>
+            <w:r>
+              <w:rPr>
+                <w:sz w:val="18"/>
+              </w:rPr>
+              <w:t xml:space="preserve">14 supported segments</w:t>
+            </w:r>
+          </w:p>
+        </w:tc>
+      </w:tr>
+      <w:tr>
+        <w:tc>
+          <w:tcPr>
+            <w:tcW w:type="dxa" w:w="2353"/>
+            <w:vAlign w:val="center"/>
+            <w:tcMar>
+              <w:top w:w="100" w:type="dxa"/>
+              <w:start w:w="120" w:type="dxa"/>
+              <w:bottom w:w="100" w:type="dxa"/>
+              <w:end w:w="120" w:type="dxa"/>
+            </w:tcMar>
+          </w:tcPr>
+          <w:p>
+            <w:pPr>
+              <w:spacing w:after="0"/>
+              <w:jc w:val="left"/>
+            </w:pPr>
+            <w:r>
+              <w:rPr>
+                <w:sz w:val="18"/>
+              </w:rPr>
+              <w:t xml:space="preserve">Reference before support</w:t>
+            </w:r>
+          </w:p>
+        </w:tc>
+        <w:tc>
+          <w:tcPr>
+            <w:tcW w:type="dxa" w:w="2353"/>
+            <w:vAlign w:val="center"/>
+            <w:tcMar>
+              <w:top w:w="100" w:type="dxa"/>
+              <w:start w:w="120" w:type="dxa"/>
+              <w:bottom w:w="100" w:type="dxa"/>
+              <w:end w:w="120" w:type="dxa"/>
+            </w:tcMar>
+          </w:tcPr>
+          <w:p>
+            <w:pPr>
+              <w:spacing w:after="0"/>
+              <w:jc w:val="center"/>
+            </w:pPr>
+            <w:r>
+              <w:rPr>
+                <w:sz w:val="18"/>
+              </w:rPr>
+              <w:t xml:space="preserve">1,342</w:t>
+            </w:r>
+          </w:p>
+        </w:tc>
+        <w:tc>
+          <w:tcPr>
+            <w:tcW w:type="dxa" w:w="2353"/>
+            <w:vAlign w:val="center"/>
+            <w:tcMar>
+              <w:top w:w="100" w:type="dxa"/>
+              <w:start w:w="120" w:type="dxa"/>
+              <w:bottom w:w="100" w:type="dxa"/>
+              <w:end w:w="120" w:type="dxa"/>
+            </w:tcMar>
+          </w:tcPr>
+          <w:p>
+            <w:pPr>
+              <w:spacing w:after="0"/>
+              <w:jc w:val="center"/>
+            </w:pPr>
+            <w:r>
+              <w:rPr>
+                <w:sz w:val="18"/>
+              </w:rPr>
+              <w:t xml:space="preserve">679</w:t>
+            </w:r>
+          </w:p>
+        </w:tc>
+        <w:tc>
+          <w:tcPr>
+            <w:tcW w:type="dxa" w:w="2353"/>
+            <w:vAlign w:val="center"/>
+            <w:tcMar>
+              <w:top w:w="100" w:type="dxa"/>
+              <w:start w:w="120" w:type="dxa"/>
+              <w:bottom w:w="100" w:type="dxa"/>
+              <w:end w:w="120" w:type="dxa"/>
+            </w:tcMar>
+          </w:tcPr>
+          <w:p>
+            <w:pPr>
+              <w:spacing w:after="0"/>
+              <w:jc w:val="left"/>
+            </w:pPr>
+            <w:r>
+              <w:rPr>
+                <w:sz w:val="18"/>
+              </w:rPr>
+              <w:t xml:space="preserve">Separate benchmark hosts</w:t>
+            </w:r>
+          </w:p>
+        </w:tc>
+      </w:tr>
+      <w:tr>
+        <w:tc>
+          <w:tcPr>
+            <w:tcW w:type="dxa" w:w="2353"/>
+            <w:vAlign w:val="center"/>
+            <w:tcMar>
+              <w:top w:w="100" w:type="dxa"/>
+              <w:start w:w="120" w:type="dxa"/>
+              <w:bottom w:w="100" w:type="dxa"/>
+              <w:end w:w="120" w:type="dxa"/>
+            </w:tcMar>
+          </w:tcPr>
+          <w:p>
+            <w:pPr>
+              <w:spacing w:after="0"/>
+              <w:jc w:val="left"/>
+            </w:pPr>
+            <w:r>
+              <w:rPr>
+                <w:sz w:val="18"/>
+              </w:rPr>
+              <w:t xml:space="preserve">Final reference</w:t>
+            </w:r>
+          </w:p>
+        </w:tc>
+        <w:tc>
+          <w:tcPr>
+            <w:tcW w:type="dxa" w:w="2353"/>
+            <w:vAlign w:val="center"/>
+            <w:tcMar>
+              <w:top w:w="100" w:type="dxa"/>
+              <w:start w:w="120" w:type="dxa"/>
+              <w:bottom w:w="100" w:type="dxa"/>
+              <w:end w:w="120" w:type="dxa"/>
+            </w:tcMar>
+          </w:tcPr>
+          <w:p>
+            <w:pPr>
+              <w:spacing w:after="0"/>
+              <w:jc w:val="center"/>
+            </w:pPr>
+            <w:r>
+              <w:rPr>
+                <w:sz w:val="18"/>
+              </w:rPr>
+              <w:t xml:space="preserve">906</w:t>
+            </w:r>
+          </w:p>
+        </w:tc>
+        <w:tc>
+          <w:tcPr>
+            <w:tcW w:type="dxa" w:w="2353"/>
+            <w:vAlign w:val="center"/>
+            <w:tcMar>
+              <w:top w:w="100" w:type="dxa"/>
+              <w:start w:w="120" w:type="dxa"/>
+              <w:bottom w:w="100" w:type="dxa"/>
+              <w:end w:w="120" w:type="dxa"/>
+            </w:tcMar>
+          </w:tcPr>
+          <w:p>
+            <w:pPr>
+              <w:spacing w:after="0"/>
+              <w:jc w:val="center"/>
+            </w:pPr>
+            <w:r>
+              <w:rPr>
+                <w:sz w:val="18"/>
+              </w:rPr>
+              <w:t xml:space="preserve">426</w:t>
+            </w:r>
+          </w:p>
+        </w:tc>
+        <w:tc>
+          <w:tcPr>
+            <w:tcW w:type="dxa" w:w="2353"/>
+            <w:vAlign w:val="center"/>
+            <w:tcMar>
+              <w:top w:w="100" w:type="dxa"/>
+              <w:start w:w="120" w:type="dxa"/>
+              <w:bottom w:w="100" w:type="dxa"/>
+              <w:end w:w="120" w:type="dxa"/>
+            </w:tcMar>
+          </w:tcPr>
+          <w:p>
+            <w:pPr>
+              <w:spacing w:after="0"/>
+              <w:jc w:val="left"/>
+            </w:pPr>
+            <w:r>
+              <w:rPr>
+                <w:sz w:val="18"/>
+              </w:rPr>
+              <w:t xml:space="preserve">Same 14 segments; defines P75</w:t>
+            </w:r>
+          </w:p>
+        </w:tc>
+      </w:tr>
+    </w:tbl>
     <w:p>
       <w:pPr>
         <w:pStyle w:val="Heading1"/>
@@ -165,27 +883,30 @@
     </w:p>
     <w:p>
       <w:r>
-        <w:t>A fixed hash of host identifiers reserves approximately 20% of hosts for benchmark development. After removing those hosts, we apply the 50-listing rule to analysis cells. Reference listings satisfy the same primary eligibility and belong to those supported cells. Their pooled P75, rounded upward to an integer, supplies one common cutoff. Reference hosts enter no model training, evaluation or sensitivity analysis pool, and analysis outcomes cannot change the cutoff.</w:t>
+        <w:t xml:space="preserve">A fixed hash of host identifiers reserves approximately 20% of hosts for benchmark development. These hosts enter no model training, evaluation or sensitivity analysis. After removing them, analysis segments must contain at least 50 listings. Eligible reference listings in those supported segments supply one pooled P75, using linear interpolation and upward integer rounding. That cutoff remains fixed across segments and sensitivity samples.</w:t>
       </w:r>
     </w:p>
     <w:p>
       <w:r>
-        <w:t>Descriptive tables report listing and distinct-host counts, quantiles, actual attainment and attribute profiles. Host-cluster bootstrap intervals account for shared operators. Wider dwelling and unrestricted-history comparisons assess composition sensitivity without claiming that excluded properties cannot be rented.</w:t>
+        <w:t xml:space="preserve">Descriptive tables report listing and distinct-host counts, review quantiles, observed attainment and attribute profiles. Pointwise 90% intervals resample hosts to account for properties sharing an operator. Wider dwelling definitions and unrestricted review histories assess how the chosen scope affects comparisons.</w:t>
       </w:r>
     </w:p>
     <w:p>
       <w:r>
-        <w:t>We fitted logistic regression and random forest using LGA, dwelling–bedroom configuration, capacity, bathrooms and amenities. Five-fold cross-validation separates analysis hosts. Imputation, encoding and scaling are fitted within training folds. Review-derived fields, ratings and host badges are excluded. Current price and minimum stay enter only an operating-controls sensitivity. Both models use fixed settings; no hyperparameter search has been conducted.</w:t>
+        <w:br w:type="page"/>
       </w:r>
     </w:p>
     <w:p>
       <w:r>
-        <w:t>Evaluation covers ROC-AUC, average precision, Brier score, calibration bins and precision among the highest-scored quarter. Main logistic AUC is 0.568, average precision 0.278 and top-quarter precision 28.8%, against prevalence 25.1%. Its Brier score is 0.188, only slightly below the training-prevalence baseline of 0.190; forest AUC is 0.553. Calibration error across ten fixed-width bins is 3.66 percentage points for logistic regression. Only 22 listings receive scores of at least 0.5; these average 57.4%, but observed attainment is 31.8%, illustrating sparse and unreliable high-score estimates. Calibration has been assessed, not corrected.</w:t>
+        <w:t xml:space="preserve">Baseline logistic regression and random forest use LGA, dwelling–bedroom configuration, capacity, bathrooms and amenity counts. We then compare six fixed extensions adding coordinates, beds and nine specific facilities, including pool, parking and kitchen indicators; these also test histogram gradient boosting. These comparisons retain the same 3,873 listings and five host-disjoint outer folds. Preprocessing is learned within training folds. Ratings, review-derived predictors and host badges are excluded; price and minimum stay enter labelled operating-controls variants.</w:t>
       </w:r>
+      <w:pPr>
+        <w:keepLines w:val="1"/>
+      </w:pPr>
     </w:p>
     <w:p>
       <w:r>
-        <w:t>Mean out-of-fold scores rank Melbourne three-bedroom apartments first at 34.6%, versus 36.5% observed across 304 listings. Conditional 95% host-bootstrap intervals hold fitted scores and the benchmark fixed, omitting model-fitting and benchmark-estimation uncertainty. The weak discrimination and calibration results do not establish a reliable best location. R supports cleaning and descriptive analysis; Python and scikit-learn support modelling.</w:t>
+        <w:t xml:space="preserve">ROC-AUC and average precision assess discrimination; Brier score and calibration assess probability quality against a training-prevalence baseline. Two boosting variants fit sigmoid calibration using three host-disjoint folds inside each outer training set. Thus no outer validation outcome enters calibration. R supports cleaning and descriptive analysis; Python and scikit-learn support modelling.</w:t>
       </w:r>
     </w:p>
     <w:p>
@@ -198,17 +919,17 @@
     </w:p>
     <w:p>
       <w:r>
-        <w:t>The revised scope, reference partition, descriptive comparisons, two predictive baselines and three sensitivities have been implemented. Separate R and Python calculations agree on sample membership and the benchmark. Tests check host separation, minimum support and the cutoff's independence from analysis outcomes. Earlier corrections include the 90-date calendar window and exclusion of the incomplete final month from seasonality.</w:t>
+        <w:t xml:space="preserve">The complete raw-data workflow and independent checks now agree on review counts, samples, benchmark and baseline metrics. Baseline logistic AUC is 0.573 and forest AUC is 0.560. Detailed property features improve forest AUC to 0.640, average precision to 0.350 and Brier score to 0.181, versus baseline logistic Brier 0.189. Its ten-bin calibration error is 1.63 percentage points. Boosting achieves AUC 0.647 but Brier 0.182. We provisionally prefer the enhanced forest for probability ranking because it has the lowest Brier score among the property-only extensions; discrimination remains moderate.</w:t>
       </w:r>
     </w:p>
     <w:p>
       <w:r>
-        <w:t>Removing the history restriction gives 6,675 analysis listings in 22 segments; removing the price filter gives 5,647 in 19. Their P75 values are both 23, while the reference cutoff remains 30. Adding operating controls raises logistic AUC to 0.713, which does not establish comparable performance using pre-opening information.</w:t>
+        <w:t xml:space="preserve">The enhanced forest ranks Melbourne three-bedroom apartments first: mean probability 34.4%, observed attainment 36.6%, and 306 listings. Its conditional 95% host-bootstrap interval is 33.0–35.8%; fixed scores and cutoff omit model-refitting and benchmark-estimation uncertainty. Removing the history restriction gives 6,675 analysis listings; removing the price filter gives 5,720. Adding current price and minimum stay to enhanced boosting raises AUC to 0.749. These contemporaneous settings provide useful context but do not establish a causal effect or a pre-opening forecast. Sigmoid calibration does not improve every metric.</w:t>
       </w:r>
     </w:p>
     <w:p>
       <w:r>
-        <w:t>This design follows earlier exploration of the snapshot and provides no untouched final test. Week 9 will address raw-source verification and sparse outcomes. Week 10 will examine repeated host splits, broader dwelling definitions and calibration fitted within training data. Weeks 11–12 will cover nested tuning, refitted ranking uncertainty and final reporting. The README reproduces this report and links the code and outputs. Findings concern existing listings' preceding-year activity, not a new operator's future income.</w:t>
+        <w:t xml:space="preserve">All six extensions are reported. Their comparison follows baseline inspection, so model preference is exploratory and there is no untouched final test. Next steps are repeated host partitions, model selection within nested grouped validation, and ranking intervals with model refitting. Findings describe existing listings’ preceding-year review activity, not future income or profitability. The README reproduces this report and links the code, validation and outputs.</w:t>
       </w:r>
     </w:p>
     <w:p>
@@ -217,45 +938,6 @@
       </w:pPr>
       <w:r>
         <w:t>References</w:t>
-      </w:r>
-    </w:p>
-    <w:p>
-      <w:pPr>
-        <w:spacing w:after="80"/>
-      </w:pPr>
-      <w:r>
-        <w:rPr>
-          <w:sz w:val="21"/>
-        </w:rPr>
-        <w:t xml:space="preserve">Cushman &amp; Wakefield Georgia. (2019, June). </w:t>
-      </w:r>
-      <w:r>
-        <w:rPr>
-          <w:i/>
-          <w:sz w:val="21"/>
-        </w:rPr>
-        <w:t>Tbilisi hospitality series: Airbnb</w:t>
-      </w:r>
-      <w:r>
-        <w:rPr>
-          <w:sz w:val="21"/>
-        </w:rPr>
-        <w:t xml:space="preserve"> (pp. 13–14). </w:t>
-      </w:r>
-      <w:hyperlink r:id="rId10">
-        <w:r>
-          <w:rPr>
-            <w:color w:val="174A78"/>
-            <w:u w:val="single"/>
-          </w:rPr>
-          <w:t>Report</w:t>
-        </w:r>
-      </w:hyperlink>
-      <w:r>
-        <w:rPr>
-          <w:sz w:val="21"/>
-        </w:rPr>
-        <w:t>.</w:t>
       </w:r>
     </w:p>
     <w:p>
@@ -747,7 +1429,7 @@
     <w:rPr>
       <w:rFonts w:ascii="Arial" w:hAnsi="Arial"/>
       <w:color w:val="000000"/>
-      <w:sz w:val="24"/>
+      <w:sz w:val="22"/>
     </w:rPr>
   </w:style>
   <w:style w:type="paragraph" w:styleId="Header">

</xml_diff>

<commit_message>
Improve cross-platform reproducibility and clarify report metrics
</commit_message>
<xml_diff>
--- a/reports/Interim_Project_Report.docx
+++ b/reports/Interim_Project_Report.docx
@@ -69,7 +69,7 @@
         <w:spacing w:after="140"/>
       </w:pPr>
       <w:r>
-        <w:t xml:space="preserve">Report body including table: 1,206 words | Updated 15 September 2026</w:t>
+        <w:t xml:space="preserve">Report body including table: 1,254 words | Updated 16 September 2026</w:t>
       </w:r>
     </w:p>
     <w:p>
@@ -105,7 +105,7 @@
     </w:p>
     <w:p>
       <w:r>
-        <w:t>The descriptive objective is to compare review distributions, observed benchmark attainment and property attributes across eligible segments. The predictive objective is to test whether information available about a property's location, dwelling configuration, capacity, bathrooms and amenities can distinguish higher-activity listings when evaluated on hosts excluded from model training.</w:t>
+        <w:t xml:space="preserve">In practical terms, we compare similar Melbourne property segments to identify where strong recent review activity is most common. Descriptive analysis compares review distributions, benchmark attainment and property attributes. Predictive analysis tests whether location, dwelling configuration, capacity, bathrooms and amenities distinguish higher-activity listings when the model is evaluated on different hosts from those used for training.</w:t>
       </w:r>
     </w:p>
     <w:p>
@@ -898,7 +898,7 @@
     </w:p>
     <w:p>
       <w:r>
-        <w:t xml:space="preserve">Baseline logistic regression and random forest use LGA, dwelling–bedroom configuration, capacity, bathrooms and amenity counts. We then compare six fixed extensions adding coordinates, beds and nine specific facilities, including pool, parking and kitchen indicators; these also test histogram gradient boosting. These comparisons retain the same 3,873 listings and five host-disjoint outer folds. Preprocessing is learned within training folds. Ratings, review-derived predictors and host badges are excluded; price and minimum stay enter labelled operating-controls variants.</w:t>
+        <w:t xml:space="preserve">Baseline logistic regression and random forest use LGA, dwelling–bedroom configuration, capacity, bathrooms and amenity counts. Six fixed extensions add coordinates, beds and nine facilities and also test histogram gradient boosting. All comparisons use the same 3,873 listings and five test folds that keep each host in one fold. Each fold learns missing-value treatment and encoding only from its training data. Ratings, review-derived predictors and host badges are excluded; price and minimum stay appear only in labelled operating-controls variants.</w:t>
       </w:r>
       <w:pPr>
         <w:keepLines w:val="1"/>
@@ -906,7 +906,7 @@
     </w:p>
     <w:p>
       <w:r>
-        <w:t xml:space="preserve">ROC-AUC and average precision assess discrimination; Brier score and calibration assess probability quality against a training-prevalence baseline. Two boosting variants fit sigmoid calibration using three host-disjoint folds inside each outer training set. Thus no outer validation outcome enters calibration. R supports cleaning and descriptive analysis; Python and scikit-learn support modelling.</w:t>
+        <w:t xml:space="preserve">Model assessment uses four measures. AUC measures ranking ability; average precision measures how accurately the model identifies listings reaching the benchmark; the Brier score measures probability error, where lower is better; and calibration checks whether predicted probabilities agree with observed rates. Brier scores are also compared with a simple training-prevalence forecast. Two boosting variants adjust probabilities using three host-separated groups within each training fold, without using held-out outcomes. R supports cleaning and descriptive analysis; Python and scikit-learn support modelling.</w:t>
       </w:r>
     </w:p>
     <w:p>
@@ -924,12 +924,12 @@
     </w:p>
     <w:p>
       <w:r>
-        <w:t xml:space="preserve">The enhanced forest ranks Melbourne three-bedroom apartments first: mean probability 34.4%, observed attainment 36.6%, and 306 listings. Its conditional 95% host-bootstrap interval is 33.0–35.8%; fixed scores and cutoff omit model-refitting and benchmark-estimation uncertainty. Removing the history restriction gives 6,675 analysis listings; removing the price filter gives 5,720. Adding current price and minimum stay to enhanced boosting raises AUC to 0.749. These contemporaneous settings provide useful context but do not establish a causal effect or a pre-opening forecast. Sigmoid calibration does not improve every metric.</w:t>
+        <w:t xml:space="preserve">The enhanced forest ranks Melbourne three-bedroom apartments first: mean probability 34.4%, observed attainment 36.6%, and 306 listings. Resampling hosts gives a conditional 95% interval of 33.0–35.8%; this interval holds the fitted model and review cutoff fixed. Removing the history restriction gives 6,675 analysis listings; removing the price filter gives 5,720. Adding current price and minimum stay to enhanced boosting raises AUC to 0.749. These contemporaneous settings provide useful context but do not establish a causal effect or a pre-opening forecast. Probability adjustment does not improve every metric.</w:t>
       </w:r>
     </w:p>
     <w:p>
       <w:r>
-        <w:t xml:space="preserve">All six extensions are reported. Their comparison follows baseline inspection, so model preference is exploratory and there is no untouched final test. Next steps are repeated host partitions, model selection within nested grouped validation, and ranking intervals with model refitting. Findings describe existing listings’ preceding-year review activity, not future income or profitability. The README reproduces this report and links the code, validation and outputs.</w:t>
+        <w:t xml:space="preserve">All six extensions are reported. Their comparison follows baseline inspection, so model preference is exploratory and there is no untouched final test. Next steps are to repeat the host partitions, choose models within the training data, and recalculate ranking intervals while refitting the model. Findings describe existing listings’ preceding-year review activity, not future income or profitability. The README reproduces this report and links the code, validation and outputs.</w:t>
       </w:r>
     </w:p>
     <w:p>

</xml_diff>

<commit_message>
Compare models with a segment-rate baseline and repeat the host partitions
Add scripts/11_segment_rate_baseline.py. On the unchanged 3,873-listing
sample, 30-review event and five outer host folds, each validation listing
receives its segment's attainment rate among training hosts, shrunk towards
the training-set rate by a prior weight of ten fixed before the run. The
baseline is scored with the same functions as every model and placed beside
all ten comparators with paired per-fold differences and ranking agreement.

Both original property-only models fall below the baseline; the extended
forest and boosting exceed it in every fold. Every model ranks the same
segment first. Twenty further host partitions keep Melbourne 3BR apartments
first in all twenty. Report, findings, methodology and plan updated; the
repeated-partition item moves from next steps to results.
</commit_message>
<xml_diff>
--- a/reports/Interim_Project_Report.docx
+++ b/reports/Interim_Project_Report.docx
@@ -69,7 +69,7 @@
         <w:spacing w:after="140"/>
       </w:pPr>
       <w:r>
-        <w:t xml:space="preserve">Report body including table: 1,254 words | Updated 16 September 2026</w:t>
+        <w:t>Report body including table: 1,378 words | Updated 16 September 2026</w:t>
       </w:r>
     </w:p>
     <w:p>
@@ -906,7 +906,7 @@
     </w:p>
     <w:p>
       <w:r>
-        <w:t xml:space="preserve">Model assessment uses four measures. AUC measures ranking ability; average precision measures how accurately the model identifies listings reaching the benchmark; the Brier score measures probability error, where lower is better; and calibration checks whether predicted probabilities agree with observed rates. Brier scores are also compared with a simple training-prevalence forecast. Two boosting variants adjust probabilities using three host-separated groups within each training fold, without using held-out outcomes. R supports cleaning and descriptive analysis; Python and scikit-learn support modelling.</w:t>
+        <w:t>Model assessment uses four measures. AUC measures ranking ability; average precision measures how accurately the model identifies listings reaching the benchmark; the Brier score measures probability error, where lower is better; and calibration checks whether predicted probabilities agree with observed rates. Every model is also compared with two references on the same folds: a training-prevalence forecast, and a segment-rate baseline that gives each validation listing its segment’s attainment rate among training hosts, shrunk towards the training rate by a prior weight of ten fixed before the run. Two boosting variants adjust probabilities using three host-separated groups within each training fold, without using held-out outcomes. R supports cleaning and descriptive analysis; Python and scikit-learn support modelling.</w:t>
       </w:r>
     </w:p>
     <w:p>
@@ -929,7 +929,12 @@
     </w:p>
     <w:p>
       <w:r>
-        <w:t xml:space="preserve">All six extensions are reported. Their comparison follows baseline inspection, so model preference is exploratory and there is no untouched final test. Next steps are to repeat the host partitions, choose models within the training data, and recalculate ranking intervals while refitting the model. Findings describe existing listings’ preceding-year review activity, not future income or profitability. The README reproduces this report and links the code, validation and outputs.</w:t>
+        <w:t>The segment-rate baseline reaches AUC 0.581 and Brier score 0.187. Both original property-only models fall below it, exceeding its AUC in one of five folds; the enhanced forest exceeds it in every fold, by 0.059 AUC overall. Every model places the same three segments first, so the models add listing-level discrimination rather than a different segment order. Across 20 repeated host partitions the enhanced forest exceeds the baseline in all 20 (AUC 0.589–0.648); Melbourne three-bedroom apartments rank first in every partition and the same top three recur in 19.</w:t>
+      </w:r>
+    </w:p>
+    <w:p>
+      <w:r>
+        <w:t>All six extensions and the baseline are reported. Their comparison follows baseline inspection, so model preference is exploratory and there is no untouched final test. Next steps are to choose models within the training data and recalculate ranking intervals while refitting the model. Findings describe existing listings’ preceding-year review activity, not future income or profitability. The README reproduces this report and links the code, validation and outputs.</w:t>
       </w:r>
     </w:p>
     <w:p>

</xml_diff>

<commit_message>
Clarify business screening decisions and simplify interim report language
</commit_message>
<xml_diff>
--- a/reports/Interim_Project_Report.docx
+++ b/reports/Interim_Project_Report.docx
@@ -7,70 +7,33 @@
         <w:pStyle w:val="Title"/>
       </w:pPr>
       <w:r>
-        <w:t>Melbourne Airbnb Review Activity</w:t>
+        <w:t>Melbourne Airbnb Market Screening</w:t>
       </w:r>
     </w:p>
     <w:p>
-      <w:pPr>
-        <w:pStyle w:val="Subtitle"/>
-      </w:pPr>
       <w:r>
         <w:t>Interim Project Report</w:t>
       </w:r>
     </w:p>
     <w:p>
-      <w:pPr>
-        <w:keepNext/>
-        <w:spacing w:after="60"/>
-      </w:pPr>
       <w:r>
-        <w:rPr>
-          <w:sz w:val="19"/>
-        </w:rPr>
         <w:t>CMCE30005 Business Analytics Challenge | Semester 2 2026 | TheNextChapter Group 2</w:t>
       </w:r>
     </w:p>
     <w:p>
-      <w:pPr>
-        <w:keepNext/>
-        <w:spacing w:after="60"/>
-      </w:pPr>
       <w:r>
-        <w:rPr>
-          <w:sz w:val="19"/>
-        </w:rPr>
         <w:t>Eric Huang, Loc Le, Qihang Sun and Maksym Xu</w:t>
       </w:r>
     </w:p>
     <w:p>
-      <w:pPr>
-        <w:keepNext/>
-        <w:spacing w:after="60"/>
-      </w:pPr>
       <w:r>
-        <w:rPr>
-          <w:sz w:val="19"/>
-        </w:rPr>
         <w:t xml:space="preserve">Repository: </w:t>
       </w:r>
       <w:hyperlink r:id="rId9">
         <w:r>
-          <w:rPr>
-            <w:color w:val="174A78"/>
-            <w:u w:val="single"/>
-          </w:rPr>
-          <w:t>Qihang-cpu/CMCE30005-TheNextChapter</w:t>
+          <w:t>CMCE30005-TheNextChapter</w:t>
         </w:r>
       </w:hyperlink>
-    </w:p>
-    <w:p>
-      <w:pPr>
-        <w:keepNext/>
-        <w:spacing w:after="140"/>
-      </w:pPr>
-      <w:r>
-        <w:t>Report body including table: 1,378 words | Updated 16 September 2026</w:t>
-      </w:r>
     </w:p>
     <w:p>
       <w:pPr>
@@ -82,12 +45,17 @@
     </w:p>
     <w:p>
       <w:r>
-        <w:t>A prospective operator considering several Melbourne Airbnb properties must compare locations and dwelling configurations before committing to leases, furnishings and launch costs. These choices are difficult to reverse and an unsuitable property can tie up limited capital. In this report, location is measured by Local Government Area (LGA), meaning a municipal area within Greater Melbourne. The business therefore needs a consistent way to compare similar properties rather than relying on nightly price alone.</w:t>
+        <w:t>Our client leases residential properties and runs them as Airbnb accommodation with the required permissions. This business model is called rental arbitrage. The client has limited start-up funds. They need to choose which Melbourne areas and property types to investigate before signing leases and buying furniture. A poor choice can tie up their money and delay the business. Our project helps the client narrow this search.</w:t>
       </w:r>
     </w:p>
     <w:p>
       <w:r>
-        <w:t>The school-supplied Inside Airbnb snapshot shows substantial variation in quoted prices and guest reviews. We combine descriptive comparisons with predictive modelling to assess which market segments are associated with stronger review activity. Reviews are observable and provide a limited indicator of guest activity, but they are not bookings or profit. Because the supplied data contain neither actual rent nor operating costs, this interim analysis supports preliminary market screening rather than a financial investment recommendation.</w:t>
+        <w:t>We use the Inside Airbnb dataset supplied by the school. It includes property details, locations and dated guest reviews. These fields allow us to compare existing listings. We group locations by Local Government Area (LGA), which means a municipal area. Each LGA can contain several suburbs. All numerical analysis uses the supplied dataset.</w:t>
+      </w:r>
+    </w:p>
+    <w:p>
+      <w:r>
+        <w:t>Our final output will be a shortlist of property segments for further investigation. We will compare their past review activity and test whether models improve on simple segment averages. The client can use the shortlist to guide property searches and request lease quotations. Financial assessment will require actual rent, furnishing costs and operating expenses, which this dataset does not contain.</w:t>
       </w:r>
     </w:p>
     <w:p>
@@ -100,29 +68,27 @@
     </w:p>
     <w:p>
       <w:r>
-        <w:t xml:space="preserve">Our research question is: Among established standard entire-home listings with one to three bedrooms in Greater Melbourne, which LGA, dwelling-class and bedroom-count segments with at least 50 eligible analysis listings have the highest mean out-of-sample predicted probability of meeting a common upper-quartile review-count benchmark over the 365 days ending on each listing’s scrape date?</w:t>
+        <w:t>Our research question is: Which LGA, dwelling-type and bedroom-count segments have the highest average predicted probability of reaching a common upper-quartile review benchmark among eligible Melbourne listings? Predictions are tested on hosts excluded from model training. The outcome covers the year before each listing's scrape date.</w:t>
       </w:r>
     </w:p>
     <w:p>
       <w:r>
-        <w:t xml:space="preserve">In practical terms, we compare similar Melbourne property segments to identify where strong recent review activity is most common. Descriptive analysis compares review distributions, benchmark attainment and property attributes. Predictive analysis tests whether location, dwelling configuration, capacity, bathrooms and amenities distinguish higher-activity listings when the model is evaluated on different hosts from those used for training.</w:t>
+        <w:t>We study standard entire homes with one to three bedrooms. Each segment needs at least 50 eligible analysis listings. We define established listings by a first review at least 365 days before the scrape date. This condition provides review history but cannot confirm continuous operation. Rental units and condos form the apartment group. Homes and townhouses form the house group. We retain quoted prices of AUD30–1,500. These rules define our comparison sample; they do not confirm lease availability.</w:t>
       </w:r>
     </w:p>
     <w:p>
       <w:r>
-        <w:t xml:space="preserve">Established means the first observed review occurred at least 365 days before that listing’s scrape date. This indicates review history, not an opening date or continuous operation. We retain entire rental units, condos, homes and townhouses with one to three bedrooms and quoted prices of AUD30–1,500. Units and condos form the apartment class; homes and townhouses form the house class. These categories identify comparable residential stock without proving lease or subletting availability. Each reported segment needs at least 50 analysis listings after all restrictions.</w:t>
+        <w:t>The target records whether a listing reaches a common review-count threshold over the previous 365 days. The upper-quartile rule is our analytical benchmark. Reviews provide a limited signal of guest activity. Review willingness and stay length can affect the count. We therefore cannot use it to measure bookings, occupancy or profit.</w:t>
       </w:r>
     </w:p>
     <w:p>
       <w:r>
-        <w:t xml:space="preserve">A separate group of reference hosts supplies one common upper-quartile benchmark. Its numerical value is calculated from the supplied data, rather than fixed in the research question. It is neither a whole-market standard nor a profitability threshold.</w:t>
+        <w:t>We aim to compare segment performance, test the value of property features, and identify consistent search candidates. The results support further investigation before any lease commitment.</w:t>
       </w:r>
     </w:p>
     <w:p>
       <w:pPr>
         <w:pStyle w:val="Heading1"/>
-        <w:keepNext w:val="1"/>
-        <w:pageBreakBefore w:val="1"/>
       </w:pPr>
       <w:r>
         <w:t>Data Description</w:t>
@@ -130,749 +96,24 @@
     </w:p>
     <w:p>
       <w:r>
-        <w:t xml:space="preserve">The school’s June 2026 files contain 25,728 listings, 9,390,720 calendar records and 1,026,690 reviews. The 90 listing variables cover identifiers, LGA, property type, capacity, bathrooms, amenities, price, minimum stay and reviews. Scrape dates range from 17 June to 1 July 2026. Calendar availability cannot establish bookings and the calendar contains no prices.</w:t>
-      </w:r>
-      <w:pPr>
-        <w:keepLines w:val="1"/>
-      </w:pPr>
-    </w:p>
-    <w:p>
-      <w:r>
-        <w:t xml:space="preserve">Cleaning converts currency strings, standardises missing values, extracts bathroom counts and parses amenity lists without splitting names containing commas. Quoted price is missing for 6,553 listings and bedrooms for 4,679. Median price is AUD243.67 across 19,175 non-missing records. The price restriction supports comparability; it does not establish that excluded prices are errors. Source identifier text is preserved because scientific notation can already contain irrecoverable rounding.</w:t>
+        <w:t>The school dataset contains 25,728 listings with 90 variables, 9,390,720 calendar records and 1,026,690 reviews (Inside Airbnb, 2026). Scrape dates range from 17 June to 1 July 2026. We use LGA, property type, bedrooms, guest capacity, bathrooms, amenities and review dates. Calendar unavailability can include dates blocked by hosts. The calendar also contains no prices, so it cannot establish realised seasonal cash flow.</w:t>
       </w:r>
     </w:p>
     <w:p>
       <w:r>
-        <w:t xml:space="preserve">The final reference group’s P75 is 29.75, rounded upward to a 30-review event. The separate analysis group contains 3,873 listings from 1,726 hosts across 14 segments, including 334 zero-review listings. Of these, 981 meet the benchmark (25.33%); ties are retained. Median amenity counts are 44 among listings meeting the benchmark and 43 below it, while median guest capacity is four in both groups. These pooled differences offer limited separation.</w:t>
+        <w:t>Cleaning converts price text into numbers, standardises missing values and extracts bathroom and amenity information. Price is missing for 6,553 listings and bedrooms for 4,679. We rebuild annual review counts from review dates. The supplied recent-review field covers 366 calendar dates. Using a strict 365-day window changes one analysis target. GitHub contains the detailed checks and sample-filtering table.</w:t>
       </w:r>
     </w:p>
     <w:p>
       <w:r>
-        <w:t xml:space="preserve">Full-source checks revealed a one-day boundary difference: the supplied recent-review field matches the inclusive interval from scrape date minus 365 days through scrape date, covering 366 dates. We retain that field and derive reviews_365d over the strict 365-day interval, excluding its start boundary. This removes 352 reviews across 350 listings and changes one analysis listing’s target label. Independent reconstruction agrees with every derived count; original total-review counts and first/last review dates also match.</w:t>
+        <w:t>The separate reference sample contains 906 listings. Its 75th percentile is 29.75 reviews, giving an integer threshold of 30. The analysis sample contains 3,873 listings from 1,726 hosts in 14 segments. We keep 334 listings with zero annual reviews to include low-activity outcomes. Overall, 981 listings reach the threshold (25.33%).</w:t>
       </w:r>
     </w:p>
     <w:p>
-      <w:pPr>
-        <w:spacing w:before="100" w:after="60"/>
-      </w:pPr>
       <w:r>
-        <w:rPr>
-          <w:b/>
-        </w:rPr>
-        <w:t xml:space="preserve">Table 1. Sample filters and separate host branches</w:t>
+        <w:t>Segment attainment ranges from 8.25% to 36.60%. This variation supports comparing property segments. However, our supported sample covers only six LGAs. About 64% of listings are in Melbourne LGA. Missing prices and the history rule affect which listings enter the sample. Exited listings are absent. These limits reduce the relevance of results to other areas and new operators.</w:t>
       </w:r>
     </w:p>
-    <w:tbl>
-      <w:tblPr>
-        <w:tblStyle w:val="TableGrid"/>
-        <w:tblW w:type="auto" w:w="0"/>
-        <w:tblLook w:firstColumn="1" w:firstRow="1" w:lastColumn="0" w:lastRow="0" w:noHBand="0" w:noVBand="1" w:val="04A0"/>
-      </w:tblPr>
-      <w:tblGrid>
-        <w:gridCol w:w="2232"/>
-        <w:gridCol w:w="1224"/>
-        <w:gridCol w:w="1152"/>
-        <w:gridCol w:w="4464"/>
-      </w:tblGrid>
-      <w:tr>
-        <w:tc>
-          <w:tcPr>
-            <w:tcW w:type="dxa" w:w="2353"/>
-            <w:shd w:fill="D9EAF7"/>
-            <w:vAlign w:val="center"/>
-            <w:tcMar>
-              <w:top w:w="100" w:type="dxa"/>
-              <w:start w:w="120" w:type="dxa"/>
-              <w:bottom w:w="100" w:type="dxa"/>
-              <w:end w:w="120" w:type="dxa"/>
-            </w:tcMar>
-          </w:tcPr>
-          <w:p>
-            <w:pPr>
-              <w:spacing w:after="0"/>
-              <w:jc w:val="left"/>
-            </w:pPr>
-            <w:r>
-              <w:rPr>
-                <w:b/>
-                <w:color w:val="000000"/>
-                <w:sz w:val="18"/>
-              </w:rPr>
-              <w:t xml:space="preserve">Stage</w:t>
-            </w:r>
-          </w:p>
-        </w:tc>
-        <w:tc>
-          <w:tcPr>
-            <w:tcW w:type="dxa" w:w="2353"/>
-            <w:shd w:fill="D9EAF7"/>
-            <w:vAlign w:val="center"/>
-            <w:tcMar>
-              <w:top w:w="100" w:type="dxa"/>
-              <w:start w:w="120" w:type="dxa"/>
-              <w:bottom w:w="100" w:type="dxa"/>
-              <w:end w:w="120" w:type="dxa"/>
-            </w:tcMar>
-          </w:tcPr>
-          <w:p>
-            <w:pPr>
-              <w:spacing w:after="0"/>
-              <w:jc w:val="center"/>
-            </w:pPr>
-            <w:r>
-              <w:rPr>
-                <w:b/>
-                <w:color w:val="000000"/>
-                <w:sz w:val="18"/>
-              </w:rPr>
-              <w:t xml:space="preserve">Listings</w:t>
-            </w:r>
-          </w:p>
-        </w:tc>
-        <w:tc>
-          <w:tcPr>
-            <w:tcW w:type="dxa" w:w="2353"/>
-            <w:shd w:fill="D9EAF7"/>
-            <w:vAlign w:val="center"/>
-            <w:tcMar>
-              <w:top w:w="100" w:type="dxa"/>
-              <w:start w:w="120" w:type="dxa"/>
-              <w:bottom w:w="100" w:type="dxa"/>
-              <w:end w:w="120" w:type="dxa"/>
-            </w:tcMar>
-          </w:tcPr>
-          <w:p>
-            <w:pPr>
-              <w:spacing w:after="0"/>
-              <w:jc w:val="center"/>
-            </w:pPr>
-            <w:r>
-              <w:rPr>
-                <w:b/>
-                <w:color w:val="000000"/>
-                <w:sz w:val="18"/>
-              </w:rPr>
-              <w:t xml:space="preserve">Hosts</w:t>
-            </w:r>
-          </w:p>
-        </w:tc>
-        <w:tc>
-          <w:tcPr>
-            <w:tcW w:type="dxa" w:w="2353"/>
-            <w:shd w:fill="D9EAF7"/>
-            <w:vAlign w:val="center"/>
-            <w:tcMar>
-              <w:top w:w="100" w:type="dxa"/>
-              <w:start w:w="120" w:type="dxa"/>
-              <w:bottom w:w="100" w:type="dxa"/>
-              <w:end w:w="120" w:type="dxa"/>
-            </w:tcMar>
-          </w:tcPr>
-          <w:p>
-            <w:pPr>
-              <w:spacing w:after="0"/>
-              <w:jc w:val="left"/>
-            </w:pPr>
-            <w:r>
-              <w:rPr>
-                <w:b/>
-                <w:color w:val="000000"/>
-                <w:sz w:val="18"/>
-              </w:rPr>
-              <w:t xml:space="preserve">Role</w:t>
-            </w:r>
-          </w:p>
-        </w:tc>
-      </w:tr>
-      <w:tr>
-        <w:tc>
-          <w:tcPr>
-            <w:tcW w:type="dxa" w:w="2353"/>
-            <w:vAlign w:val="center"/>
-            <w:tcMar>
-              <w:top w:w="100" w:type="dxa"/>
-              <w:start w:w="120" w:type="dxa"/>
-              <w:bottom w:w="100" w:type="dxa"/>
-              <w:end w:w="120" w:type="dxa"/>
-            </w:tcMar>
-          </w:tcPr>
-          <w:p>
-            <w:pPr>
-              <w:spacing w:after="0"/>
-              <w:jc w:val="left"/>
-            </w:pPr>
-            <w:r>
-              <w:rPr>
-                <w:sz w:val="18"/>
-              </w:rPr>
-              <w:t xml:space="preserve">Raw listings</w:t>
-            </w:r>
-          </w:p>
-        </w:tc>
-        <w:tc>
-          <w:tcPr>
-            <w:tcW w:type="dxa" w:w="2353"/>
-            <w:vAlign w:val="center"/>
-            <w:tcMar>
-              <w:top w:w="100" w:type="dxa"/>
-              <w:start w:w="120" w:type="dxa"/>
-              <w:bottom w:w="100" w:type="dxa"/>
-              <w:end w:w="120" w:type="dxa"/>
-            </w:tcMar>
-          </w:tcPr>
-          <w:p>
-            <w:pPr>
-              <w:spacing w:after="0"/>
-              <w:jc w:val="center"/>
-            </w:pPr>
-            <w:r>
-              <w:rPr>
-                <w:sz w:val="18"/>
-              </w:rPr>
-              <w:t xml:space="preserve">25,728</w:t>
-            </w:r>
-          </w:p>
-        </w:tc>
-        <w:tc>
-          <w:tcPr>
-            <w:tcW w:type="dxa" w:w="2353"/>
-            <w:vAlign w:val="center"/>
-            <w:tcMar>
-              <w:top w:w="100" w:type="dxa"/>
-              <w:start w:w="120" w:type="dxa"/>
-              <w:bottom w:w="100" w:type="dxa"/>
-              <w:end w:w="120" w:type="dxa"/>
-            </w:tcMar>
-          </w:tcPr>
-          <w:p>
-            <w:pPr>
-              <w:spacing w:after="0"/>
-              <w:jc w:val="center"/>
-            </w:pPr>
-            <w:r>
-              <w:rPr>
-                <w:sz w:val="18"/>
-              </w:rPr>
-              <w:t xml:space="preserve">14,113</w:t>
-            </w:r>
-          </w:p>
-        </w:tc>
-        <w:tc>
-          <w:tcPr>
-            <w:tcW w:type="dxa" w:w="2353"/>
-            <w:vAlign w:val="center"/>
-            <w:tcMar>
-              <w:top w:w="100" w:type="dxa"/>
-              <w:start w:w="120" w:type="dxa"/>
-              <w:bottom w:w="100" w:type="dxa"/>
-              <w:end w:w="120" w:type="dxa"/>
-            </w:tcMar>
-          </w:tcPr>
-          <w:p>
-            <w:pPr>
-              <w:spacing w:after="0"/>
-              <w:jc w:val="left"/>
-            </w:pPr>
-            <w:r>
-              <w:rPr>
-                <w:sz w:val="18"/>
-              </w:rPr>
-              <w:t xml:space="preserve">Source snapshot</w:t>
-            </w:r>
-          </w:p>
-        </w:tc>
-      </w:tr>
-      <w:tr>
-        <w:tc>
-          <w:tcPr>
-            <w:tcW w:type="dxa" w:w="2353"/>
-            <w:vAlign w:val="center"/>
-            <w:tcMar>
-              <w:top w:w="100" w:type="dxa"/>
-              <w:start w:w="120" w:type="dxa"/>
-              <w:bottom w:w="100" w:type="dxa"/>
-              <w:end w:w="120" w:type="dxa"/>
-            </w:tcMar>
-          </w:tcPr>
-          <w:p>
-            <w:pPr>
-              <w:spacing w:after="0"/>
-              <w:jc w:val="left"/>
-            </w:pPr>
-            <w:r>
-              <w:rPr>
-                <w:sz w:val="18"/>
-              </w:rPr>
-              <w:t xml:space="preserve">After scope filters</w:t>
-            </w:r>
-          </w:p>
-        </w:tc>
-        <w:tc>
-          <w:tcPr>
-            <w:tcW w:type="dxa" w:w="2353"/>
-            <w:vAlign w:val="center"/>
-            <w:tcMar>
-              <w:top w:w="100" w:type="dxa"/>
-              <w:start w:w="120" w:type="dxa"/>
-              <w:bottom w:w="100" w:type="dxa"/>
-              <w:end w:w="120" w:type="dxa"/>
-            </w:tcMar>
-          </w:tcPr>
-          <w:p>
-            <w:pPr>
-              <w:spacing w:after="0"/>
-              <w:jc w:val="center"/>
-            </w:pPr>
-            <w:r>
-              <w:rPr>
-                <w:sz w:val="18"/>
-              </w:rPr>
-              <w:t xml:space="preserve">6,891</w:t>
-            </w:r>
-          </w:p>
-        </w:tc>
-        <w:tc>
-          <w:tcPr>
-            <w:tcW w:type="dxa" w:w="2353"/>
-            <w:vAlign w:val="center"/>
-            <w:tcMar>
-              <w:top w:w="100" w:type="dxa"/>
-              <w:start w:w="120" w:type="dxa"/>
-              <w:bottom w:w="100" w:type="dxa"/>
-              <w:end w:w="120" w:type="dxa"/>
-            </w:tcMar>
-          </w:tcPr>
-          <w:p>
-            <w:pPr>
-              <w:spacing w:after="0"/>
-              <w:jc w:val="center"/>
-            </w:pPr>
-            <w:r>
-              <w:rPr>
-                <w:sz w:val="18"/>
-              </w:rPr>
-              <w:t xml:space="preserve">3,488</w:t>
-            </w:r>
-          </w:p>
-        </w:tc>
-        <w:tc>
-          <w:tcPr>
-            <w:tcW w:type="dxa" w:w="2353"/>
-            <w:vAlign w:val="center"/>
-            <w:tcMar>
-              <w:top w:w="100" w:type="dxa"/>
-              <w:start w:w="120" w:type="dxa"/>
-              <w:bottom w:w="100" w:type="dxa"/>
-              <w:end w:w="120" w:type="dxa"/>
-            </w:tcMar>
-          </w:tcPr>
-          <w:p>
-            <w:pPr>
-              <w:spacing w:after="0"/>
-              <w:jc w:val="left"/>
-            </w:pPr>
-            <w:r>
-              <w:rPr>
-                <w:sz w:val="18"/>
-              </w:rPr>
-              <w:t xml:space="preserve">Before host partition</w:t>
-            </w:r>
-          </w:p>
-        </w:tc>
-      </w:tr>
-      <w:tr>
-        <w:tc>
-          <w:tcPr>
-            <w:tcW w:type="dxa" w:w="2353"/>
-            <w:vAlign w:val="center"/>
-            <w:tcMar>
-              <w:top w:w="100" w:type="dxa"/>
-              <w:start w:w="120" w:type="dxa"/>
-              <w:bottom w:w="100" w:type="dxa"/>
-              <w:end w:w="120" w:type="dxa"/>
-            </w:tcMar>
-          </w:tcPr>
-          <w:p>
-            <w:pPr>
-              <w:spacing w:after="0"/>
-              <w:jc w:val="left"/>
-            </w:pPr>
-            <w:r>
-              <w:rPr>
-                <w:sz w:val="18"/>
-              </w:rPr>
-              <w:t xml:space="preserve">Analysis before support</w:t>
-            </w:r>
-          </w:p>
-        </w:tc>
-        <w:tc>
-          <w:tcPr>
-            <w:tcW w:type="dxa" w:w="2353"/>
-            <w:vAlign w:val="center"/>
-            <w:tcMar>
-              <w:top w:w="100" w:type="dxa"/>
-              <w:start w:w="120" w:type="dxa"/>
-              <w:bottom w:w="100" w:type="dxa"/>
-              <w:end w:w="120" w:type="dxa"/>
-            </w:tcMar>
-          </w:tcPr>
-          <w:p>
-            <w:pPr>
-              <w:spacing w:after="0"/>
-              <w:jc w:val="center"/>
-            </w:pPr>
-            <w:r>
-              <w:rPr>
-                <w:sz w:val="18"/>
-              </w:rPr>
-              <w:t xml:space="preserve">5,549</w:t>
-            </w:r>
-          </w:p>
-        </w:tc>
-        <w:tc>
-          <w:tcPr>
-            <w:tcW w:type="dxa" w:w="2353"/>
-            <w:vAlign w:val="center"/>
-            <w:tcMar>
-              <w:top w:w="100" w:type="dxa"/>
-              <w:start w:w="120" w:type="dxa"/>
-              <w:bottom w:w="100" w:type="dxa"/>
-              <w:end w:w="120" w:type="dxa"/>
-            </w:tcMar>
-          </w:tcPr>
-          <w:p>
-            <w:pPr>
-              <w:spacing w:after="0"/>
-              <w:jc w:val="center"/>
-            </w:pPr>
-            <w:r>
-              <w:rPr>
-                <w:sz w:val="18"/>
-              </w:rPr>
-              <w:t xml:space="preserve">2,809</w:t>
-            </w:r>
-          </w:p>
-        </w:tc>
-        <w:tc>
-          <w:tcPr>
-            <w:tcW w:type="dxa" w:w="2353"/>
-            <w:vAlign w:val="center"/>
-            <w:tcMar>
-              <w:top w:w="100" w:type="dxa"/>
-              <w:start w:w="120" w:type="dxa"/>
-              <w:bottom w:w="100" w:type="dxa"/>
-              <w:end w:w="120" w:type="dxa"/>
-            </w:tcMar>
-          </w:tcPr>
-          <w:p>
-            <w:pPr>
-              <w:spacing w:after="0"/>
-              <w:jc w:val="left"/>
-            </w:pPr>
-            <w:r>
-              <w:rPr>
-                <w:sz w:val="18"/>
-              </w:rPr>
-              <w:t xml:space="preserve">Before 50-listing rule</w:t>
-            </w:r>
-          </w:p>
-        </w:tc>
-      </w:tr>
-      <w:tr>
-        <w:tc>
-          <w:tcPr>
-            <w:tcW w:type="dxa" w:w="2353"/>
-            <w:vAlign w:val="center"/>
-            <w:tcMar>
-              <w:top w:w="100" w:type="dxa"/>
-              <w:start w:w="120" w:type="dxa"/>
-              <w:bottom w:w="100" w:type="dxa"/>
-              <w:end w:w="120" w:type="dxa"/>
-            </w:tcMar>
-          </w:tcPr>
-          <w:p>
-            <w:pPr>
-              <w:spacing w:after="0"/>
-              <w:jc w:val="left"/>
-            </w:pPr>
-            <w:r>
-              <w:rPr>
-                <w:sz w:val="18"/>
-              </w:rPr>
-              <w:t xml:space="preserve">Final analysis</w:t>
-            </w:r>
-          </w:p>
-        </w:tc>
-        <w:tc>
-          <w:tcPr>
-            <w:tcW w:type="dxa" w:w="2353"/>
-            <w:vAlign w:val="center"/>
-            <w:tcMar>
-              <w:top w:w="100" w:type="dxa"/>
-              <w:start w:w="120" w:type="dxa"/>
-              <w:bottom w:w="100" w:type="dxa"/>
-              <w:end w:w="120" w:type="dxa"/>
-            </w:tcMar>
-          </w:tcPr>
-          <w:p>
-            <w:pPr>
-              <w:spacing w:after="0"/>
-              <w:jc w:val="center"/>
-            </w:pPr>
-            <w:r>
-              <w:rPr>
-                <w:sz w:val="18"/>
-              </w:rPr>
-              <w:t xml:space="preserve">3,873</w:t>
-            </w:r>
-          </w:p>
-        </w:tc>
-        <w:tc>
-          <w:tcPr>
-            <w:tcW w:type="dxa" w:w="2353"/>
-            <w:vAlign w:val="center"/>
-            <w:tcMar>
-              <w:top w:w="100" w:type="dxa"/>
-              <w:start w:w="120" w:type="dxa"/>
-              <w:bottom w:w="100" w:type="dxa"/>
-              <w:end w:w="120" w:type="dxa"/>
-            </w:tcMar>
-          </w:tcPr>
-          <w:p>
-            <w:pPr>
-              <w:spacing w:after="0"/>
-              <w:jc w:val="center"/>
-            </w:pPr>
-            <w:r>
-              <w:rPr>
-                <w:sz w:val="18"/>
-              </w:rPr>
-              <w:t xml:space="preserve">1,726</w:t>
-            </w:r>
-          </w:p>
-        </w:tc>
-        <w:tc>
-          <w:tcPr>
-            <w:tcW w:type="dxa" w:w="2353"/>
-            <w:vAlign w:val="center"/>
-            <w:tcMar>
-              <w:top w:w="100" w:type="dxa"/>
-              <w:start w:w="120" w:type="dxa"/>
-              <w:bottom w:w="100" w:type="dxa"/>
-              <w:end w:w="120" w:type="dxa"/>
-            </w:tcMar>
-          </w:tcPr>
-          <w:p>
-            <w:pPr>
-              <w:spacing w:after="0"/>
-              <w:jc w:val="left"/>
-            </w:pPr>
-            <w:r>
-              <w:rPr>
-                <w:sz w:val="18"/>
-              </w:rPr>
-              <w:t xml:space="preserve">14 supported segments</w:t>
-            </w:r>
-          </w:p>
-        </w:tc>
-      </w:tr>
-      <w:tr>
-        <w:tc>
-          <w:tcPr>
-            <w:tcW w:type="dxa" w:w="2353"/>
-            <w:vAlign w:val="center"/>
-            <w:tcMar>
-              <w:top w:w="100" w:type="dxa"/>
-              <w:start w:w="120" w:type="dxa"/>
-              <w:bottom w:w="100" w:type="dxa"/>
-              <w:end w:w="120" w:type="dxa"/>
-            </w:tcMar>
-          </w:tcPr>
-          <w:p>
-            <w:pPr>
-              <w:spacing w:after="0"/>
-              <w:jc w:val="left"/>
-            </w:pPr>
-            <w:r>
-              <w:rPr>
-                <w:sz w:val="18"/>
-              </w:rPr>
-              <w:t xml:space="preserve">Reference before support</w:t>
-            </w:r>
-          </w:p>
-        </w:tc>
-        <w:tc>
-          <w:tcPr>
-            <w:tcW w:type="dxa" w:w="2353"/>
-            <w:vAlign w:val="center"/>
-            <w:tcMar>
-              <w:top w:w="100" w:type="dxa"/>
-              <w:start w:w="120" w:type="dxa"/>
-              <w:bottom w:w="100" w:type="dxa"/>
-              <w:end w:w="120" w:type="dxa"/>
-            </w:tcMar>
-          </w:tcPr>
-          <w:p>
-            <w:pPr>
-              <w:spacing w:after="0"/>
-              <w:jc w:val="center"/>
-            </w:pPr>
-            <w:r>
-              <w:rPr>
-                <w:sz w:val="18"/>
-              </w:rPr>
-              <w:t xml:space="preserve">1,342</w:t>
-            </w:r>
-          </w:p>
-        </w:tc>
-        <w:tc>
-          <w:tcPr>
-            <w:tcW w:type="dxa" w:w="2353"/>
-            <w:vAlign w:val="center"/>
-            <w:tcMar>
-              <w:top w:w="100" w:type="dxa"/>
-              <w:start w:w="120" w:type="dxa"/>
-              <w:bottom w:w="100" w:type="dxa"/>
-              <w:end w:w="120" w:type="dxa"/>
-            </w:tcMar>
-          </w:tcPr>
-          <w:p>
-            <w:pPr>
-              <w:spacing w:after="0"/>
-              <w:jc w:val="center"/>
-            </w:pPr>
-            <w:r>
-              <w:rPr>
-                <w:sz w:val="18"/>
-              </w:rPr>
-              <w:t xml:space="preserve">679</w:t>
-            </w:r>
-          </w:p>
-        </w:tc>
-        <w:tc>
-          <w:tcPr>
-            <w:tcW w:type="dxa" w:w="2353"/>
-            <w:vAlign w:val="center"/>
-            <w:tcMar>
-              <w:top w:w="100" w:type="dxa"/>
-              <w:start w:w="120" w:type="dxa"/>
-              <w:bottom w:w="100" w:type="dxa"/>
-              <w:end w:w="120" w:type="dxa"/>
-            </w:tcMar>
-          </w:tcPr>
-          <w:p>
-            <w:pPr>
-              <w:spacing w:after="0"/>
-              <w:jc w:val="left"/>
-            </w:pPr>
-            <w:r>
-              <w:rPr>
-                <w:sz w:val="18"/>
-              </w:rPr>
-              <w:t xml:space="preserve">Separate benchmark hosts</w:t>
-            </w:r>
-          </w:p>
-        </w:tc>
-      </w:tr>
-      <w:tr>
-        <w:tc>
-          <w:tcPr>
-            <w:tcW w:type="dxa" w:w="2353"/>
-            <w:vAlign w:val="center"/>
-            <w:tcMar>
-              <w:top w:w="100" w:type="dxa"/>
-              <w:start w:w="120" w:type="dxa"/>
-              <w:bottom w:w="100" w:type="dxa"/>
-              <w:end w:w="120" w:type="dxa"/>
-            </w:tcMar>
-          </w:tcPr>
-          <w:p>
-            <w:pPr>
-              <w:spacing w:after="0"/>
-              <w:jc w:val="left"/>
-            </w:pPr>
-            <w:r>
-              <w:rPr>
-                <w:sz w:val="18"/>
-              </w:rPr>
-              <w:t xml:space="preserve">Final reference</w:t>
-            </w:r>
-          </w:p>
-        </w:tc>
-        <w:tc>
-          <w:tcPr>
-            <w:tcW w:type="dxa" w:w="2353"/>
-            <w:vAlign w:val="center"/>
-            <w:tcMar>
-              <w:top w:w="100" w:type="dxa"/>
-              <w:start w:w="120" w:type="dxa"/>
-              <w:bottom w:w="100" w:type="dxa"/>
-              <w:end w:w="120" w:type="dxa"/>
-            </w:tcMar>
-          </w:tcPr>
-          <w:p>
-            <w:pPr>
-              <w:spacing w:after="0"/>
-              <w:jc w:val="center"/>
-            </w:pPr>
-            <w:r>
-              <w:rPr>
-                <w:sz w:val="18"/>
-              </w:rPr>
-              <w:t xml:space="preserve">906</w:t>
-            </w:r>
-          </w:p>
-        </w:tc>
-        <w:tc>
-          <w:tcPr>
-            <w:tcW w:type="dxa" w:w="2353"/>
-            <w:vAlign w:val="center"/>
-            <w:tcMar>
-              <w:top w:w="100" w:type="dxa"/>
-              <w:start w:w="120" w:type="dxa"/>
-              <w:bottom w:w="100" w:type="dxa"/>
-              <w:end w:w="120" w:type="dxa"/>
-            </w:tcMar>
-          </w:tcPr>
-          <w:p>
-            <w:pPr>
-              <w:spacing w:after="0"/>
-              <w:jc w:val="center"/>
-            </w:pPr>
-            <w:r>
-              <w:rPr>
-                <w:sz w:val="18"/>
-              </w:rPr>
-              <w:t xml:space="preserve">426</w:t>
-            </w:r>
-          </w:p>
-        </w:tc>
-        <w:tc>
-          <w:tcPr>
-            <w:tcW w:type="dxa" w:w="2353"/>
-            <w:vAlign w:val="center"/>
-            <w:tcMar>
-              <w:top w:w="100" w:type="dxa"/>
-              <w:start w:w="120" w:type="dxa"/>
-              <w:bottom w:w="100" w:type="dxa"/>
-              <w:end w:w="120" w:type="dxa"/>
-            </w:tcMar>
-          </w:tcPr>
-          <w:p>
-            <w:pPr>
-              <w:spacing w:after="0"/>
-              <w:jc w:val="left"/>
-            </w:pPr>
-            <w:r>
-              <w:rPr>
-                <w:sz w:val="18"/>
-              </w:rPr>
-              <w:t xml:space="preserve">Same 14 segments; defines P75</w:t>
-            </w:r>
-          </w:p>
-        </w:tc>
-      </w:tr>
-    </w:tbl>
     <w:p>
       <w:pPr>
         <w:pStyle w:val="Heading1"/>
@@ -883,35 +124,28 @@
     </w:p>
     <w:p>
       <w:r>
-        <w:t xml:space="preserve">A fixed hash of host identifiers reserves approximately 20% of hosts for benchmark development. These hosts enter no model training, evaluation or sensitivity analysis. After removing them, analysis segments must contain at least 50 listings. Eligible reference listings in those supported segments supply one pooled P75, using linear interpolation and upward integer rounding. That cutoff remains fixed across segments and sensitivity samples.</w:t>
+        <w:t>A fixed rule based on host identifiers reserves about 20% of hosts to set the benchmark. These reference hosts are kept separate from model training and evaluation. The threshold stays fixed across comparisons. We use five-fold validation and keep each host's properties in one fold. This prevents the same host appearing in training and validation (scikit-learn developers, n.d.). Each training fold learns its own missing-value treatment and category encoding.</w:t>
       </w:r>
     </w:p>
     <w:p>
       <w:r>
-        <w:t xml:space="preserve">Descriptive tables report listing and distinct-host counts, review quantiles, observed attainment and attribute profiles. Pointwise 90% intervals resample hosts to account for properties sharing an operator. Wider dwelling definitions and unrestricted review histories assess how the chosen scope affects comparisons.</w:t>
+        <w:t>Logistic regression provides a simple reference model. Random forest and histogram gradient boosting can capture nonlinear relationships. Basic features include location, configuration, capacity, bathrooms and amenity counts. Six model extensions add coordinates, beds and nine facilities. We exclude review-based predictors, ratings and host badges. Current price and minimum stay enter separate operating-condition models. Their timing limits interpretation as pre-opening information.</w:t>
       </w:r>
     </w:p>
     <w:p>
       <w:r>
-        <w:br w:type="page"/>
+        <w:t>We compare models with a simple segment-rate baseline. It uses each segment's attainment among training hosts, with a fixed smoothing weight of ten. AUC measures ranking ability. Average precision summarises identification of listings reaching the target. Brier score measures probability error; lower values are better. Calibration checks predicted probabilities against observed rates. R supports cleaning and tables. Python pipelines keep validation steps consistent across models.</w:t>
       </w:r>
     </w:p>
     <w:p>
       <w:r>
-        <w:t xml:space="preserve">Baseline logistic regression and random forest use LGA, dwelling–bedroom configuration, capacity, bathrooms and amenity counts. Six fixed extensions add coordinates, beds and nine facilities and also test histogram gradient boosting. All comparisons use the same 3,873 listings and five test folds that keep each host in one fold. Each fold learns missing-value treatment and encoding only from its training data. Ratings, review-derived predictors and host badges are excluded; price and minimum stay appear only in labelled operating-controls variants.</w:t>
-      </w:r>
-      <w:pPr>
-        <w:keepLines w:val="1"/>
-      </w:pPr>
-    </w:p>
-    <w:p>
-      <w:r>
-        <w:t>Model assessment uses four measures. AUC measures ranking ability; average precision measures how accurately the model identifies listings reaching the benchmark; the Brier score measures probability error, where lower is better; and calibration checks whether predicted probabilities agree with observed rates. Every model is also compared with two references on the same folds: a training-prevalence forecast, and a segment-rate baseline that gives each validation listing its segment’s attainment rate among training hosts, shrunk towards the training rate by a prior weight of ten fixed before the run. Two boosting variants adjust probabilities using three host-separated groups within each training fold, without using held-out outcomes. R supports cleaning and descriptive analysis; Python and scikit-learn support modelling.</w:t>
+        <w:t>We refit models under 20 further host splits to check sensitivity to the split. These runs reuse the same data. Current intervals hold predictions fixed and omit model-selection and benchmark uncertainty. Model choice remains exploratory.</w:t>
       </w:r>
     </w:p>
     <w:p>
       <w:pPr>
         <w:pStyle w:val="Heading1"/>
+        <w:pageBreakBefore/>
       </w:pPr>
       <w:r>
         <w:t>Analysis Plan and Progress to Date</w:t>
@@ -919,22 +153,535 @@
     </w:p>
     <w:p>
       <w:r>
-        <w:t xml:space="preserve">The complete raw-data workflow and independent checks now agree on review counts, samples, benchmark and baseline metrics. Baseline logistic AUC is 0.573 and forest AUC is 0.560. Detailed property features improve forest AUC to 0.640, average precision to 0.350 and Brier score to 0.181, versus baseline logistic Brier 0.189. Its ten-bin calibration error is 1.63 percentage points. Boosting achieves AUC 0.647 but Brier 0.182. We provisionally prefer the enhanced forest for probability ranking because it has the lowest Brier score among the property-only extensions; discrimination remains moderate.</w:t>
+        <w:t>We have completed cleaning, review reconstruction, descriptive comparisons, grouped prediction and repeated-split checks. The table compares models on the same main sample and folds.</w:t>
+      </w:r>
+    </w:p>
+    <w:tbl>
+      <w:tblPr>
+        <w:tblW w:type="auto" w:w="0"/>
+        <w:tblLayout w:type="fixed"/>
+        <w:tblLook w:firstColumn="1" w:firstRow="1" w:lastColumn="0" w:lastRow="0" w:noHBand="0" w:noVBand="1" w:val="04A0"/>
+      </w:tblPr>
+      <w:tblGrid>
+        <w:gridCol w:w="2473"/>
+        <w:gridCol w:w="2473"/>
+        <w:gridCol w:w="2473"/>
+        <w:gridCol w:w="2473"/>
+      </w:tblGrid>
+      <w:tr>
+        <w:trPr>
+          <w:tblHeader/>
+        </w:trPr>
+        <w:tc>
+          <w:tcPr>
+            <w:tcW w:type="dxa" w:w="5040"/>
+            <w:tcBorders>
+              <w:top w:val="single" w:sz="4" w:color="D9D9D9"/>
+              <w:left w:val="single" w:sz="4" w:color="D9D9D9"/>
+              <w:bottom w:val="single" w:sz="4" w:color="D9D9D9"/>
+              <w:right w:val="single" w:sz="4" w:color="D9D9D9"/>
+            </w:tcBorders>
+            <w:tcMar>
+              <w:top w:w="65" w:type="dxa"/>
+              <w:left w:w="65" w:type="dxa"/>
+              <w:bottom w:w="65" w:type="dxa"/>
+              <w:right w:w="65" w:type="dxa"/>
+            </w:tcMar>
+            <w:shd w:fill="E9EEF3"/>
+          </w:tcPr>
+          <w:p>
+            <w:pPr>
+              <w:keepNext/>
+              <w:spacing w:after="0"/>
+            </w:pPr>
+            <w:r>
+              <w:rPr>
+                <w:b/>
+                <w:sz w:val="19"/>
+              </w:rPr>
+              <w:t>Predictor</w:t>
+            </w:r>
+          </w:p>
+        </w:tc>
+        <w:tc>
+          <w:tcPr>
+            <w:tcW w:type="dxa" w:w="1008"/>
+            <w:tcBorders>
+              <w:top w:val="single" w:sz="4" w:color="D9D9D9"/>
+              <w:left w:val="single" w:sz="4" w:color="D9D9D9"/>
+              <w:bottom w:val="single" w:sz="4" w:color="D9D9D9"/>
+              <w:right w:val="single" w:sz="4" w:color="D9D9D9"/>
+            </w:tcBorders>
+            <w:tcMar>
+              <w:top w:w="65" w:type="dxa"/>
+              <w:left w:w="65" w:type="dxa"/>
+              <w:bottom w:w="65" w:type="dxa"/>
+              <w:right w:w="65" w:type="dxa"/>
+            </w:tcMar>
+            <w:shd w:fill="E9EEF3"/>
+          </w:tcPr>
+          <w:p>
+            <w:pPr>
+              <w:keepNext/>
+              <w:spacing w:after="0"/>
+            </w:pPr>
+            <w:r>
+              <w:rPr>
+                <w:b/>
+                <w:sz w:val="19"/>
+              </w:rPr>
+              <w:t>AUC</w:t>
+            </w:r>
+          </w:p>
+        </w:tc>
+        <w:tc>
+          <w:tcPr>
+            <w:tcW w:type="dxa" w:w="1728"/>
+            <w:tcBorders>
+              <w:top w:val="single" w:sz="4" w:color="D9D9D9"/>
+              <w:left w:val="single" w:sz="4" w:color="D9D9D9"/>
+              <w:bottom w:val="single" w:sz="4" w:color="D9D9D9"/>
+              <w:right w:val="single" w:sz="4" w:color="D9D9D9"/>
+            </w:tcBorders>
+            <w:tcMar>
+              <w:top w:w="65" w:type="dxa"/>
+              <w:left w:w="65" w:type="dxa"/>
+              <w:bottom w:w="65" w:type="dxa"/>
+              <w:right w:w="65" w:type="dxa"/>
+            </w:tcMar>
+            <w:shd w:fill="E9EEF3"/>
+          </w:tcPr>
+          <w:p>
+            <w:pPr>
+              <w:keepNext/>
+              <w:spacing w:after="0"/>
+            </w:pPr>
+            <w:r>
+              <w:rPr>
+                <w:b/>
+                <w:sz w:val="19"/>
+              </w:rPr>
+              <w:t>Average precision</w:t>
+            </w:r>
+          </w:p>
+        </w:tc>
+        <w:tc>
+          <w:tcPr>
+            <w:tcW w:type="dxa" w:w="1152"/>
+            <w:tcBorders>
+              <w:top w:val="single" w:sz="4" w:color="D9D9D9"/>
+              <w:left w:val="single" w:sz="4" w:color="D9D9D9"/>
+              <w:bottom w:val="single" w:sz="4" w:color="D9D9D9"/>
+              <w:right w:val="single" w:sz="4" w:color="D9D9D9"/>
+            </w:tcBorders>
+            <w:tcMar>
+              <w:top w:w="65" w:type="dxa"/>
+              <w:left w:w="65" w:type="dxa"/>
+              <w:bottom w:w="65" w:type="dxa"/>
+              <w:right w:w="65" w:type="dxa"/>
+            </w:tcMar>
+            <w:shd w:fill="E9EEF3"/>
+          </w:tcPr>
+          <w:p>
+            <w:pPr>
+              <w:keepNext/>
+              <w:spacing w:after="0"/>
+            </w:pPr>
+            <w:r>
+              <w:rPr>
+                <w:b/>
+                <w:sz w:val="19"/>
+              </w:rPr>
+              <w:t>Brier score</w:t>
+            </w:r>
+          </w:p>
+        </w:tc>
+      </w:tr>
+      <w:tr>
+        <w:tc>
+          <w:tcPr>
+            <w:tcW w:type="dxa" w:w="5040"/>
+            <w:tcBorders>
+              <w:top w:val="single" w:sz="4" w:color="D9D9D9"/>
+              <w:left w:val="single" w:sz="4" w:color="D9D9D9"/>
+              <w:bottom w:val="single" w:sz="4" w:color="D9D9D9"/>
+              <w:right w:val="single" w:sz="4" w:color="D9D9D9"/>
+            </w:tcBorders>
+            <w:tcMar>
+              <w:top w:w="65" w:type="dxa"/>
+              <w:left w:w="65" w:type="dxa"/>
+              <w:bottom w:w="65" w:type="dxa"/>
+              <w:right w:w="65" w:type="dxa"/>
+            </w:tcMar>
+          </w:tcPr>
+          <w:p>
+            <w:pPr>
+              <w:keepNext/>
+              <w:spacing w:after="0"/>
+            </w:pPr>
+            <w:r>
+              <w:rPr>
+                <w:b w:val="0"/>
+                <w:sz w:val="19"/>
+              </w:rPr>
+              <w:t>Training-host segment rate</w:t>
+            </w:r>
+          </w:p>
+        </w:tc>
+        <w:tc>
+          <w:tcPr>
+            <w:tcW w:type="dxa" w:w="1008"/>
+            <w:tcBorders>
+              <w:top w:val="single" w:sz="4" w:color="D9D9D9"/>
+              <w:left w:val="single" w:sz="4" w:color="D9D9D9"/>
+              <w:bottom w:val="single" w:sz="4" w:color="D9D9D9"/>
+              <w:right w:val="single" w:sz="4" w:color="D9D9D9"/>
+            </w:tcBorders>
+            <w:tcMar>
+              <w:top w:w="65" w:type="dxa"/>
+              <w:left w:w="65" w:type="dxa"/>
+              <w:bottom w:w="65" w:type="dxa"/>
+              <w:right w:w="65" w:type="dxa"/>
+            </w:tcMar>
+          </w:tcPr>
+          <w:p>
+            <w:pPr>
+              <w:keepNext/>
+              <w:spacing w:after="0"/>
+            </w:pPr>
+            <w:r>
+              <w:rPr>
+                <w:b w:val="0"/>
+                <w:sz w:val="19"/>
+              </w:rPr>
+              <w:t>0.581</w:t>
+            </w:r>
+          </w:p>
+        </w:tc>
+        <w:tc>
+          <w:tcPr>
+            <w:tcW w:type="dxa" w:w="1728"/>
+            <w:tcBorders>
+              <w:top w:val="single" w:sz="4" w:color="D9D9D9"/>
+              <w:left w:val="single" w:sz="4" w:color="D9D9D9"/>
+              <w:bottom w:val="single" w:sz="4" w:color="D9D9D9"/>
+              <w:right w:val="single" w:sz="4" w:color="D9D9D9"/>
+            </w:tcBorders>
+            <w:tcMar>
+              <w:top w:w="65" w:type="dxa"/>
+              <w:left w:w="65" w:type="dxa"/>
+              <w:bottom w:w="65" w:type="dxa"/>
+              <w:right w:w="65" w:type="dxa"/>
+            </w:tcMar>
+          </w:tcPr>
+          <w:p>
+            <w:pPr>
+              <w:keepNext/>
+              <w:spacing w:after="0"/>
+            </w:pPr>
+            <w:r>
+              <w:rPr>
+                <w:b w:val="0"/>
+                <w:sz w:val="19"/>
+              </w:rPr>
+              <w:t>0.285</w:t>
+            </w:r>
+          </w:p>
+        </w:tc>
+        <w:tc>
+          <w:tcPr>
+            <w:tcW w:type="dxa" w:w="1152"/>
+            <w:tcBorders>
+              <w:top w:val="single" w:sz="4" w:color="D9D9D9"/>
+              <w:left w:val="single" w:sz="4" w:color="D9D9D9"/>
+              <w:bottom w:val="single" w:sz="4" w:color="D9D9D9"/>
+              <w:right w:val="single" w:sz="4" w:color="D9D9D9"/>
+            </w:tcBorders>
+            <w:tcMar>
+              <w:top w:w="65" w:type="dxa"/>
+              <w:left w:w="65" w:type="dxa"/>
+              <w:bottom w:w="65" w:type="dxa"/>
+              <w:right w:w="65" w:type="dxa"/>
+            </w:tcMar>
+          </w:tcPr>
+          <w:p>
+            <w:pPr>
+              <w:keepNext/>
+              <w:spacing w:after="0"/>
+            </w:pPr>
+            <w:r>
+              <w:rPr>
+                <w:b w:val="0"/>
+                <w:sz w:val="19"/>
+              </w:rPr>
+              <w:t>0.1868</w:t>
+            </w:r>
+          </w:p>
+        </w:tc>
+      </w:tr>
+      <w:tr>
+        <w:tc>
+          <w:tcPr>
+            <w:tcW w:type="dxa" w:w="5040"/>
+            <w:tcBorders>
+              <w:top w:val="single" w:sz="4" w:color="D9D9D9"/>
+              <w:left w:val="single" w:sz="4" w:color="D9D9D9"/>
+              <w:bottom w:val="single" w:sz="4" w:color="D9D9D9"/>
+              <w:right w:val="single" w:sz="4" w:color="D9D9D9"/>
+            </w:tcBorders>
+            <w:tcMar>
+              <w:top w:w="65" w:type="dxa"/>
+              <w:left w:w="65" w:type="dxa"/>
+              <w:bottom w:w="65" w:type="dxa"/>
+              <w:right w:w="65" w:type="dxa"/>
+            </w:tcMar>
+          </w:tcPr>
+          <w:p>
+            <w:pPr>
+              <w:keepNext/>
+              <w:spacing w:after="0"/>
+            </w:pPr>
+            <w:r>
+              <w:rPr>
+                <w:b w:val="0"/>
+                <w:sz w:val="19"/>
+              </w:rPr>
+              <w:t>Original property-only logistic</w:t>
+            </w:r>
+          </w:p>
+        </w:tc>
+        <w:tc>
+          <w:tcPr>
+            <w:tcW w:type="dxa" w:w="1008"/>
+            <w:tcBorders>
+              <w:top w:val="single" w:sz="4" w:color="D9D9D9"/>
+              <w:left w:val="single" w:sz="4" w:color="D9D9D9"/>
+              <w:bottom w:val="single" w:sz="4" w:color="D9D9D9"/>
+              <w:right w:val="single" w:sz="4" w:color="D9D9D9"/>
+            </w:tcBorders>
+            <w:tcMar>
+              <w:top w:w="65" w:type="dxa"/>
+              <w:left w:w="65" w:type="dxa"/>
+              <w:bottom w:w="65" w:type="dxa"/>
+              <w:right w:w="65" w:type="dxa"/>
+            </w:tcMar>
+          </w:tcPr>
+          <w:p>
+            <w:pPr>
+              <w:keepNext/>
+              <w:spacing w:after="0"/>
+            </w:pPr>
+            <w:r>
+              <w:rPr>
+                <w:b w:val="0"/>
+                <w:sz w:val="19"/>
+              </w:rPr>
+              <w:t>0.573</w:t>
+            </w:r>
+          </w:p>
+        </w:tc>
+        <w:tc>
+          <w:tcPr>
+            <w:tcW w:type="dxa" w:w="1728"/>
+            <w:tcBorders>
+              <w:top w:val="single" w:sz="4" w:color="D9D9D9"/>
+              <w:left w:val="single" w:sz="4" w:color="D9D9D9"/>
+              <w:bottom w:val="single" w:sz="4" w:color="D9D9D9"/>
+              <w:right w:val="single" w:sz="4" w:color="D9D9D9"/>
+            </w:tcBorders>
+            <w:tcMar>
+              <w:top w:w="65" w:type="dxa"/>
+              <w:left w:w="65" w:type="dxa"/>
+              <w:bottom w:w="65" w:type="dxa"/>
+              <w:right w:w="65" w:type="dxa"/>
+            </w:tcMar>
+          </w:tcPr>
+          <w:p>
+            <w:pPr>
+              <w:keepNext/>
+              <w:spacing w:after="0"/>
+            </w:pPr>
+            <w:r>
+              <w:rPr>
+                <w:b w:val="0"/>
+                <w:sz w:val="19"/>
+              </w:rPr>
+              <w:t>0.285</w:t>
+            </w:r>
+          </w:p>
+        </w:tc>
+        <w:tc>
+          <w:tcPr>
+            <w:tcW w:type="dxa" w:w="1152"/>
+            <w:tcBorders>
+              <w:top w:val="single" w:sz="4" w:color="D9D9D9"/>
+              <w:left w:val="single" w:sz="4" w:color="D9D9D9"/>
+              <w:bottom w:val="single" w:sz="4" w:color="D9D9D9"/>
+              <w:right w:val="single" w:sz="4" w:color="D9D9D9"/>
+            </w:tcBorders>
+            <w:tcMar>
+              <w:top w:w="65" w:type="dxa"/>
+              <w:left w:w="65" w:type="dxa"/>
+              <w:bottom w:w="65" w:type="dxa"/>
+              <w:right w:w="65" w:type="dxa"/>
+            </w:tcMar>
+          </w:tcPr>
+          <w:p>
+            <w:pPr>
+              <w:keepNext/>
+              <w:spacing w:after="0"/>
+            </w:pPr>
+            <w:r>
+              <w:rPr>
+                <w:b w:val="0"/>
+                <w:sz w:val="19"/>
+              </w:rPr>
+              <w:t>0.1886</w:t>
+            </w:r>
+          </w:p>
+        </w:tc>
+      </w:tr>
+      <w:tr>
+        <w:tc>
+          <w:tcPr>
+            <w:tcW w:type="dxa" w:w="5040"/>
+            <w:tcBorders>
+              <w:top w:val="single" w:sz="4" w:color="D9D9D9"/>
+              <w:left w:val="single" w:sz="4" w:color="D9D9D9"/>
+              <w:bottom w:val="single" w:sz="4" w:color="D9D9D9"/>
+              <w:right w:val="single" w:sz="4" w:color="D9D9D9"/>
+            </w:tcBorders>
+            <w:tcMar>
+              <w:top w:w="65" w:type="dxa"/>
+              <w:left w:w="65" w:type="dxa"/>
+              <w:bottom w:w="65" w:type="dxa"/>
+              <w:right w:w="65" w:type="dxa"/>
+            </w:tcMar>
+          </w:tcPr>
+          <w:p>
+            <w:pPr>
+              <w:keepNext w:val="0"/>
+              <w:spacing w:after="0"/>
+            </w:pPr>
+            <w:r>
+              <w:rPr>
+                <w:b w:val="0"/>
+                <w:sz w:val="19"/>
+              </w:rPr>
+              <w:t>Enhanced property-only forest</w:t>
+            </w:r>
+          </w:p>
+        </w:tc>
+        <w:tc>
+          <w:tcPr>
+            <w:tcW w:type="dxa" w:w="1008"/>
+            <w:tcBorders>
+              <w:top w:val="single" w:sz="4" w:color="D9D9D9"/>
+              <w:left w:val="single" w:sz="4" w:color="D9D9D9"/>
+              <w:bottom w:val="single" w:sz="4" w:color="D9D9D9"/>
+              <w:right w:val="single" w:sz="4" w:color="D9D9D9"/>
+            </w:tcBorders>
+            <w:tcMar>
+              <w:top w:w="65" w:type="dxa"/>
+              <w:left w:w="65" w:type="dxa"/>
+              <w:bottom w:w="65" w:type="dxa"/>
+              <w:right w:w="65" w:type="dxa"/>
+            </w:tcMar>
+          </w:tcPr>
+          <w:p>
+            <w:pPr>
+              <w:keepNext w:val="0"/>
+              <w:spacing w:after="0"/>
+            </w:pPr>
+            <w:r>
+              <w:rPr>
+                <w:b w:val="0"/>
+                <w:sz w:val="19"/>
+              </w:rPr>
+              <w:t>0.640</w:t>
+            </w:r>
+          </w:p>
+        </w:tc>
+        <w:tc>
+          <w:tcPr>
+            <w:tcW w:type="dxa" w:w="1728"/>
+            <w:tcBorders>
+              <w:top w:val="single" w:sz="4" w:color="D9D9D9"/>
+              <w:left w:val="single" w:sz="4" w:color="D9D9D9"/>
+              <w:bottom w:val="single" w:sz="4" w:color="D9D9D9"/>
+              <w:right w:val="single" w:sz="4" w:color="D9D9D9"/>
+            </w:tcBorders>
+            <w:tcMar>
+              <w:top w:w="65" w:type="dxa"/>
+              <w:left w:w="65" w:type="dxa"/>
+              <w:bottom w:w="65" w:type="dxa"/>
+              <w:right w:w="65" w:type="dxa"/>
+            </w:tcMar>
+          </w:tcPr>
+          <w:p>
+            <w:pPr>
+              <w:keepNext w:val="0"/>
+              <w:spacing w:after="0"/>
+            </w:pPr>
+            <w:r>
+              <w:rPr>
+                <w:b w:val="0"/>
+                <w:sz w:val="19"/>
+              </w:rPr>
+              <w:t>0.350</w:t>
+            </w:r>
+          </w:p>
+        </w:tc>
+        <w:tc>
+          <w:tcPr>
+            <w:tcW w:type="dxa" w:w="1152"/>
+            <w:tcBorders>
+              <w:top w:val="single" w:sz="4" w:color="D9D9D9"/>
+              <w:left w:val="single" w:sz="4" w:color="D9D9D9"/>
+              <w:bottom w:val="single" w:sz="4" w:color="D9D9D9"/>
+              <w:right w:val="single" w:sz="4" w:color="D9D9D9"/>
+            </w:tcBorders>
+            <w:tcMar>
+              <w:top w:w="65" w:type="dxa"/>
+              <w:left w:w="65" w:type="dxa"/>
+              <w:bottom w:w="65" w:type="dxa"/>
+              <w:right w:w="65" w:type="dxa"/>
+            </w:tcMar>
+          </w:tcPr>
+          <w:p>
+            <w:pPr>
+              <w:keepNext w:val="0"/>
+              <w:spacing w:after="0"/>
+            </w:pPr>
+            <w:r>
+              <w:rPr>
+                <w:b w:val="0"/>
+                <w:sz w:val="19"/>
+              </w:rPr>
+              <w:t>0.1813</w:t>
+            </w:r>
+          </w:p>
+        </w:tc>
+      </w:tr>
+    </w:tbl>
+    <w:p>
+      <w:r>
+        <w:t>The original logistic and forest models perform worse than segment rates on main-split AUC and Brier. The enhanced forest improves both measures in all five folds. We provisionally use it for probability scoring because it has the lowest Brier among property-only extensions. Boosting has a slightly higher AUC of 0.647. Across 20 further splits, forest AUC averages 0.626 and ranges from 0.589 to 0.648. It exceeds the segment baseline each time. Its overall predictive ability remains moderate.</w:t>
       </w:r>
     </w:p>
     <w:p>
       <w:r>
-        <w:t xml:space="preserve">The enhanced forest ranks Melbourne three-bedroom apartments first: mean probability 34.4%, observed attainment 36.6%, and 306 listings. Resampling hosts gives a conditional 95% interval of 33.0–35.8%; this interval holds the fitted model and review cutoff fixed. Removing the history restriction gives 6,675 analysis listings; removing the price filter gives 5,720. Adding current price and minimum stay to enhanced boosting raises AUC to 0.749. These contemporaneous settings provide useful context but do not establish a causal effect or a pre-opening forecast. Probability adjustment does not improve every metric.</w:t>
+        <w:t>All property-only models identify the same main top three: Melbourne three-bedroom apartments, Melbourne two-bedroom apartments and Yarra Ranges three-bedroom houses/townhouses. Their observed attainment is 36.6%, 32.8% and 30.0%, respectively. Under the enhanced forest, Melbourne three-bedroom apartments rank first in all 20 further splits. The same top-three set appears in 19 splits. Yarra Ranges has only 90 listings in this segment, so its evidence is thinner. The model improves overall prediction while keeping the principal search candidates unchanged. We have not separately tested prediction within segments.</w:t>
       </w:r>
     </w:p>
     <w:p>
       <w:r>
-        <w:t>The segment-rate baseline reaches AUC 0.581 and Brier score 0.187. Both original property-only models fall below it, exceeding its AUC in one of five folds; the enhanced forest exceeds it in every fold, by 0.059 AUC overall. Every model places the same three segments first, so the models add listing-level discrimination rather than a different segment order. Across 20 repeated host partitions the enhanced forest exceeds the baseline in all 20 (AUC 0.589–0.648); Melbourne three-bedroom apartments rank first in every partition and the same top three recur in 19.</w:t>
+        <w:t>The client can start property searches in these three segments and request lease quotations. Before signing, they must check permission, availability and actual costs. Our results cannot estimate address-level profit or ROI.</w:t>
       </w:r>
     </w:p>
     <w:p>
       <w:r>
-        <w:t>All six extensions and the baseline are reported. Their comparison follows baseline inspection, so model preference is exploratory and there is no untouched final test. Next steps are to choose models within the training data and recalculate ranking intervals while refitting the model. Findings describe existing listings’ preceding-year review activity, not future income or profitability. The README reproduces this report and links the code, validation and outputs.</w:t>
+        <w:t>For the final report, we will select models within training data and recalculate ranking intervals while refitting models. We will also test wider dwelling definitions and different minimum sample sizes. We will assess success through lower probability error, calibration and candidate stability. If model gains disappear, we will use segment rates as the main screening evidence. If rankings change substantially, we will present several candidates and explain the uncertainty. The README and outputs will record these decisions.</w:t>
       </w:r>
     </w:p>
     <w:p>
@@ -946,100 +693,32 @@
       </w:r>
     </w:p>
     <w:p>
-      <w:pPr>
-        <w:spacing w:after="80"/>
-      </w:pPr>
       <w:r>
-        <w:rPr>
-          <w:sz w:val="21"/>
-        </w:rPr>
-        <w:t xml:space="preserve">Inside Airbnb. (2026). </w:t>
-      </w:r>
-      <w:r>
-        <w:rPr>
-          <w:i/>
-          <w:sz w:val="21"/>
-        </w:rPr>
-        <w:t>Melbourne listings, calendar and reviews</w:t>
-      </w:r>
-      <w:r>
-        <w:rPr>
-          <w:sz w:val="21"/>
-        </w:rPr>
-        <w:t xml:space="preserve"> [June 2026 dataset supplied through CMCE30005 LMS].</w:t>
+        <w:t>Inside Airbnb. (2026). Melbourne listings, calendar and reviews [June 2026 dataset supplied through CMCE30005 LMS].</w:t>
       </w:r>
     </w:p>
     <w:p>
-      <w:pPr>
-        <w:spacing w:after="80"/>
-      </w:pPr>
       <w:r>
-        <w:rPr>
-          <w:sz w:val="21"/>
-        </w:rPr>
-        <w:t xml:space="preserve">Scikit-learn developers. (n.d.). </w:t>
-      </w:r>
-      <w:r>
-        <w:rPr>
-          <w:i/>
-          <w:sz w:val="21"/>
-        </w:rPr>
-        <w:t>Cross-validation</w:t>
-      </w:r>
-      <w:r>
-        <w:rPr>
-          <w:sz w:val="21"/>
-        </w:rPr>
-        <w:t xml:space="preserve"> and </w:t>
-      </w:r>
-      <w:r>
-        <w:rPr>
-          <w:i/>
-          <w:sz w:val="21"/>
-        </w:rPr>
-        <w:t>Probability calibration</w:t>
-      </w:r>
-      <w:r>
-        <w:rPr>
-          <w:sz w:val="21"/>
-        </w:rPr>
-        <w:t xml:space="preserve">. Retrieved 13 September 2026. </w:t>
+        <w:t xml:space="preserve">Scikit-learn developers. (n.d.). Cross-validation and probability calibration. </w:t>
       </w:r>
       <w:hyperlink r:id="rId14">
         <w:r>
-          <w:rPr>
-            <w:color w:val="174A78"/>
-            <w:u w:val="single"/>
-          </w:rPr>
           <w:t>Grouped validation</w:t>
         </w:r>
       </w:hyperlink>
       <w:r>
-        <w:rPr>
-          <w:sz w:val="21"/>
-        </w:rPr>
         <w:t xml:space="preserve">; </w:t>
       </w:r>
       <w:hyperlink r:id="rId15">
         <w:r>
-          <w:rPr>
-            <w:color w:val="174A78"/>
-            <w:u w:val="single"/>
-          </w:rPr>
           <w:t>Calibration guidance</w:t>
         </w:r>
       </w:hyperlink>
-      <w:r>
-        <w:rPr>
-          <w:sz w:val="21"/>
-        </w:rPr>
-        <w:t>.</w:t>
-      </w:r>
     </w:p>
     <w:sectPr>
       <w:footerReference w:type="default" r:id="rId13"/>
-      <w:pgSz w:w="11906" w:h="16838"/>
-      <w:pgMar w:top="1134" w:right="1247" w:bottom="1077" w:left="1247" w:header="720" w:footer="482" w:gutter="0"/>
+      <w:pgSz w:w="11909" w:h="16834"/>
+      <w:pgMar w:top="936" w:right="1008" w:bottom="936" w:left="1008" w:header="720" w:footer="482" w:gutter="0"/>
       <w:cols w:space="720"/>
       <w:docGrid w:linePitch="360"/>
     </w:sectPr>
@@ -1428,13 +1107,14 @@
     <w:qFormat/>
     <w:rsid w:val="00FC693F"/>
     <w:pPr>
+      <w:keepLines/>
       <w:widowControl/>
-      <w:spacing w:after="120" w:line="264" w:lineRule="auto"/>
+      <w:spacing w:after="120" w:line="252" w:lineRule="auto"/>
     </w:pPr>
     <w:rPr>
       <w:rFonts w:ascii="Arial" w:hAnsi="Arial"/>
       <w:color w:val="000000"/>
-      <w:sz w:val="22"/>
+      <w:sz w:val="21"/>
     </w:rPr>
   </w:style>
   <w:style w:type="paragraph" w:styleId="Header">
@@ -1492,7 +1172,7 @@
     <w:pPr>
       <w:keepNext/>
       <w:keepLines/>
-      <w:spacing w:before="200" w:after="100"/>
+      <w:spacing w:before="180" w:after="100"/>
       <w:outlineLvl w:val="0"/>
     </w:pPr>
     <w:rPr>
@@ -1500,7 +1180,7 @@
       <w:b/>
       <w:bCs/>
       <w:color w:val="000000"/>
-      <w:sz w:val="26"/>
+      <w:sz w:val="24"/>
       <w:szCs w:val="28"/>
     </w:rPr>
   </w:style>
@@ -1779,7 +1459,7 @@
     <w:rsid w:val="00FC693F"/>
     <w:pPr>
       <w:keepNext/>
-      <w:spacing w:after="100" w:line="240" w:lineRule="auto" w:before="0"/>
+      <w:spacing w:after="100" w:line="240" w:lineRule="auto" w:before="180"/>
       <w:contextualSpacing/>
     </w:pPr>
     <w:rPr>
@@ -1788,7 +1468,7 @@
       <w:color w:val="000000"/>
       <w:spacing w:val="5"/>
       <w:kern w:val="28"/>
-      <w:sz w:val="40"/>
+      <w:sz w:val="38"/>
       <w:szCs w:val="52"/>
     </w:rPr>
   </w:style>

</xml_diff>

<commit_message>
Add candidate probabilities and strengthen interim report reasoning and validation plan
</commit_message>
<xml_diff>
--- a/reports/Interim_Project_Report.docx
+++ b/reports/Interim_Project_Report.docx
@@ -78,12 +78,12 @@
     </w:p>
     <w:p>
       <w:r>
-        <w:t>The target records whether a listing reaches a common review-count threshold over the previous 365 days. The upper-quartile rule is our analytical benchmark. Reviews provide a limited signal of guest activity. Review willingness and stay length can affect the count. We therefore cannot use it to measure bookings, occupancy or profit.</w:t>
+        <w:t>The target records whether a listing reaches a common review-count threshold over the previous 365 days. Dated reviews give us an observable measure of guest-review activity across the supplied listings. This supports an initial comparison of areas and property types. The upper quartile defines relatively high activity within our reference sample. Short stays can generate more reviews than long stays with similar guest nights. Review willingness also varies. These differences limit comparisons and prevent estimates of bookings, occupancy or profit.</w:t>
       </w:r>
     </w:p>
     <w:p>
       <w:r>
-        <w:t>We aim to compare segment performance, test the value of property features, and identify consistent search candidates. The results support further investigation before any lease commitment.</w:t>
+        <w:t>We will deliver a segment comparison table, a model-versus-baseline assessment and a shortlist with evidence strength and uncertainty. These outputs guide property searches before lease commitment.</w:t>
       </w:r>
     </w:p>
     <w:p>
@@ -139,7 +139,7 @@
     </w:p>
     <w:p>
       <w:r>
-        <w:t>We refit models under 20 further host splits to check sensitivity to the split. These runs reuse the same data. Current intervals hold predictions fixed and omit model-selection and benchmark uncertainty. Model choice remains exploratory.</w:t>
+        <w:t>We refit models under 20 further host splits to check split sensitivity. These runs reuse the same data. We assume current property details are relevant to preceding-year activity, although they may have changed during that year. Property-only models therefore remain historical comparisons. Current intervals hold predictions fixed and omit model-selection and benchmark uncertainty. Model choice remains exploratory, with no untouched final test.</w:t>
       </w:r>
     </w:p>
     <w:p>
@@ -153,7 +153,12 @@
     </w:p>
     <w:p>
       <w:r>
-        <w:t>We have completed cleaning, review reconstruction, descriptive comparisons, grouped prediction and repeated-split checks. The table compares models on the same main sample and folds.</w:t>
+        <w:t>The original ROI and quarterly prediction design exceeded the available data. We revised the scope to historical review activity using the single school snapshot. Weak basic-model results prompted comparison with training-host segment rates. Cleaning, review reconstruction, descriptive analysis and grouped validation are complete. Table 1 compares predictions on the same sample and folds.</w:t>
+      </w:r>
+    </w:p>
+    <w:p>
+      <w:r>
+        <w:t>Table 1. Predictive performance</w:t>
       </w:r>
     </w:p>
     <w:tbl>
@@ -671,7 +676,525 @@
     </w:p>
     <w:p>
       <w:r>
-        <w:t>All property-only models identify the same main top three: Melbourne three-bedroom apartments, Melbourne two-bedroom apartments and Yarra Ranges three-bedroom houses/townhouses. Their observed attainment is 36.6%, 32.8% and 30.0%, respectively. Under the enhanced forest, Melbourne three-bedroom apartments rank first in all 20 further splits. The same top-three set appears in 19 splits. Yarra Ranges has only 90 listings in this segment, so its evidence is thinner. The model improves overall prediction while keeping the principal search candidates unchanged. We have not separately tested prediction within segments.</w:t>
+        <w:t>Table 2 answers the RQ using the enhanced forest's mean predictions. Each prediction comes from a model trained without that listing's host. All property-only models identify the same main top-three set as the segment baseline.</w:t>
+      </w:r>
+    </w:p>
+    <w:p>
+      <w:r>
+        <w:t>Table 2. Initial search candidates</w:t>
+      </w:r>
+    </w:p>
+    <w:tbl>
+      <w:tblPr>
+        <w:tblW w:type="auto" w:w="0"/>
+        <w:tblLayout w:type="fixed"/>
+        <w:tblLook w:firstColumn="1" w:firstRow="1" w:lastColumn="0" w:lastRow="0" w:noHBand="0" w:noVBand="1" w:val="04A0"/>
+      </w:tblPr>
+      <w:tblGrid>
+        <w:gridCol w:w="2473"/>
+        <w:gridCol w:w="2473"/>
+        <w:gridCol w:w="2473"/>
+        <w:gridCol w:w="2473"/>
+      </w:tblGrid>
+      <w:tr>
+        <w:trPr>
+          <w:tblHeader/>
+        </w:trPr>
+        <w:tc>
+          <w:tcPr>
+            <w:tcW w:type="dxa" w:w="3888"/>
+            <w:tcBorders>
+              <w:top w:val="single" w:sz="4" w:color="D9D9D9"/>
+              <w:left w:val="single" w:sz="4" w:color="D9D9D9"/>
+              <w:bottom w:val="single" w:sz="4" w:color="D9D9D9"/>
+              <w:right w:val="single" w:sz="4" w:color="D9D9D9"/>
+            </w:tcBorders>
+            <w:tcMar>
+              <w:top w:w="65" w:type="dxa"/>
+              <w:left w:w="65" w:type="dxa"/>
+              <w:bottom w:w="65" w:type="dxa"/>
+              <w:right w:w="65" w:type="dxa"/>
+            </w:tcMar>
+            <w:shd w:fill="E9EEF3"/>
+          </w:tcPr>
+          <w:p>
+            <w:pPr>
+              <w:keepNext/>
+              <w:spacing w:after="0"/>
+            </w:pPr>
+            <w:r>
+              <w:rPr>
+                <w:b/>
+                <w:sz w:val="19"/>
+              </w:rPr>
+              <w:t>Segment</w:t>
+            </w:r>
+          </w:p>
+        </w:tc>
+        <w:tc>
+          <w:tcPr>
+            <w:tcW w:type="dxa" w:w="1512"/>
+            <w:tcBorders>
+              <w:top w:val="single" w:sz="4" w:color="D9D9D9"/>
+              <w:left w:val="single" w:sz="4" w:color="D9D9D9"/>
+              <w:bottom w:val="single" w:sz="4" w:color="D9D9D9"/>
+              <w:right w:val="single" w:sz="4" w:color="D9D9D9"/>
+            </w:tcBorders>
+            <w:tcMar>
+              <w:top w:w="65" w:type="dxa"/>
+              <w:left w:w="65" w:type="dxa"/>
+              <w:bottom w:w="65" w:type="dxa"/>
+              <w:right w:w="65" w:type="dxa"/>
+            </w:tcMar>
+            <w:shd w:fill="E9EEF3"/>
+          </w:tcPr>
+          <w:p>
+            <w:pPr>
+              <w:keepNext/>
+              <w:spacing w:after="0"/>
+            </w:pPr>
+            <w:r>
+              <w:rPr>
+                <w:b/>
+                <w:sz w:val="19"/>
+              </w:rPr>
+              <w:t>Listings / hosts</w:t>
+            </w:r>
+          </w:p>
+        </w:tc>
+        <w:tc>
+          <w:tcPr>
+            <w:tcW w:type="dxa" w:w="1656"/>
+            <w:tcBorders>
+              <w:top w:val="single" w:sz="4" w:color="D9D9D9"/>
+              <w:left w:val="single" w:sz="4" w:color="D9D9D9"/>
+              <w:bottom w:val="single" w:sz="4" w:color="D9D9D9"/>
+              <w:right w:val="single" w:sz="4" w:color="D9D9D9"/>
+            </w:tcBorders>
+            <w:tcMar>
+              <w:top w:w="65" w:type="dxa"/>
+              <w:left w:w="65" w:type="dxa"/>
+              <w:bottom w:w="65" w:type="dxa"/>
+              <w:right w:w="65" w:type="dxa"/>
+            </w:tcMar>
+            <w:shd w:fill="E9EEF3"/>
+          </w:tcPr>
+          <w:p>
+            <w:pPr>
+              <w:keepNext/>
+              <w:spacing w:after="0"/>
+            </w:pPr>
+            <w:r>
+              <w:rPr>
+                <w:b/>
+                <w:sz w:val="19"/>
+              </w:rPr>
+              <w:t>Observed attainment</w:t>
+            </w:r>
+          </w:p>
+        </w:tc>
+        <w:tc>
+          <w:tcPr>
+            <w:tcW w:type="dxa" w:w="1872"/>
+            <w:tcBorders>
+              <w:top w:val="single" w:sz="4" w:color="D9D9D9"/>
+              <w:left w:val="single" w:sz="4" w:color="D9D9D9"/>
+              <w:bottom w:val="single" w:sz="4" w:color="D9D9D9"/>
+              <w:right w:val="single" w:sz="4" w:color="D9D9D9"/>
+            </w:tcBorders>
+            <w:tcMar>
+              <w:top w:w="65" w:type="dxa"/>
+              <w:left w:w="65" w:type="dxa"/>
+              <w:bottom w:w="65" w:type="dxa"/>
+              <w:right w:w="65" w:type="dxa"/>
+            </w:tcMar>
+            <w:shd w:fill="E9EEF3"/>
+          </w:tcPr>
+          <w:p>
+            <w:pPr>
+              <w:keepNext/>
+              <w:spacing w:after="0"/>
+            </w:pPr>
+            <w:r>
+              <w:rPr>
+                <w:b/>
+                <w:sz w:val="19"/>
+              </w:rPr>
+              <w:t>Mean predicted probability</w:t>
+            </w:r>
+          </w:p>
+        </w:tc>
+      </w:tr>
+      <w:tr>
+        <w:tc>
+          <w:tcPr>
+            <w:tcW w:type="dxa" w:w="3888"/>
+            <w:tcBorders>
+              <w:top w:val="single" w:sz="4" w:color="D9D9D9"/>
+              <w:left w:val="single" w:sz="4" w:color="D9D9D9"/>
+              <w:bottom w:val="single" w:sz="4" w:color="D9D9D9"/>
+              <w:right w:val="single" w:sz="4" w:color="D9D9D9"/>
+            </w:tcBorders>
+            <w:tcMar>
+              <w:top w:w="65" w:type="dxa"/>
+              <w:left w:w="65" w:type="dxa"/>
+              <w:bottom w:w="65" w:type="dxa"/>
+              <w:right w:w="65" w:type="dxa"/>
+            </w:tcMar>
+          </w:tcPr>
+          <w:p>
+            <w:pPr>
+              <w:keepNext/>
+              <w:spacing w:after="0"/>
+            </w:pPr>
+            <w:r>
+              <w:rPr>
+                <w:b w:val="0"/>
+                <w:sz w:val="19"/>
+              </w:rPr>
+              <w:t>Melbourne three-bedroom apartments</w:t>
+            </w:r>
+          </w:p>
+        </w:tc>
+        <w:tc>
+          <w:tcPr>
+            <w:tcW w:type="dxa" w:w="1512"/>
+            <w:tcBorders>
+              <w:top w:val="single" w:sz="4" w:color="D9D9D9"/>
+              <w:left w:val="single" w:sz="4" w:color="D9D9D9"/>
+              <w:bottom w:val="single" w:sz="4" w:color="D9D9D9"/>
+              <w:right w:val="single" w:sz="4" w:color="D9D9D9"/>
+            </w:tcBorders>
+            <w:tcMar>
+              <w:top w:w="65" w:type="dxa"/>
+              <w:left w:w="65" w:type="dxa"/>
+              <w:bottom w:w="65" w:type="dxa"/>
+              <w:right w:w="65" w:type="dxa"/>
+            </w:tcMar>
+          </w:tcPr>
+          <w:p>
+            <w:pPr>
+              <w:keepNext/>
+              <w:spacing w:after="0"/>
+            </w:pPr>
+            <w:r>
+              <w:rPr>
+                <w:b w:val="0"/>
+                <w:sz w:val="19"/>
+              </w:rPr>
+              <w:t>306 / 139</w:t>
+            </w:r>
+          </w:p>
+        </w:tc>
+        <w:tc>
+          <w:tcPr>
+            <w:tcW w:type="dxa" w:w="1656"/>
+            <w:tcBorders>
+              <w:top w:val="single" w:sz="4" w:color="D9D9D9"/>
+              <w:left w:val="single" w:sz="4" w:color="D9D9D9"/>
+              <w:bottom w:val="single" w:sz="4" w:color="D9D9D9"/>
+              <w:right w:val="single" w:sz="4" w:color="D9D9D9"/>
+            </w:tcBorders>
+            <w:tcMar>
+              <w:top w:w="65" w:type="dxa"/>
+              <w:left w:w="65" w:type="dxa"/>
+              <w:bottom w:w="65" w:type="dxa"/>
+              <w:right w:w="65" w:type="dxa"/>
+            </w:tcMar>
+          </w:tcPr>
+          <w:p>
+            <w:pPr>
+              <w:keepNext/>
+              <w:spacing w:after="0"/>
+            </w:pPr>
+            <w:r>
+              <w:rPr>
+                <w:b w:val="0"/>
+                <w:sz w:val="19"/>
+              </w:rPr>
+              <w:t>36.60%</w:t>
+            </w:r>
+          </w:p>
+        </w:tc>
+        <w:tc>
+          <w:tcPr>
+            <w:tcW w:type="dxa" w:w="1872"/>
+            <w:tcBorders>
+              <w:top w:val="single" w:sz="4" w:color="D9D9D9"/>
+              <w:left w:val="single" w:sz="4" w:color="D9D9D9"/>
+              <w:bottom w:val="single" w:sz="4" w:color="D9D9D9"/>
+              <w:right w:val="single" w:sz="4" w:color="D9D9D9"/>
+            </w:tcBorders>
+            <w:tcMar>
+              <w:top w:w="65" w:type="dxa"/>
+              <w:left w:w="65" w:type="dxa"/>
+              <w:bottom w:w="65" w:type="dxa"/>
+              <w:right w:w="65" w:type="dxa"/>
+            </w:tcMar>
+          </w:tcPr>
+          <w:p>
+            <w:pPr>
+              <w:keepNext/>
+              <w:spacing w:after="0"/>
+            </w:pPr>
+            <w:r>
+              <w:rPr>
+                <w:b w:val="0"/>
+                <w:sz w:val="19"/>
+              </w:rPr>
+              <w:t>34.45%</w:t>
+            </w:r>
+          </w:p>
+        </w:tc>
+      </w:tr>
+      <w:tr>
+        <w:tc>
+          <w:tcPr>
+            <w:tcW w:type="dxa" w:w="3888"/>
+            <w:tcBorders>
+              <w:top w:val="single" w:sz="4" w:color="D9D9D9"/>
+              <w:left w:val="single" w:sz="4" w:color="D9D9D9"/>
+              <w:bottom w:val="single" w:sz="4" w:color="D9D9D9"/>
+              <w:right w:val="single" w:sz="4" w:color="D9D9D9"/>
+            </w:tcBorders>
+            <w:tcMar>
+              <w:top w:w="65" w:type="dxa"/>
+              <w:left w:w="65" w:type="dxa"/>
+              <w:bottom w:w="65" w:type="dxa"/>
+              <w:right w:w="65" w:type="dxa"/>
+            </w:tcMar>
+          </w:tcPr>
+          <w:p>
+            <w:pPr>
+              <w:keepNext/>
+              <w:spacing w:after="0"/>
+            </w:pPr>
+            <w:r>
+              <w:rPr>
+                <w:b w:val="0"/>
+                <w:sz w:val="19"/>
+              </w:rPr>
+              <w:t>Melbourne two-bedroom apartments</w:t>
+            </w:r>
+          </w:p>
+        </w:tc>
+        <w:tc>
+          <w:tcPr>
+            <w:tcW w:type="dxa" w:w="1512"/>
+            <w:tcBorders>
+              <w:top w:val="single" w:sz="4" w:color="D9D9D9"/>
+              <w:left w:val="single" w:sz="4" w:color="D9D9D9"/>
+              <w:bottom w:val="single" w:sz="4" w:color="D9D9D9"/>
+              <w:right w:val="single" w:sz="4" w:color="D9D9D9"/>
+            </w:tcBorders>
+            <w:tcMar>
+              <w:top w:w="65" w:type="dxa"/>
+              <w:left w:w="65" w:type="dxa"/>
+              <w:bottom w:w="65" w:type="dxa"/>
+              <w:right w:w="65" w:type="dxa"/>
+            </w:tcMar>
+          </w:tcPr>
+          <w:p>
+            <w:pPr>
+              <w:keepNext/>
+              <w:spacing w:after="0"/>
+            </w:pPr>
+            <w:r>
+              <w:rPr>
+                <w:b w:val="0"/>
+                <w:sz w:val="19"/>
+              </w:rPr>
+              <w:t>1,235 / 482</w:t>
+            </w:r>
+          </w:p>
+        </w:tc>
+        <w:tc>
+          <w:tcPr>
+            <w:tcW w:type="dxa" w:w="1656"/>
+            <w:tcBorders>
+              <w:top w:val="single" w:sz="4" w:color="D9D9D9"/>
+              <w:left w:val="single" w:sz="4" w:color="D9D9D9"/>
+              <w:bottom w:val="single" w:sz="4" w:color="D9D9D9"/>
+              <w:right w:val="single" w:sz="4" w:color="D9D9D9"/>
+            </w:tcBorders>
+            <w:tcMar>
+              <w:top w:w="65" w:type="dxa"/>
+              <w:left w:w="65" w:type="dxa"/>
+              <w:bottom w:w="65" w:type="dxa"/>
+              <w:right w:w="65" w:type="dxa"/>
+            </w:tcMar>
+          </w:tcPr>
+          <w:p>
+            <w:pPr>
+              <w:keepNext/>
+              <w:spacing w:after="0"/>
+            </w:pPr>
+            <w:r>
+              <w:rPr>
+                <w:b w:val="0"/>
+                <w:sz w:val="19"/>
+              </w:rPr>
+              <w:t>32.79%</w:t>
+            </w:r>
+          </w:p>
+        </w:tc>
+        <w:tc>
+          <w:tcPr>
+            <w:tcW w:type="dxa" w:w="1872"/>
+            <w:tcBorders>
+              <w:top w:val="single" w:sz="4" w:color="D9D9D9"/>
+              <w:left w:val="single" w:sz="4" w:color="D9D9D9"/>
+              <w:bottom w:val="single" w:sz="4" w:color="D9D9D9"/>
+              <w:right w:val="single" w:sz="4" w:color="D9D9D9"/>
+            </w:tcBorders>
+            <w:tcMar>
+              <w:top w:w="65" w:type="dxa"/>
+              <w:left w:w="65" w:type="dxa"/>
+              <w:bottom w:w="65" w:type="dxa"/>
+              <w:right w:w="65" w:type="dxa"/>
+            </w:tcMar>
+          </w:tcPr>
+          <w:p>
+            <w:pPr>
+              <w:keepNext/>
+              <w:spacing w:after="0"/>
+            </w:pPr>
+            <w:r>
+              <w:rPr>
+                <w:b w:val="0"/>
+                <w:sz w:val="19"/>
+              </w:rPr>
+              <w:t>31.41%</w:t>
+            </w:r>
+          </w:p>
+        </w:tc>
+      </w:tr>
+      <w:tr>
+        <w:tc>
+          <w:tcPr>
+            <w:tcW w:type="dxa" w:w="3888"/>
+            <w:tcBorders>
+              <w:top w:val="single" w:sz="4" w:color="D9D9D9"/>
+              <w:left w:val="single" w:sz="4" w:color="D9D9D9"/>
+              <w:bottom w:val="single" w:sz="4" w:color="D9D9D9"/>
+              <w:right w:val="single" w:sz="4" w:color="D9D9D9"/>
+            </w:tcBorders>
+            <w:tcMar>
+              <w:top w:w="65" w:type="dxa"/>
+              <w:left w:w="65" w:type="dxa"/>
+              <w:bottom w:w="65" w:type="dxa"/>
+              <w:right w:w="65" w:type="dxa"/>
+            </w:tcMar>
+          </w:tcPr>
+          <w:p>
+            <w:pPr>
+              <w:keepNext w:val="0"/>
+              <w:spacing w:after="0"/>
+            </w:pPr>
+            <w:r>
+              <w:rPr>
+                <w:b w:val="0"/>
+                <w:sz w:val="19"/>
+              </w:rPr>
+              <w:t>Yarra Ranges three-bedroom houses/townhouses</w:t>
+            </w:r>
+          </w:p>
+        </w:tc>
+        <w:tc>
+          <w:tcPr>
+            <w:tcW w:type="dxa" w:w="1512"/>
+            <w:tcBorders>
+              <w:top w:val="single" w:sz="4" w:color="D9D9D9"/>
+              <w:left w:val="single" w:sz="4" w:color="D9D9D9"/>
+              <w:bottom w:val="single" w:sz="4" w:color="D9D9D9"/>
+              <w:right w:val="single" w:sz="4" w:color="D9D9D9"/>
+            </w:tcBorders>
+            <w:tcMar>
+              <w:top w:w="65" w:type="dxa"/>
+              <w:left w:w="65" w:type="dxa"/>
+              <w:bottom w:w="65" w:type="dxa"/>
+              <w:right w:w="65" w:type="dxa"/>
+            </w:tcMar>
+          </w:tcPr>
+          <w:p>
+            <w:pPr>
+              <w:keepNext w:val="0"/>
+              <w:spacing w:after="0"/>
+            </w:pPr>
+            <w:r>
+              <w:rPr>
+                <w:b w:val="0"/>
+                <w:sz w:val="19"/>
+              </w:rPr>
+              <w:t>90 / 77</w:t>
+            </w:r>
+          </w:p>
+        </w:tc>
+        <w:tc>
+          <w:tcPr>
+            <w:tcW w:type="dxa" w:w="1656"/>
+            <w:tcBorders>
+              <w:top w:val="single" w:sz="4" w:color="D9D9D9"/>
+              <w:left w:val="single" w:sz="4" w:color="D9D9D9"/>
+              <w:bottom w:val="single" w:sz="4" w:color="D9D9D9"/>
+              <w:right w:val="single" w:sz="4" w:color="D9D9D9"/>
+            </w:tcBorders>
+            <w:tcMar>
+              <w:top w:w="65" w:type="dxa"/>
+              <w:left w:w="65" w:type="dxa"/>
+              <w:bottom w:w="65" w:type="dxa"/>
+              <w:right w:w="65" w:type="dxa"/>
+            </w:tcMar>
+          </w:tcPr>
+          <w:p>
+            <w:pPr>
+              <w:keepNext w:val="0"/>
+              <w:spacing w:after="0"/>
+            </w:pPr>
+            <w:r>
+              <w:rPr>
+                <w:b w:val="0"/>
+                <w:sz w:val="19"/>
+              </w:rPr>
+              <w:t>30.00%</w:t>
+            </w:r>
+          </w:p>
+        </w:tc>
+        <w:tc>
+          <w:tcPr>
+            <w:tcW w:type="dxa" w:w="1872"/>
+            <w:tcBorders>
+              <w:top w:val="single" w:sz="4" w:color="D9D9D9"/>
+              <w:left w:val="single" w:sz="4" w:color="D9D9D9"/>
+              <w:bottom w:val="single" w:sz="4" w:color="D9D9D9"/>
+              <w:right w:val="single" w:sz="4" w:color="D9D9D9"/>
+            </w:tcBorders>
+            <w:tcMar>
+              <w:top w:w="65" w:type="dxa"/>
+              <w:left w:w="65" w:type="dxa"/>
+              <w:bottom w:w="65" w:type="dxa"/>
+              <w:right w:w="65" w:type="dxa"/>
+            </w:tcMar>
+          </w:tcPr>
+          <w:p>
+            <w:pPr>
+              <w:keepNext w:val="0"/>
+              <w:spacing w:after="0"/>
+            </w:pPr>
+            <w:r>
+              <w:rPr>
+                <w:b w:val="0"/>
+                <w:sz w:val="19"/>
+              </w:rPr>
+              <w:t>27.82%</w:t>
+            </w:r>
+          </w:p>
+        </w:tc>
+      </w:tr>
+    </w:tbl>
+    <w:p>
+      <w:r>
+        <w:t>Melbourne three-bedroom apartments rank first in all 20 further forest splits. The top-three set appears in 19. Yarra Ranges has fewer listings and hosts, giving a smaller evidence base. The forest improves overall prediction while keeping the principal candidates unchanged. Improvement within segments remains untested. These scores describe historical review attainment among existing listings; they are not new-operator success probabilities.</w:t>
       </w:r>
     </w:p>
     <w:p>
@@ -681,7 +1204,7 @@
     </w:p>
     <w:p>
       <w:r>
-        <w:t>For the final report, we will select models within training data and recalculate ranking intervals while refitting models. We will also test wider dwelling definitions and different minimum sample sizes. We will assess success through lower probability error, calibration and candidate stability. If model gains disappear, we will use segment rates as the main screening evidence. If rankings change substantially, we will present several candidates and explain the uncertainty. The README and outputs will record these decisions.</w:t>
+        <w:t>For the final report, model selection will use inner training folds. Outer folds will evaluate the full selection process. We will refit models when estimating ranking uncertainty and test wider dwelling definitions and minimum sample sizes. Success requires lower Brier than segment rates, no deterioration in calibration, and recurring candidates across splits and scope checks. We will report paired Brier differences, calibration-bin rates and top-three recurrence. If gains disappear, segment rates become the main screening evidence. Unstable rankings will lead to several candidates with explicit uncertainty. The README and outputs will record these decisions.</w:t>
       </w:r>
     </w:p>
     <w:p>

</xml_diff>

<commit_message>
Clarify screening evidence, sensitivity checks and AI acknowledgement
</commit_message>
<xml_diff>
--- a/reports/Interim_Project_Report.docx
+++ b/reports/Interim_Project_Report.docx
@@ -29,7 +29,7 @@
       <w:r>
         <w:t xml:space="preserve">Repository: </w:t>
       </w:r>
-      <w:hyperlink r:id="rId9">
+      <w:hyperlink r:id="rId16">
         <w:r>
           <w:t>CMCE30005-TheNextChapter</w:t>
         </w:r>
@@ -73,7 +73,7 @@
     </w:p>
     <w:p>
       <w:r>
-        <w:t>We study standard entire homes with one to three bedrooms. Each segment needs at least 50 eligible analysis listings. We define established listings by a first review at least 365 days before the scrape date. This condition provides review history but cannot confirm continuous operation. Rental units and condos form the apartment group. Homes and townhouses form the house group. We retain quoted prices of AUD30–1,500. These rules define our comparison sample; they do not confirm lease availability.</w:t>
+        <w:t>We study standard entire homes with one to three bedrooms. Rental units and condos form the apartment group; homes and townhouses form the house group. These broad residential groups match the client's search and reduce fragmented categories, although properties still differ within them. At least 50 eligible listings provides minimum comparison support. This is an analytical choice, so we also report independent host counts. A first review at least 365 days earlier limits short review histories without proving continuous operation. Quoted prices of AUD30–1,500 define an exploratory sample boundary. Sensitivity checks assess these restrictions; none establishes lease availability.</w:t>
       </w:r>
     </w:p>
     <w:p>
@@ -101,7 +101,7 @@
     </w:p>
     <w:p>
       <w:r>
-        <w:t>Cleaning converts price text into numbers, standardises missing values and extracts bathroom and amenity information. Price is missing for 6,553 listings and bedrooms for 4,679. We rebuild annual review counts from review dates. The supplied recent-review field covers 366 calendar dates. Using a strict 365-day window changes one analysis target. GitHub contains the detailed checks and sample-filtering table.</w:t>
+        <w:t>Cleaning converts price text into numbers, standardises missing values and extracts bathroom and amenity information. Price is missing for 6,553 listings and bedrooms for 4,679. We rebuild review counts over the preceding 365 days. GitHub records date-window checks and the sample-filtering table.</w:t>
       </w:r>
     </w:p>
     <w:p>
@@ -111,7 +111,7 @@
     </w:p>
     <w:p>
       <w:r>
-        <w:t>Segment attainment ranges from 8.25% to 36.60%. This variation supports comparing property segments. However, our supported sample covers only six LGAs. About 64% of listings are in Melbourne LGA. Missing prices and the history rule affect which listings enter the sample. Exited listings are absent. These limits reduce the relevance of results to other areas and new operators.</w:t>
+        <w:t>Segment attainment ranges from 8.25% to 36.60%, supporting segment comparison. The sample covers six LGAs, with about 64% in Melbourne LGA. Holding the 30-review target fixed, removing the history rule gives 6,675 listings and 17.51% attainment. Removing the price restriction gives 5,720 listings and 18.29%. Both differ substantially from the primary 25.33%. Eligibility changes the population and its measured performance. These checks support limiting the shortlist to the stated sample; they have not established ranking stability under wider rules. Exited listings are absent.</w:t>
       </w:r>
     </w:p>
     <w:p>
@@ -129,7 +129,7 @@
     </w:p>
     <w:p>
       <w:r>
-        <w:t>Logistic regression provides a simple reference model. Random forest and histogram gradient boosting can capture nonlinear relationships. Basic features include location, configuration, capacity, bathrooms and amenity counts. Six model extensions add coordinates, beds and nine facilities. We exclude review-based predictors, ratings and host badges. Current price and minimum stay enter separate operating-condition models. Their timing limits interpretation as pre-opening information.</w:t>
+        <w:t>Logistic regression provides a simple reference model. Forest and boosting models capture nonlinear relationships. Basic features include location, configuration, capacity, bathrooms and amenity counts. Six extensions add coordinates, beds and nine facilities. We exclude review-based predictors, ratings and host badges. Separate operating-condition models include current price and minimum stay, whose timing limits pre-opening interpretation.</w:t>
       </w:r>
     </w:p>
     <w:p>
@@ -153,7 +153,7 @@
     </w:p>
     <w:p>
       <w:r>
-        <w:t>The original ROI and quarterly prediction design exceeded the available data. We revised the scope to historical review activity using the single school snapshot. Weak basic-model results prompted comparison with training-host segment rates. Cleaning, review reconstruction, descriptive analysis and grouped validation are complete. Table 1 compares predictions on the same sample and folds.</w:t>
+        <w:t>We replaced the original ROI and quarterly design with historical review analysis from the school snapshot. Weak basic-model results prompted the segment baseline. Cleaning, review reconstruction, descriptive analysis and grouped validation are complete. Table 1 uses the same sample and folds.</w:t>
       </w:r>
     </w:p>
     <w:p>
@@ -671,7 +671,7 @@
     </w:tbl>
     <w:p>
       <w:r>
-        <w:t>The original logistic and forest models perform worse than segment rates on main-split AUC and Brier. The enhanced forest improves both measures in all five folds. We provisionally use it for probability scoring because it has the lowest Brier among property-only extensions. Boosting has a slightly higher AUC of 0.647. Across 20 further splits, forest AUC averages 0.626 and ranges from 0.589 to 0.648. It exceeds the segment baseline each time. Its overall predictive ability remains moderate.</w:t>
+        <w:t>Basic logistic and forest models underperform segment rates. The enhanced forest raises AUC by 0.059 and reduces Brier by 0.0055, a 2.9% reduction in probability error. Both improve in all five folds. We provisionally select it for the lowest property-only Brier; boosting has higher AUC at 0.647. Across 20 further host splits, forest AUC averages 0.626 (range 0.589–0.648), exceeding the segment baseline each time. The consistent, moderate gain supports further validation.</w:t>
       </w:r>
     </w:p>
     <w:p>
@@ -1194,17 +1194,17 @@
     </w:tbl>
     <w:p>
       <w:r>
-        <w:t>Melbourne three-bedroom apartments rank first in all 20 further forest splits. The top-three set appears in 19. Yarra Ranges has fewer listings and hosts, giving a smaller evidence base. The forest improves overall prediction while keeping the principal candidates unchanged. Improvement within segments remains untested. These scores describe historical review attainment among existing listings; they are not new-operator success probabilities.</w:t>
+        <w:t>Melbourne three-bedroom apartments rank first in all 20 further forest splits. The top-three set appears in 19. Yarra Ranges has a smaller evidence base. Split checks support the initial candidates, while wider-rule ranking sensitivity remains pending. Scores describe historical attainment among existing listings. Improvement within individual segments and future new-operator outcomes remain untested.</w:t>
       </w:r>
     </w:p>
     <w:p>
       <w:r>
-        <w:t>The client can start property searches in these three segments and request lease quotations. Before signing, they must check permission, availability and actual costs. Our results cannot estimate address-level profit or ROI.</w:t>
+        <w:t>Segment rates provide a transparent starting shortlist. The forest adds property-level scores based on recorded attributes and improves overall prediction, with no change to the main candidates. We have not measured better investigation decisions or financial returns. The client can prioritise searches and lease enquiries in these segments, then check permissions, availability and actual costs before signing.</w:t>
       </w:r>
     </w:p>
     <w:p>
       <w:r>
-        <w:t>For the final report, model selection will use inner training folds. Outer folds will evaluate the full selection process. We will refit models when estimating ranking uncertainty and test wider dwelling definitions and minimum sample sizes. Success requires lower Brier than segment rates, no deterioration in calibration, and recurring candidates across splits and scope checks. We will report paired Brier differences, calibration-bin rates and top-three recurrence. If gains disappear, segment rates become the main screening evidence. Unstable rankings will lead to several candidates with explicit uncertainty. The README and outputs will record these decisions.</w:t>
+        <w:t>Next, inner training folds will select models and outer folds will evaluate that process. Refitted uncertainty estimates and wider dwelling/support rules will test the shortlist. We will report paired Brier differences, calibration-bin rates and candidate recurrence. Confirmed gains require lower Brier without worse calibration. Stable candidates across scope checks support stronger search priorities. If gains disappear, segment rates lead the screening. Unstable rankings produce a broader candidate list. These tasks remain planned; repeated splits have already tested one source of uncertainty.</w:t>
       </w:r>
     </w:p>
     <w:p>
@@ -1213,6 +1213,11 @@
       </w:pPr>
       <w:r>
         <w:t>References</w:t>
+      </w:r>
+    </w:p>
+    <w:p>
+      <w:r>
+        <w:t>AI assistance is acknowledged in the accompanying AI Use Declaration, also available in the repository.</w:t>
       </w:r>
     </w:p>
     <w:p>

</xml_diff>

<commit_message>
Integrate concise AI acknowledgement into the report
</commit_message>
<xml_diff>
--- a/reports/Interim_Project_Report.docx
+++ b/reports/Interim_Project_Report.docx
@@ -38,6 +38,7 @@
     <w:p>
       <w:pPr>
         <w:pStyle w:val="Heading1"/>
+        <w:pageBreakBefore w:val="0"/>
       </w:pPr>
       <w:r>
         <w:t>Introduction</w:t>
@@ -61,6 +62,7 @@
     <w:p>
       <w:pPr>
         <w:pStyle w:val="Heading1"/>
+        <w:pageBreakBefore w:val="0"/>
       </w:pPr>
       <w:r>
         <w:t>Problem Definition and Objectives</w:t>
@@ -89,6 +91,7 @@
     <w:p>
       <w:pPr>
         <w:pStyle w:val="Heading1"/>
+        <w:pageBreakBefore w:val="0"/>
       </w:pPr>
       <w:r>
         <w:t>Data Description</w:t>
@@ -117,6 +120,7 @@
     <w:p>
       <w:pPr>
         <w:pStyle w:val="Heading1"/>
+        <w:pageBreakBefore w:val="0"/>
       </w:pPr>
       <w:r>
         <w:t>Methodology and Analytical Approach</w:t>
@@ -145,7 +149,7 @@
     <w:p>
       <w:pPr>
         <w:pStyle w:val="Heading1"/>
-        <w:pageBreakBefore/>
+        <w:pageBreakBefore w:val="0"/>
       </w:pPr>
       <w:r>
         <w:t>Analysis Plan and Progress to Date</w:t>
@@ -157,6 +161,9 @@
       </w:r>
     </w:p>
     <w:p>
+      <w:pPr>
+        <w:keepNext/>
+      </w:pPr>
       <w:r>
         <w:t>Table 1. Predictive performance</w:t>
       </w:r>
@@ -675,11 +682,17 @@
       </w:r>
     </w:p>
     <w:p>
+      <w:pPr>
+        <w:keepNext/>
+      </w:pPr>
       <w:r>
         <w:t>Table 2 answers the RQ using the enhanced forest's mean predictions. Each prediction comes from a model trained without that listing's host. All property-only models identify the same main top-three set as the segment baseline.</w:t>
       </w:r>
     </w:p>
     <w:p>
+      <w:pPr>
+        <w:keepNext/>
+      </w:pPr>
       <w:r>
         <w:t>Table 2. Initial search candidates</w:t>
       </w:r>
@@ -1210,14 +1223,10 @@
     <w:p>
       <w:pPr>
         <w:pStyle w:val="Heading1"/>
+        <w:pageBreakBefore w:val="0"/>
       </w:pPr>
       <w:r>
         <w:t>References</w:t>
-      </w:r>
-    </w:p>
-    <w:p>
-      <w:r>
-        <w:t>AI assistance is acknowledged in the accompanying AI Use Declaration, also available in the repository.</w:t>
       </w:r>
     </w:p>
     <w:p>
@@ -1242,6 +1251,30 @@
           <w:t>Calibration guidance</w:t>
         </w:r>
       </w:hyperlink>
+    </w:p>
+    <w:p>
+      <w:r>
+        <w:t>OpenAI. (2026). ChatGPT/Codex assistance with project planning, report drafting and code review [Generative AI outputs, September 2026].</w:t>
+      </w:r>
+    </w:p>
+    <w:p>
+      <w:r>
+        <w:t>Anthropic. (2026). Claude Code assistance with analysis-code development [Generative AI outputs, September 2026].</w:t>
+      </w:r>
+    </w:p>
+    <w:p>
+      <w:pPr>
+        <w:pStyle w:val="Heading1"/>
+        <w:pageBreakBefore w:val="0"/>
+      </w:pPr>
+      <w:r>
+        <w:t>AI Use Acknowledgement</w:t>
+      </w:r>
+    </w:p>
+    <w:p>
+      <w:r>
+        <w:t>We used OpenAI ChatGPT/Codex and Anthropic Claude Code to support project planning, analysis-code development, interpretation of results, report drafting and English editing. This included refining the research question and reviewing the validation approach. AI-assisted text and code are included in the project. The group is responsible for the accuracy and content of the final submission.</w:t>
+      </w:r>
     </w:p>
     <w:sectPr>
       <w:footerReference w:type="default" r:id="rId13"/>

</xml_diff>

<commit_message>
Rebuild Word and PDF submission files with table styles defined
The reference styles lacked the table style the Word file referenced, so
tables could render as plain paragraphs. The Word file is regenerated with
that style defined and the PDF is exported directly from it.
</commit_message>
<xml_diff>
--- a/reports/Interim_Project_Report.docx
+++ b/reports/Interim_Project_Report.docx
@@ -13438,6 +13438,74 @@
         <w:shd w:color="auto" w:fill="FBCAA2" w:themeFill="accent6" w:themeFillTint="7F" w:val="clear"/>
       </w:tcPr>
     </w:tblStylePr>
+  </w:style>
+  <w:style w:default="1" w:styleId="Table" w:type="table">
+    <w:name w:val="Table"/>
+    <w:basedOn w:val="TableNormal"/>
+    <w:semiHidden/>
+    <w:unhideWhenUsed/>
+    <w:qFormat/>
+    <w:tblPr>
+      <w:tblInd w:type="dxa" w:w="0"/>
+      <w:tblCellMar>
+        <w:top w:type="dxa" w:w="0"/>
+        <w:left w:type="dxa" w:w="108"/>
+        <w:bottom w:type="dxa" w:w="0"/>
+        <w:right w:type="dxa" w:w="108"/>
+      </w:tblCellMar>
+    </w:tblPr>
+    <w:tblStylePr w:type="firstRow">
+      <w:tcPr>
+        <w:tcBorders>
+          <w:bottom w:val="single"/>
+        </w:tcBorders>
+        <w:vAlign w:val="bottom"/>
+      </w:tcPr>
+    </w:tblStylePr>
+  </w:style>
+  <w:style w:customStyle="1" w:styleId="TableCaption" w:type="paragraph">
+    <w:name w:val="Table Caption"/>
+    <w:basedOn w:val="Caption"/>
+    <w:pPr>
+      <w:keepNext/>
+    </w:pPr>
+  </w:style>
+  <w:style w:customStyle="1" w:styleId="ImageCaption" w:type="paragraph">
+    <w:name w:val="Image Caption"/>
+    <w:basedOn w:val="Caption"/>
+  </w:style>
+  <w:style w:customStyle="1" w:styleId="Figure" w:type="paragraph">
+    <w:name w:val="Figure"/>
+    <w:basedOn w:val="Normal"/>
+  </w:style>
+  <w:style w:customStyle="1" w:styleId="CaptionedFigure" w:type="paragraph">
+    <w:name w:val="Captioned Figure"/>
+    <w:basedOn w:val="Figure"/>
+    <w:pPr>
+      <w:keepNext/>
+    </w:pPr>
+  </w:style>
+  <w:style w:customStyle="1" w:styleId="FirstParagraph" w:type="paragraph">
+    <w:name w:val="First Paragraph"/>
+    <w:basedOn w:val="BodyText"/>
+    <w:next w:val="BodyText"/>
+    <w:qFormat/>
+  </w:style>
+  <w:style w:customStyle="1" w:styleId="Compact" w:type="paragraph">
+    <w:name w:val="Compact"/>
+    <w:basedOn w:val="BodyText"/>
+    <w:qFormat/>
+    <w:pPr>
+      <w:spacing w:after="36" w:before="36"/>
+    </w:pPr>
+  </w:style>
+  <w:style w:customStyle="1" w:styleId="VerbatimChar" w:type="character">
+    <w:name w:val="Verbatim Char"/>
+    <w:basedOn w:val="BodyTextChar"/>
+    <w:rPr>
+      <w:rFonts w:ascii="Consolas" w:hAnsi="Consolas"/>
+      <w:sz w:val="22"/>
+    </w:rPr>
   </w:style>
   <w:style w:type="paragraph" w:customStyle="1" w:styleId="SourceCode">
     <w:name w:val="Source Code"/>

</xml_diff>

<commit_message>
Align research questions with the model test and tighten hypothesis wording
- Split the research question: segment-level review activity and
  listing-level prediction beyond segment averages
- State that missing-value treatment and category encoding are learned from
  training data only; describe average precision as precision across
  thresholds
- H1 supported by descriptive evidence; H2 by exploratory host-grouped
  validation; restore the decision rule if model gains do not persist or
  rankings change under wider dwelling definitions
- Introduction states how the shortlist is used; Table 3 names
  houses/townhouses and 3BR is defined at first use
- Support-rule sensitivity table now reports unique hosts for every variant,
  with listing totals checked against the script 08 ladders
- 1,338-word body (1,478 with title, references and acknowledgement);
  Word and PDF rebuilt
</commit_message>
<xml_diff>
--- a/reports/Interim_Project_Report.docx
+++ b/reports/Interim_Project_Report.docx
@@ -74,7 +74,7 @@
         <w:t xml:space="preserve">“rental arbitrage”</w:t>
       </w:r>
       <w:r>
-        <w:t xml:space="preserve">), which needs lease and council permission. With limited start-up funds, the client must choose which Melbourne areas and property types to investigate before signing leases and buying furniture; a poor choice ties up money and delays the business.</w:t>
+        <w:t xml:space="preserve">), which needs lease and council permission. With limited start-up funds, the client must choose which Melbourne areas and property types to investigate before signing leases; a poor choice ties up money and delays the business.</w:t>
       </w:r>
     </w:p>
     <w:p>
@@ -90,7 +90,7 @@
         <w:pStyle w:val="BodyText"/>
       </w:pPr>
       <w:r>
-        <w:t xml:space="preserve">Our output is a shortlist of segments for further investigation, based on past review activity, plus a test of whether a model improves on segment averages.</w:t>
+        <w:t xml:space="preserve">The shortlist helps the client decide where to spend limited search and due-diligence time before requesting lease quotations.</w:t>
       </w:r>
     </w:p>
     <w:bookmarkEnd w:id="23"/>
@@ -108,7 +108,7 @@
         <w:pStyle w:val="FirstParagraph"/>
       </w:pPr>
       <w:r>
-        <w:t xml:space="preserve">Research question: Which types of Melbourne property — defined by council area (LGA), apartment or house, and number of bedrooms — most often reach a high level of guest-review activity, and does a statistical model add anything to simple segment averages when ranking them?</w:t>
+        <w:t xml:space="preserve">Research questions: (1) Which Melbourne property segments — defined by council area (LGA), apartment or house, and number of bedrooms — show the strongest historical guest-review activity? (2) Can listing attributes improve prediction of high review activity beyond segment averages?</w:t>
       </w:r>
       <w:r>
         <w:t xml:space="preserve"> </w:t>
@@ -136,7 +136,7 @@
         <w:pStyle w:val="BodyText"/>
       </w:pPr>
       <w:r>
-        <w:t xml:space="preserve">Objectives: (1) a segment comparison table; (2) a model-versus-average test; (3) a shortlist with uncertainty ranges.</w:t>
+        <w:t xml:space="preserve">Objectives: a segment comparison table, a model-versus-average test and a shortlist with uncertainty ranges.</w:t>
       </w:r>
     </w:p>
     <w:p>
@@ -144,7 +144,7 @@
         <w:pStyle w:val="BodyText"/>
       </w:pPr>
       <w:r>
-        <w:t xml:space="preserve">We study entire homes with one to three bedrooms, what a small operator can furnish and let whole; rental units and condos form the apartment group, homes and townhouses the house group. Each segment needs at least 50 listings as minimum comparison support (host counts and resampled ranges are reported); quoted prices of AUD 30–1,500 are an exploratory boundary; and a first review at least 365 days before collection gives at least one year of observable review history, not proof of continuous operation.</w:t>
+        <w:t xml:space="preserve">We study entire homes with one to three bedrooms (1–3BR), what a small operator can furnish and let whole; rental units and condos form the apartment group, homes and townhouses the house group. Each segment needs at least 50 listings as minimum comparison support (host counts and resampled ranges are reported); quoted prices of AUD 30–1,500 are an exploratory boundary; and a first review at least 365 days before collection gives at least one year of observable review history, not proof of continuous operation.</w:t>
       </w:r>
     </w:p>
     <w:p>
@@ -179,7 +179,7 @@
         <w:pStyle w:val="FirstParagraph"/>
       </w:pPr>
       <w:r>
-        <w:t xml:space="preserve">The dataset contains 25,728 listings, 9,390,720 calendar records and 1,026,690 reviews, collected between 17 June and 1 July 2026. We use LGA, property type, bedrooms, capacity, bathrooms, amenities and review dates. Its modelled occupancy and revenue fields are built from price, minimum stay and review counts, so ranking on them would only reproduce that construction; we rank on review counts directly.</w:t>
+        <w:t xml:space="preserve">The dataset contains 25,728 listings and 1,026,690 reviews, collected between 17 June and 1 July 2026. Its modelled occupancy and revenue fields are built from price, minimum stay and review counts, so ranking on them would only reproduce that construction; we rank on review counts directly.</w:t>
       </w:r>
     </w:p>
     <w:p>
@@ -409,7 +409,7 @@
         <w:pStyle w:val="BodyText"/>
       </w:pPr>
       <w:r>
-        <w:t xml:space="preserve">The reference group’s 75th percentile is 29.75 reviews, giving a threshold of 30. The analysis sample (3,873 listings from 1,726 hosts) has 14 segments across six LGAs, about 64% in Melbourne LGA, and keeps 334 listings with zero annual reviews. Overall, 981 listings (25.33%) reach the threshold, and attainment ranges from 8.25% to 36.60% across segments (Figure 1).</w:t>
+        <w:t xml:space="preserve">The reference group’s 75th percentile is 29.75 reviews, giving a threshold of 30. The analysis sample (3,873 listings from 1,726 hosts) has 14 segments across six LGAs and keeps 334 listings with zero annual reviews. Overall, 981 listings (25.33%) reach the threshold, and attainment ranges from 8.25% to 36.60% across segments (Figure 1).</w:t>
       </w:r>
     </w:p>
     <w:p>
@@ -490,7 +490,7 @@
         <w:pStyle w:val="FirstParagraph"/>
       </w:pPr>
       <w:r>
-        <w:t xml:space="preserve">A fixed rule on host identifiers sets aside about 20% of hosts as the reference group that defines the 30-review target; they are excluded from all training and testing. We use five-fold validation, each part tested in turn on a model trained on the other four, with each host’s properties kept in one fold so a host with many near-identical apartments cannot sit in both training and test data (scikit-learn developers, n.d.).</w:t>
+        <w:t xml:space="preserve">A fixed rule on host identifiers sets aside about 20% of hosts as the reference group that defines the 30-review target; they are excluded from all training and testing. We use five-fold validation, each part tested in turn on a model trained on the other four, with each host’s properties kept in one fold so a host with many near-identical apartments cannot sit in both training and test data (scikit-learn developers, n.d.). Missing-value treatment and category encoding are learned from training data only.</w:t>
       </w:r>
     </w:p>
     <w:p>
@@ -506,7 +506,7 @@
         <w:pStyle w:val="BodyText"/>
       </w:pPr>
       <w:r>
-        <w:t xml:space="preserve">Every model is compared with a segment-average baseline: each listing gets its segment’s attainment among training hosts. AUC is how well the model orders listings that reach the target above those that do not; 0.5 is a coin toss. Average precision is how many of its top picks really reach the target. Brier score is how far its percentages are from what happened; lower is better. R handles cleaning and tables; Python (scikit-learn 1.7.2) runs the models.</w:t>
+        <w:t xml:space="preserve">Every model is compared with a segment-average baseline: each listing gets its segment’s attainment among training hosts. AUC is how well the model orders listings that reach the target above those that do not; 0.5 is a coin toss. Average precision summarises precision across prediction thresholds. Brier score is how far its percentages are from what happened; lower is better. R handles cleaning and tables; Python (scikit-learn 1.7.2) runs the models.</w:t>
       </w:r>
     </w:p>
     <w:p>
@@ -532,7 +532,7 @@
         <w:pStyle w:val="FirstParagraph"/>
       </w:pPr>
       <w:r>
-        <w:t xml:space="preserve">Following Week 5 feedback, we dropped the earlier rent-versus-revenue (ROI) design, which needed external rental data, and now compare only within the snapshot. Cleaning, review reconstruction, descriptive analysis and validation are complete (Table 2, same folds).</w:t>
+        <w:t xml:space="preserve">Following Week 5 feedback, we dropped the earlier rent-versus-revenue (ROI) design, which needed external rental data, and now compare only within the snapshot. Cleaning, review reconstruction, descriptive analysis and validation are complete.</w:t>
       </w:r>
     </w:p>
     <w:p>
@@ -540,7 +540,7 @@
         <w:pStyle w:val="BodyText"/>
       </w:pPr>
       <w:r>
-        <w:t xml:space="preserve">Table 2. Predictive performance</w:t>
+        <w:t xml:space="preserve">Table 2. Predictive performance (same sample and folds)</w:t>
       </w:r>
     </w:p>
     <w:tbl>
@@ -955,7 +955,7 @@
               <w:pStyle w:val="Compact"/>
             </w:pPr>
             <w:r>
-              <w:t xml:space="preserve">Yarra Ranges 3BR houses</w:t>
+              <w:t xml:space="preserve">Yarra Ranges 3BR houses/townhouses</w:t>
             </w:r>
           </w:p>
         </w:tc>
@@ -1010,7 +1010,7 @@
         <w:pStyle w:val="BodyText"/>
       </w:pPr>
       <w:r>
-        <w:t xml:space="preserve">The ranges resample hosts with predictions held fixed, exclude model refitting, selection and threshold uncertainty, and are much narrower than Figure 1’s observed-rate ranges. H1 holds at the extremes (8.25% against 36.60%) but neighbouring segments overlap; H2 holds on ranking metrics, not on the shortlist, since the model changes no candidate — the segment comparison carries the decision and the model adds a supplementary historical score. The same three candidates lead in 19 of 20 host splits, under support rules of 30, 50 and 75 listings, and without the history or price rule; only their order changes.</w:t>
+        <w:t xml:space="preserve">The ranges resample hosts with predictions held fixed, exclude model refitting, selection and threshold uncertainty, and are much narrower than Figure 1’s observed-rate ranges. Descriptive evidence supports H1: segments differ (8.25% to 36.60%), though neighbouring segments overlap. H2 is supported by exploratory host-grouped validation on ranking metrics but not on the shortlist: the model changes no candidate, so segment comparison carries the decision and the model adds a supplementary historical score. The same three candidates lead in 19 of 20 host splits, under support rules of 30, 50 and 75 listings, and without the history or price rule; only their order changes.</w:t>
       </w:r>
     </w:p>
     <w:p>
@@ -1018,7 +1018,7 @@
         <w:pStyle w:val="BodyText"/>
       </w:pPr>
       <w:r>
-        <w:t xml:space="preserve">An out-of-time check on 2,657 listings (1,208 hosts, 10 segments, two years of reviews) uses two non-overlapping 365-day windows and a 34-review target set from the reference hosts’ earlier window. The earlier year’s top three segments reached it in 27.1% of listings the following year against 14.9% elsewhere, a 12.3-point lead (host-resampled 95% range 5.1–20.1), though the exact top-three set recurred in only 51.5% of resamples: a persisting historical advantage for the candidate set, not a new operator’s profit.</w:t>
+        <w:t xml:space="preserve">An out-of-time check (2,657 listings, 1,208 hosts, 10 segments, two years of reviews) uses two non-overlapping 365-day windows and a 34-review target set from the reference hosts’ earlier window. The earlier year’s top three segments reached it in 27.1% of listings the following year against 14.9% elsewhere, a 12.3-point lead (host-resampled 95% range 5.1–20.1); the exact top-three set recurred in 51.5% of resamples. This is a persisting historical advantage, not a new operator’s profit.</w:t>
       </w:r>
     </w:p>
     <w:p>
@@ -1026,7 +1026,7 @@
         <w:pStyle w:val="BodyText"/>
       </w:pPr>
       <w:r>
-        <w:t xml:space="preserve">The client can use the segment averages as a first screen, prioritise lease enquiries there, and verify permissions, rent, costs and availability before signing.</w:t>
+        <w:t xml:space="preserve">Before signing, the client must still verify permissions, rent, costs and availability.</w:t>
       </w:r>
     </w:p>
     <w:p>
@@ -1083,6 +1083,14 @@
       </w:pPr>
       <w:r>
         <w:t xml:space="preserve">Final report and presentation — all, Qihang Sun coordinating, Weeks 11–12.</w:t>
+      </w:r>
+    </w:p>
+    <w:p>
+      <w:pPr>
+        <w:pStyle w:val="FirstParagraph"/>
+      </w:pPr>
+      <w:r>
+        <w:t xml:space="preserve">If model gains do not persist, segment rates remain the main screening tool; if rankings change under wider dwelling definitions, we will present a broader candidate set.</w:t>
       </w:r>
     </w:p>
     <w:bookmarkEnd w:id="30"/>

</xml_diff>

<commit_message>
Add nested host-grouped model selection and report its result
- scripts/13_nested_selection.py repeats the candidate selection inside each
  outer training fold (three inner host-grouped folds, lowest inner Brier),
  refits the chosen model on the outer training fold and scores the outer
  test fold; the segment-rate baseline reproduces script 11's out-of-fold
  probabilities exactly
- The forest is chosen in all five outer folds, so the reported gain is
  unchanged: AUC +0.059 (host-resampled 95% range +0.02 to +0.10), Brier
  -0.0055 (-0.010 to -0.001), better in every fold; five equal-count
  probability bins sit within two points of observed rates
- Report: H2 now supported by nested validation; descriptive support-rule
  stability and model split stability stated separately; remaining work
  re-planned around wider-rule refits; 1,352-word body (1,492 in full)
- Directory guide and reproduction block list the new script and tables
</commit_message>
<xml_diff>
--- a/reports/Interim_Project_Report.docx
+++ b/reports/Interim_Project_Report.docx
@@ -82,7 +82,7 @@
         <w:pStyle w:val="BodyText"/>
       </w:pPr>
       <w:r>
-        <w:t xml:space="preserve">We use the Inside Airbnb Melbourne snapshot of June 2026 supplied through the subject’s LMS (Inside Airbnb, 2026): property details, locations and dated guest reviews. Because a review can only follow a completed stay, dated reviews are a countable record of past guest activity; the calendar cannot separate bookings from host-blocked dates.</w:t>
+        <w:t xml:space="preserve">We use the Inside Airbnb Melbourne snapshot of June 2026 supplied through the subject’s LMS (Inside Airbnb, 2026): property details, locations and dated guest reviews. Dated reviews are a countable record of past guest activity; the calendar cannot separate bookings from host-blocked dates.</w:t>
       </w:r>
     </w:p>
     <w:p>
@@ -144,7 +144,7 @@
         <w:pStyle w:val="BodyText"/>
       </w:pPr>
       <w:r>
-        <w:t xml:space="preserve">We study entire homes with one to three bedrooms (1–3BR), what a small operator can furnish and let whole; rental units and condos form the apartment group, homes and townhouses the house group. Each segment needs at least 50 listings as minimum comparison support (host counts and resampled ranges are reported); quoted prices of AUD 30–1,500 are an exploratory boundary; and a first review at least 365 days before collection gives at least one year of observable review history, not proof of continuous operation.</w:t>
+        <w:t xml:space="preserve">We study entire homes with one to three bedrooms (1–3BR), what a small operator can furnish and let whole; rental units and condos form the apartment group, homes and townhouses the house group. Each segment needs at least 50 listings as minimum comparison support; quoted prices of AUD 30–1,500 are an exploratory boundary; and a first review at least 365 days before collection gives at least one year of observable review history, not proof of continuous operation.</w:t>
       </w:r>
     </w:p>
     <w:p>
@@ -161,7 +161,7 @@
         <w:t xml:space="preserve">“attainment”</w:t>
       </w:r>
       <w:r>
-        <w:t xml:space="preserve">; 30 reviews means at least 30 reviewed stays, roughly one every 12 days. Attainment measures review activity, not bookings, occupancy or profit.</w:t>
+        <w:t xml:space="preserve">; 30 reviews means at least 30 reviewed stays. Attainment measures review activity, not bookings, occupancy or profit.</w:t>
       </w:r>
     </w:p>
     <w:bookmarkEnd w:id="24"/>
@@ -409,7 +409,7 @@
         <w:pStyle w:val="BodyText"/>
       </w:pPr>
       <w:r>
-        <w:t xml:space="preserve">The reference group’s 75th percentile is 29.75 reviews, giving a threshold of 30. The analysis sample (3,873 listings from 1,726 hosts) has 14 segments across six LGAs and keeps 334 listings with zero annual reviews. Overall, 981 listings (25.33%) reach the threshold, and attainment ranges from 8.25% to 36.60% across segments (Figure 1).</w:t>
+        <w:t xml:space="preserve">The reference group’s 75th percentile is 29.75 reviews, giving a threshold of 30. The analysis sample (3,873 listings from 1,726 hosts) has 14 segments across six LGAs, about 64% in Melbourne LGA, and keeps 334 listings with zero annual reviews. Overall, 981 listings (25.33%) reach the threshold, and attainment ranges from 8.25% to 36.60% across segments (Figure 1).</w:t>
       </w:r>
     </w:p>
     <w:p>
@@ -472,7 +472,7 @@
         <w:pStyle w:val="BodyText"/>
       </w:pPr>
       <w:r>
-        <w:t xml:space="preserve">Of the 6,801 listings with no usable price (missing or outside AUD 30–1,500), 82% had no review in the past year, so the priced sample is the more active part of the market. Listings that left Airbnb before collection are absent, which limits generalisation to new entrants.</w:t>
+        <w:t xml:space="preserve">Of the 6,801 listings with no usable price (missing or outside AUD 30–1,500), 82% had no review in the past year: the priced sample is the more active part of the market. Listings that left Airbnb before collection are absent, which limits generalisation to new entrants.</w:t>
       </w:r>
     </w:p>
     <w:bookmarkEnd w:id="28"/>
@@ -514,7 +514,7 @@
         <w:pStyle w:val="BodyText"/>
       </w:pPr>
       <w:r>
-        <w:t xml:space="preserve">No untouched hold-out set exists (model choice used the same folds; item (1) below re-tests it), and property details may have changed during the outcome year.</w:t>
+        <w:t xml:space="preserve">Because candidates were compared after seeing fold results, the selection is repeated inside each outer training fold (nested, host-grouped), so outer folds never influence the choice; property details may also have changed during the outcome year.</w:t>
       </w:r>
     </w:p>
     <w:bookmarkEnd w:id="29"/>
@@ -748,7 +748,7 @@
         <w:pStyle w:val="BodyText"/>
       </w:pPr>
       <w:r>
-        <w:t xml:space="preserve">The enhanced random forest raises AUC by 0.059 and lowers Brier by 0.0055, beating the segment average in all five folds; across 20 further host splits it wins on AUC every time (mean 0.626, range 0.589–0.648) and on Brier in 16. Adding current price and minimum stay lifts boosting to AUC 0.749 and Brier 0.162, but these are present-day settings, not pre-opening attributes, so they stay out of the shortlist.</w:t>
+        <w:t xml:space="preserve">The enhanced random forest beats the segment average in all five folds and, across 20 further host splits, on AUC every time and on Brier in 16. A nested check that re-selects the model inside each outer training fold chooses the forest every time and leaves the gain unchanged: AUC +0.059 (host-resampled 95% range +0.02 to +0.10), Brier −0.0055 (−0.010 to −0.001). Its predicted rates track observed rates within two points across five probability bins. Models using current price and minimum stay reach AUC 0.749 but rely on present-day settings, so they stay out of the shortlist.</w:t>
       </w:r>
     </w:p>
     <w:p>
@@ -1010,7 +1010,7 @@
         <w:pStyle w:val="BodyText"/>
       </w:pPr>
       <w:r>
-        <w:t xml:space="preserve">The ranges resample hosts with predictions held fixed, exclude model refitting, selection and threshold uncertainty, and are much narrower than Figure 1’s observed-rate ranges. Descriptive evidence supports H1: segments differ (8.25% to 36.60%), though neighbouring segments overlap. H2 is supported by exploratory host-grouped validation on ranking metrics but not on the shortlist: the model changes no candidate, so segment comparison carries the decision and the model adds a supplementary historical score. The same three candidates lead in 19 of 20 host splits, under support rules of 30, 50 and 75 listings, and without the history or price rule; only their order changes.</w:t>
+        <w:t xml:space="preserve">The ranges resample hosts with predictions held fixed, exclude model refitting, selection and threshold uncertainty, and are much narrower than Figure 1’s observed-rate ranges. Descriptive evidence supports H1: segments differ (8.25% to 36.60%), though neighbouring segments overlap. H2 is supported by nested host-grouped validation on ranking metrics but not on the shortlist: the model changes no candidate, so segment comparison carries the decision and the model adds a supplementary historical score. Descriptively, the same three segments lead under support rules of 30, 50 and 75 listings and without the history or price rule; the forest’s top three recur in 19 of 20 host splits.</w:t>
       </w:r>
     </w:p>
     <w:p>
@@ -1046,7 +1046,7 @@
         </w:numPr>
       </w:pPr>
       <w:r>
-        <w:t xml:space="preserve">Select the model within training data and re-test it — Eric Huang (modelling lead), Week 9 (25 Sep).</w:t>
+        <w:t xml:space="preserve">Refit the fixed forest and re-rank with uncertainty ranges under wider property-type and history rules — Eric Huang (modelling lead) and Maksym Xu (data lead), Weeks 9–10 (by 2 Oct).</w:t>
       </w:r>
     </w:p>
     <w:p>
@@ -1058,19 +1058,7 @@
         </w:numPr>
       </w:pPr>
       <w:r>
-        <w:t xml:space="preserve">Re-rank with uncertainty ranges under wider property-type rules — Maksym Xu (data lead), Week 10 (2 Oct).</w:t>
-      </w:r>
-    </w:p>
-    <w:p>
-      <w:pPr>
-        <w:pStyle w:val="Compact"/>
-        <w:numPr>
-          <w:ilvl w:val="0"/>
-          <w:numId w:val="1001"/>
-        </w:numPr>
-      </w:pPr>
-      <w:r>
-        <w:t xml:space="preserve">One-page client brief with search priorities and pre-lease checklist — Loc Le (report lead), Week 11 (by the 13 Oct presentation).</w:t>
+        <w:t xml:space="preserve">One-page client brief with search priorities and pre-lease checklist — Loc Le (report lead), Week 11 (by 13 Oct).</w:t>
       </w:r>
     </w:p>
     <w:p>

</xml_diff>

<commit_message>
State the business case for review activity and the model's within-segment value; add review-target sensitivity
- Problem definition explains why segments with more high-activity listings
  matter to an operator paying fixed rent
- The model's contribution is stated as within-segment discrimination
  (AUC 0.64 versus 0.58) for scoring a specific property, since it changes no
  candidate
- Script 12 now also re-ranks under review targets of 25, 30, 34 and 35
  (reference-group P70, P75, P80 and fixed values); the same three candidates
  lead throughout, with the top two swapping at 34 or more
- Price/minimum-stay model sentence dropped from the body (the figures remain
  in the comparison table); 1,350-word body, 1,490 in full
</commit_message>
<xml_diff>
--- a/reports/Interim_Project_Report.docx
+++ b/reports/Interim_Project_Report.docx
@@ -144,7 +144,7 @@
         <w:pStyle w:val="BodyText"/>
       </w:pPr>
       <w:r>
-        <w:t xml:space="preserve">We study entire homes with one to three bedrooms (1–3BR), what a small operator can furnish and let whole; rental units and condos form the apartment group, homes and townhouses the house group. Each segment needs at least 50 listings as minimum comparison support; quoted prices of AUD 30–1,500 are an exploratory boundary; and a first review at least 365 days before collection gives at least one year of observable review history, not proof of continuous operation.</w:t>
+        <w:t xml:space="preserve">We study entire homes with one to three bedrooms (1–3BR), what a small operator can furnish and let whole; rental units and condos are the apartment group, homes and townhouses the house group. Each segment needs at least 50 listings as minimum comparison support; quoted prices of AUD 30–1,500 are an exploratory boundary; and a first review at least 365 days before collection gives at least one year of observable review history, not proof of continuous operation.</w:t>
       </w:r>
     </w:p>
     <w:p>
@@ -152,7 +152,7 @@
         <w:pStyle w:val="BodyText"/>
       </w:pPr>
       <w:r>
-        <w:t xml:space="preserve">We call the share of listings reaching 30 reviews</w:t>
+        <w:t xml:space="preserve">We call the share of listings reaching 30 reviews (at least 30 reviewed stays)</w:t>
       </w:r>
       <w:r>
         <w:t xml:space="preserve"> </w:t>
@@ -161,7 +161,7 @@
         <w:t xml:space="preserve">“attainment”</w:t>
       </w:r>
       <w:r>
-        <w:t xml:space="preserve">; 30 reviews means at least 30 reviewed stays. Attainment measures review activity, not bookings, occupancy or profit.</w:t>
+        <w:t xml:space="preserve">. Attainment measures review activity, not bookings, occupancy or profit. For an operator paying fixed rent, the main risk is a property that attracts few stays; segments where more comparable listings reach high review activity show such demand is achievable.</w:t>
       </w:r>
     </w:p>
     <w:bookmarkEnd w:id="24"/>
@@ -179,7 +179,7 @@
         <w:pStyle w:val="FirstParagraph"/>
       </w:pPr>
       <w:r>
-        <w:t xml:space="preserve">The dataset contains 25,728 listings and 1,026,690 reviews, collected between 17 June and 1 July 2026. Its modelled occupancy and revenue fields are built from price, minimum stay and review counts, so ranking on them would only reproduce that construction; we rank on review counts directly.</w:t>
+        <w:t xml:space="preserve">The dataset contains 25,728 listings and 1,026,690 reviews, collected between 17 June and 1 July 2026. Its modelled occupancy and revenue fields are built from price, minimum stay and review counts, so ranking on them would reproduce that construction; we rank on review counts directly.</w:t>
       </w:r>
     </w:p>
     <w:p>
@@ -187,7 +187,7 @@
         <w:pStyle w:val="BodyText"/>
       </w:pPr>
       <w:r>
-        <w:t xml:space="preserve">Cleaning converts price text to numbers, standardises missing values and extracts bathroom and amenity counts; price is missing for 6,553 listings and bedrooms for 4,679. The supplied last-12-months review field spans 366 dates, so we rebuilt counts over exactly 365 days from review dates (Table 1).</w:t>
+        <w:t xml:space="preserve">Cleaning converts price text to numbers and extracts bathroom and amenity counts; price is missing for 6,553 listings and bedrooms for 4,679. The supplied last-12-months review field spans 366 dates, so we rebuilt counts over exactly 365 days from review dates (Table 1).</w:t>
       </w:r>
     </w:p>
     <w:p>
@@ -498,7 +498,7 @@
         <w:pStyle w:val="BodyText"/>
       </w:pPr>
       <w:r>
-        <w:t xml:space="preserve">Logistic regression is the simple reference; random forest and gradient boosting capture nonlinear patterns. Basic features are location, configuration, capacity, bathrooms and amenity count; an enhanced set adds coordinates, beds and nine amenities. We compare six variants of these models, with and without probability calibration and with and without current price and minimum stay. Review-based predictors, ratings and host badges are excluded.</w:t>
+        <w:t xml:space="preserve">Logistic regression is the simple reference; random forest and gradient boosting capture nonlinear patterns. Basic features are location, configuration, capacity, bathrooms and amenity count; an enhanced set adds coordinates, beds and nine amenities. We compare six variants, with and without probability calibration and with and without current price and minimum stay. Review-based predictors, ratings and host badges are excluded.</w:t>
       </w:r>
     </w:p>
     <w:p>
@@ -514,7 +514,7 @@
         <w:pStyle w:val="BodyText"/>
       </w:pPr>
       <w:r>
-        <w:t xml:space="preserve">Because candidates were compared after seeing fold results, the selection is repeated inside each outer training fold (nested, host-grouped), so outer folds never influence the choice; property details may also have changed during the outcome year.</w:t>
+        <w:t xml:space="preserve">Because candidates were compared after seeing fold results, selection is repeated inside each outer training fold (nested, host-grouped) so outer folds never influence it; property details may also have changed during the outcome year.</w:t>
       </w:r>
     </w:p>
     <w:bookmarkEnd w:id="29"/>
@@ -532,7 +532,7 @@
         <w:pStyle w:val="FirstParagraph"/>
       </w:pPr>
       <w:r>
-        <w:t xml:space="preserve">Following Week 5 feedback, we dropped the earlier rent-versus-revenue (ROI) design, which needed external rental data, and now compare only within the snapshot. Cleaning, review reconstruction, descriptive analysis and validation are complete.</w:t>
+        <w:t xml:space="preserve">Following Week 5 feedback, we dropped the earlier rent-versus-revenue (ROI) design, which needed external rental data, and now compare only within the snapshot.</w:t>
       </w:r>
     </w:p>
     <w:p>
@@ -540,7 +540,7 @@
         <w:pStyle w:val="BodyText"/>
       </w:pPr>
       <w:r>
-        <w:t xml:space="preserve">Table 2. Predictive performance (same sample and folds)</w:t>
+        <w:t xml:space="preserve">Table 2. Predictive performance</w:t>
       </w:r>
     </w:p>
     <w:tbl>
@@ -748,7 +748,7 @@
         <w:pStyle w:val="BodyText"/>
       </w:pPr>
       <w:r>
-        <w:t xml:space="preserve">The enhanced random forest beats the segment average in all five folds and, across 20 further host splits, on AUC every time and on Brier in 16. A nested check that re-selects the model inside each outer training fold chooses the forest every time and leaves the gain unchanged: AUC +0.059 (host-resampled 95% range +0.02 to +0.10), Brier −0.0055 (−0.010 to −0.001). Its predicted rates track observed rates within two points across five probability bins. Models using current price and minimum stay reach AUC 0.749 but rely on present-day settings, so they stay out of the shortlist.</w:t>
+        <w:t xml:space="preserve">The enhanced random forest beats the segment average in all five folds and, across 20 further host splits, on AUC every time and on Brier in 16. A nested check that re-selects the model inside each outer training fold chooses the forest every time: AUC +0.059 (host-resampled 95% range +0.02 to +0.10), Brier −0.0055 (−0.010 to −0.001). Predicted rates track observed rates within two points across five bins.</w:t>
       </w:r>
     </w:p>
     <w:p>
@@ -756,7 +756,7 @@
         <w:pStyle w:val="BodyText"/>
       </w:pPr>
       <w:r>
-        <w:t xml:space="preserve">Table 3. Initial search candidates (forest predictions from models trained without each listing’s host)</w:t>
+        <w:t xml:space="preserve">Table 3. Initial search candidates (forest predictions from host-grouped validation)</w:t>
       </w:r>
     </w:p>
     <w:tbl>
@@ -1010,7 +1010,7 @@
         <w:pStyle w:val="BodyText"/>
       </w:pPr>
       <w:r>
-        <w:t xml:space="preserve">The ranges resample hosts with predictions held fixed, exclude model refitting, selection and threshold uncertainty, and are much narrower than Figure 1’s observed-rate ranges. Descriptive evidence supports H1: segments differ (8.25% to 36.60%), though neighbouring segments overlap. H2 is supported by nested host-grouped validation on ranking metrics but not on the shortlist: the model changes no candidate, so segment comparison carries the decision and the model adds a supplementary historical score. Descriptively, the same three segments lead under support rules of 30, 50 and 75 listings and without the history or price rule; the forest’s top three recur in 19 of 20 host splits.</w:t>
+        <w:t xml:space="preserve">The ranges resample hosts with predictions held fixed, exclude refitting, selection and threshold uncertainty, and are much narrower than Figure 1’s observed-rate ranges. Descriptive evidence supports H1: segments differ (8.25% to 36.60%), though neighbours overlap. H2 is supported by nested host-grouped validation on ranking metrics but not on the shortlist: the model changes no candidate; its value lies within segments, where it separates listings that reached the target from those that did not better than the segment rate (AUC 0.64 versus 0.58), and can score a specific property once found. Descriptively, the same three segments lead under support rules of 30, 50 and 75 listings, without the history or price rule, and for review targets from 25 to 35 (the top two swap at 34 or more); the forest’s top three recur in 19 of 20 host splits.</w:t>
       </w:r>
     </w:p>
     <w:p>
@@ -1018,7 +1018,7 @@
         <w:pStyle w:val="BodyText"/>
       </w:pPr>
       <w:r>
-        <w:t xml:space="preserve">An out-of-time check (2,657 listings, 1,208 hosts, 10 segments, two years of reviews) uses two non-overlapping 365-day windows and a 34-review target set from the reference hosts’ earlier window. The earlier year’s top three segments reached it in 27.1% of listings the following year against 14.9% elsewhere, a 12.3-point lead (host-resampled 95% range 5.1–20.1); the exact top-three set recurred in 51.5% of resamples. This is a persisting historical advantage, not a new operator’s profit.</w:t>
+        <w:t xml:space="preserve">An out-of-time check (2,657 listings, 1,208 hosts, 10 segments) uses two non-overlapping 365-day windows and a 34-review target set from the reference hosts’ earlier window. The earlier year’s top three segments reached it in 27.1% of listings the following year against 14.9% elsewhere, a 12.3-point lead (host-resampled 95% range 5.1–20.1); the exact top-three set recurred in 51.5% of resamples. This is a persisting historical advantage, not a new operator’s profit.</w:t>
       </w:r>
     </w:p>
     <w:p>
@@ -1046,7 +1046,7 @@
         </w:numPr>
       </w:pPr>
       <w:r>
-        <w:t xml:space="preserve">Refit the fixed forest and re-rank with uncertainty ranges under wider property-type and history rules — Eric Huang (modelling lead) and Maksym Xu (data lead), Weeks 9–10 (by 2 Oct).</w:t>
+        <w:t xml:space="preserve">Refit the fixed forest and re-rank under wider property-type and history rules — Eric Huang (modelling lead) and Maksym Xu (data lead), Weeks 9–10 (by 2 Oct).</w:t>
       </w:r>
     </w:p>
     <w:p>
@@ -1078,7 +1078,7 @@
         <w:pStyle w:val="FirstParagraph"/>
       </w:pPr>
       <w:r>
-        <w:t xml:space="preserve">If model gains do not persist, segment rates remain the main screening tool; if rankings change under wider dwelling definitions, we will present a broader candidate set.</w:t>
+        <w:t xml:space="preserve">If the gain does not persist under wider rules, segment rates remain the main screening tool; if rankings change, we will present a broader candidate set.</w:t>
       </w:r>
     </w:p>
     <w:bookmarkEnd w:id="30"/>

</xml_diff>

<commit_message>
Replace the unsupported within-segment claim and tighten validation wording
- The model's contribution is now stated as improving overall listing-level
  prediction while leaving the shortlist unchanged, with a supplementary
  within-segment score; script 13 reports the within-segment AUC (0.56,
  listing-weighted, nine of fourteen segments above 0.5) so the size of that
  supplement is on record
- Calibration: predicted and observed rates differ by about two percentage
  points across five bins (largest gap 2.1)
- Nested check described as selecting models using only each outer training
  fold; all host-resampled ranges stated to hold predictions fixed
- Review-target sensitivity named as 25, 30, 34 and 35
- Table 1 and Table 3 column widths set so labels wrap whole
</commit_message>
<xml_diff>
--- a/reports/Interim_Project_Report.docx
+++ b/reports/Interim_Project_Report.docx
@@ -514,7 +514,7 @@
         <w:pStyle w:val="BodyText"/>
       </w:pPr>
       <w:r>
-        <w:t xml:space="preserve">Because candidates were compared after seeing fold results, selection is repeated inside each outer training fold (nested, host-grouped) so outer folds never influence it; property details may also have changed during the outcome year.</w:t>
+        <w:t xml:space="preserve">Because candidates were compared after seeing fold results, selection is repeated in a nested check where models are selected using only each outer training fold; property details may also have changed during the outcome year.</w:t>
       </w:r>
     </w:p>
     <w:bookmarkEnd w:id="29"/>
@@ -748,7 +748,7 @@
         <w:pStyle w:val="BodyText"/>
       </w:pPr>
       <w:r>
-        <w:t xml:space="preserve">The enhanced random forest beats the segment average in all five folds and, across 20 further host splits, on AUC every time and on Brier in 16. A nested check that re-selects the model inside each outer training fold chooses the forest every time: AUC +0.059 (host-resampled 95% range +0.02 to +0.10), Brier −0.0055 (−0.010 to −0.001). Predicted rates track observed rates within two points across five bins.</w:t>
+        <w:t xml:space="preserve">The enhanced random forest beats the segment average in all five folds and, across 20 further host splits, on AUC every time and on Brier in 16. A nested check that re-selects the model inside each outer training fold chooses the forest every time: AUC +0.059 (host-resampled 95% range +0.02 to +0.10), Brier −0.0055 (−0.010 to −0.001). Across five probability bins, predicted and observed rates differ by about two percentage points.</w:t>
       </w:r>
     </w:p>
     <w:p>
@@ -767,11 +767,11 @@
         <w:tblLook w:firstRow="1" w:lastRow="0" w:firstColumn="0" w:lastColumn="0" w:noHBand="0" w:noVBand="0" w:val="0020"/>
       </w:tblPr>
       <w:tblGrid>
-        <w:gridCol w:w="1584"/>
-        <w:gridCol w:w="1584"/>
-        <w:gridCol w:w="1584"/>
-        <w:gridCol w:w="1584"/>
-        <w:gridCol w:w="1584"/>
+        <w:gridCol w:w="2917"/>
+        <w:gridCol w:w="1250"/>
+        <w:gridCol w:w="1250"/>
+        <w:gridCol w:w="1250"/>
+        <w:gridCol w:w="1250"/>
       </w:tblGrid>
       <w:tr>
         <w:trPr>
@@ -1010,7 +1010,7 @@
         <w:pStyle w:val="BodyText"/>
       </w:pPr>
       <w:r>
-        <w:t xml:space="preserve">The ranges resample hosts with predictions held fixed, exclude refitting, selection and threshold uncertainty, and are much narrower than Figure 1’s observed-rate ranges. Descriptive evidence supports H1: segments differ (8.25% to 36.60%), though neighbours overlap. H2 is supported by nested host-grouped validation on ranking metrics but not on the shortlist: the model changes no candidate; its value lies within segments, where it separates listings that reached the target from those that did not better than the segment rate (AUC 0.64 versus 0.58), and can score a specific property once found. Descriptively, the same three segments lead under support rules of 30, 50 and 75 listings, without the history or price rule, and for review targets from 25 to 35 (the top two swap at 34 or more); the forest’s top three recur in 19 of 20 host splits.</w:t>
+        <w:t xml:space="preserve">All reported host-resampled ranges hold predictions fixed and exclude refitting, selection and threshold uncertainty; Table 3’s are much narrower than Figure 1’s observed-rate ranges. Descriptive evidence supports H1: segments differ (8.25% to 36.60%), though neighbours overlap. H2 is supported by nested host-grouped validation on ranking metrics but not on the shortlist: the model improves overall listing-level prediction but leaves the shortlist unchanged. Segment rates guide the search, while the model provides a supplementary historical score for individual listings (within-segment AUC 0.56). Descriptively, the same three segments lead under support rules of 30, 50 and 75 listings, without the history or price rule, and at review targets of 25, 30, 34 and 35 (the top two swap at 34 and 35); the forest’s top three recur in 19 of 20 host splits.</w:t>
       </w:r>
     </w:p>
     <w:p>

</xml_diff>

<commit_message>
Unify the within-segment AUC to 0.555 and trim to a verified word count
- Within-segment AUC written as 0.555 (three decimals from the published
  0.55474) in the report, README and directory guide, avoiding double
  rounding
- Microsoft Word count of the rebuilt document: 1,485 in total (title block
  30, body 1,343 including tables and the figure caption, references and
  acknowledgement 112)
</commit_message>
<xml_diff>
--- a/reports/Interim_Project_Report.docx
+++ b/reports/Interim_Project_Report.docx
@@ -74,7 +74,7 @@
         <w:t xml:space="preserve">“rental arbitrage”</w:t>
       </w:r>
       <w:r>
-        <w:t xml:space="preserve">), which needs lease and council permission. With limited start-up funds, the client must choose which Melbourne areas and property types to investigate before signing leases; a poor choice ties up money and delays the business.</w:t>
+        <w:t xml:space="preserve">), which needs lease and council permission. With limited start-up funds, the client must choose which Melbourne areas and property types to investigate before signing leases; a poor choice ties up money.</w:t>
       </w:r>
     </w:p>
     <w:p>
@@ -108,7 +108,7 @@
         <w:pStyle w:val="FirstParagraph"/>
       </w:pPr>
       <w:r>
-        <w:t xml:space="preserve">Research questions: (1) Which Melbourne property segments — defined by council area (LGA), apartment or house, and number of bedrooms — show the strongest historical guest-review activity? (2) Can listing attributes improve prediction of high review activity beyond segment averages?</w:t>
+        <w:t xml:space="preserve">Research questions: (1) Which Melbourne property segments, defined by council area (LGA), apartment or house, and number of bedrooms, show the strongest historical guest-review activity? (2) Can listing attributes improve prediction of high review activity beyond segment averages?</w:t>
       </w:r>
       <w:r>
         <w:t xml:space="preserve"> </w:t>
@@ -532,7 +532,7 @@
         <w:pStyle w:val="FirstParagraph"/>
       </w:pPr>
       <w:r>
-        <w:t xml:space="preserve">Following Week 5 feedback, we dropped the earlier rent-versus-revenue (ROI) design, which needed external rental data, and now compare only within the snapshot.</w:t>
+        <w:t xml:space="preserve">Following Week 5 feedback, we dropped the earlier rent-versus-revenue (ROI) design, which needed external rental data, and now compare within the snapshot.</w:t>
       </w:r>
     </w:p>
     <w:p>
@@ -756,7 +756,7 @@
         <w:pStyle w:val="BodyText"/>
       </w:pPr>
       <w:r>
-        <w:t xml:space="preserve">Table 3. Initial search candidates (forest predictions from host-grouped validation)</w:t>
+        <w:t xml:space="preserve">Table 3. Initial search candidates (host-grouped forest predictions)</w:t>
       </w:r>
     </w:p>
     <w:tbl>
@@ -1010,7 +1010,7 @@
         <w:pStyle w:val="BodyText"/>
       </w:pPr>
       <w:r>
-        <w:t xml:space="preserve">All reported host-resampled ranges hold predictions fixed and exclude refitting, selection and threshold uncertainty; Table 3’s are much narrower than Figure 1’s observed-rate ranges. Descriptive evidence supports H1: segments differ (8.25% to 36.60%), though neighbours overlap. H2 is supported by nested host-grouped validation on ranking metrics but not on the shortlist: the model improves overall listing-level prediction but leaves the shortlist unchanged. Segment rates guide the search, while the model provides a supplementary historical score for individual listings (within-segment AUC 0.56). Descriptively, the same three segments lead under support rules of 30, 50 and 75 listings, without the history or price rule, and at review targets of 25, 30, 34 and 35 (the top two swap at 34 and 35); the forest’s top three recur in 19 of 20 host splits.</w:t>
+        <w:t xml:space="preserve">All reported host-resampled ranges hold predictions fixed and exclude refitting, selection and threshold uncertainty; Table 3’s are much narrower than Figure 1’s observed-rate ranges. Descriptive evidence supports H1: segments differ (8.25% to 36.60%), though neighbours overlap. H2 is supported by nested host-grouped validation on ranking metrics but not on the shortlist: the model improves overall listing-level prediction but leaves the shortlist unchanged. Segment rates guide the search, while the model provides a supplementary historical score for individual listings (within-segment AUC 0.555). Descriptively, the same three segments lead under support rules of 30, 50 and 75 listings, without the history or price rule, and at review targets of 25, 30, 34 and 35 (the top two swap at 34 and 35); the forest’s top three recur in 19 of 20 host splits.</w:t>
       </w:r>
     </w:p>
     <w:p>
@@ -1018,7 +1018,7 @@
         <w:pStyle w:val="BodyText"/>
       </w:pPr>
       <w:r>
-        <w:t xml:space="preserve">An out-of-time check (2,657 listings, 1,208 hosts, 10 segments) uses two non-overlapping 365-day windows and a 34-review target set from the reference hosts’ earlier window. The earlier year’s top three segments reached it in 27.1% of listings the following year against 14.9% elsewhere, a 12.3-point lead (host-resampled 95% range 5.1–20.1); the exact top-three set recurred in 51.5% of resamples. This is a persisting historical advantage, not a new operator’s profit.</w:t>
+        <w:t xml:space="preserve">An out-of-time check (2,657 listings, 1,208 hosts, 10 segments) uses two non-overlapping 365-day windows and a 34-review target set from the reference hosts’ earlier window. The earlier year’s top three segments reached it in 27.1% of listings the following year against 14.9% elsewhere, a 12.3-point lead (host-resampled 95% range 5.1–20.1); the exact top-three set recurred in 51.5% of resamples: a persisting historical advantage, not a new operator’s profit.</w:t>
       </w:r>
     </w:p>
     <w:p>
@@ -1026,7 +1026,7 @@
         <w:pStyle w:val="BodyText"/>
       </w:pPr>
       <w:r>
-        <w:t xml:space="preserve">Before signing, the client must still verify permissions, rent, costs and availability.</w:t>
+        <w:t xml:space="preserve">Before signing, the client must verify permissions, rent, costs and availability.</w:t>
       </w:r>
     </w:p>
     <w:p>
@@ -1046,7 +1046,7 @@
         </w:numPr>
       </w:pPr>
       <w:r>
-        <w:t xml:space="preserve">Refit the fixed forest and re-rank under wider property-type and history rules — Eric Huang (modelling lead) and Maksym Xu (data lead), Weeks 9–10 (by 2 Oct).</w:t>
+        <w:t xml:space="preserve">Refit the fixed forest and re-rank under wider property-type and history rules: Eric Huang (modelling lead) and Maksym Xu (data lead), Weeks 9–10 (by 2 Oct).</w:t>
       </w:r>
     </w:p>
     <w:p>
@@ -1058,7 +1058,7 @@
         </w:numPr>
       </w:pPr>
       <w:r>
-        <w:t xml:space="preserve">One-page client brief with search priorities and pre-lease checklist — Loc Le (report lead), Week 11 (by 13 Oct).</w:t>
+        <w:t xml:space="preserve">One-page client brief with search priorities and pre-lease checklist: Loc Le (report lead), Week 11 (by 13 Oct).</w:t>
       </w:r>
     </w:p>
     <w:p>
@@ -1070,7 +1070,7 @@
         </w:numPr>
       </w:pPr>
       <w:r>
-        <w:t xml:space="preserve">Final report and presentation — all, Qihang Sun coordinating, Weeks 11–12.</w:t>
+        <w:t xml:space="preserve">Final report and presentation: all, Qihang Sun coordinating, Weeks 11–12.</w:t>
       </w:r>
     </w:p>
     <w:p>

</xml_diff>

<commit_message>
Reword the AI use acknowledgement and trim the body
- Acknowledgement states that the business problem, research questions,
  scope rules, methods, data decisions and interpretation are the group's
  own, and that the tools were used to polish report English, implement and
  debug analysis scripts to the group's specification, and check quoted
  figures against the repository tables
- Body trimmed to compensate; Microsoft Word count of the whole document
  1,483
</commit_message>
<xml_diff>
--- a/reports/Interim_Project_Report.docx
+++ b/reports/Interim_Project_Report.docx
@@ -90,7 +90,7 @@
         <w:pStyle w:val="BodyText"/>
       </w:pPr>
       <w:r>
-        <w:t xml:space="preserve">The shortlist helps the client decide where to spend limited search and due-diligence time before requesting lease quotations.</w:t>
+        <w:t xml:space="preserve">The shortlist helps the client decide where to spend limited search and due-diligence time before seeking lease quotations.</w:t>
       </w:r>
     </w:p>
     <w:bookmarkEnd w:id="23"/>
@@ -136,7 +136,7 @@
         <w:pStyle w:val="BodyText"/>
       </w:pPr>
       <w:r>
-        <w:t xml:space="preserve">Objectives: a segment comparison table, a model-versus-average test and a shortlist with uncertainty ranges.</w:t>
+        <w:t xml:space="preserve">Objectives: a segment comparison table, a model-versus-average test and a shortlist with ranges.</w:t>
       </w:r>
     </w:p>
     <w:p>
@@ -179,7 +179,7 @@
         <w:pStyle w:val="FirstParagraph"/>
       </w:pPr>
       <w:r>
-        <w:t xml:space="preserve">The dataset contains 25,728 listings and 1,026,690 reviews, collected between 17 June and 1 July 2026. Its modelled occupancy and revenue fields are built from price, minimum stay and review counts, so ranking on them would reproduce that construction; we rank on review counts directly.</w:t>
+        <w:t xml:space="preserve">The dataset contains 25,728 listings and 1,026,690 reviews, collected between 17 June and 1 July 2026. Its modelled occupancy and revenue fields are built from price, minimum stay and review counts, so ranking on them would reproduce that construction; we rank on review counts.</w:t>
       </w:r>
     </w:p>
     <w:p>
@@ -409,7 +409,7 @@
         <w:pStyle w:val="BodyText"/>
       </w:pPr>
       <w:r>
-        <w:t xml:space="preserve">The reference group’s 75th percentile is 29.75 reviews, giving a threshold of 30. The analysis sample (3,873 listings from 1,726 hosts) has 14 segments across six LGAs, about 64% in Melbourne LGA, and keeps 334 listings with zero annual reviews. Overall, 981 listings (25.33%) reach the threshold, and attainment ranges from 8.25% to 36.60% across segments (Figure 1).</w:t>
+        <w:t xml:space="preserve">The reference group’s 75th percentile, 29.75 reviews, gives a threshold of 30. The analysis sample (3,873 listings from 1,726 hosts) has 14 segments across six LGAs, about 64% in Melbourne LGA, and keeps 334 listings with zero annual reviews. Overall, 981 listings (25.33%) reach the threshold, and attainment ranges from 8.25% to 36.60% across segments (Figure 1).</w:t>
       </w:r>
     </w:p>
     <w:p>
@@ -472,7 +472,7 @@
         <w:pStyle w:val="BodyText"/>
       </w:pPr>
       <w:r>
-        <w:t xml:space="preserve">Of the 6,801 listings with no usable price (missing or outside AUD 30–1,500), 82% had no review in the past year: the priced sample is the more active part of the market. Listings that left Airbnb before collection are absent, which limits generalisation to new entrants.</w:t>
+        <w:t xml:space="preserve">Of the 6,801 listings with no usable price (missing or outside AUD 30–1,500), 82% had no review last year: the priced sample is the more active part of the market. Listings that left Airbnb before collection are absent, limiting generalisation to new entrants.</w:t>
       </w:r>
     </w:p>
     <w:bookmarkEnd w:id="28"/>
@@ -498,7 +498,7 @@
         <w:pStyle w:val="BodyText"/>
       </w:pPr>
       <w:r>
-        <w:t xml:space="preserve">Logistic regression is the simple reference; random forest and gradient boosting capture nonlinear patterns. Basic features are location, configuration, capacity, bathrooms and amenity count; an enhanced set adds coordinates, beds and nine amenities. We compare six variants, with and without probability calibration and with and without current price and minimum stay. Review-based predictors, ratings and host badges are excluded.</w:t>
+        <w:t xml:space="preserve">Logistic regression is the reference; random forest and gradient boosting capture nonlinear patterns. Basic features are location, configuration, capacity, bathrooms and amenity count; an enhanced set adds coordinates, beds and nine amenities. We compare six variants, with and without probability calibration and with and without current price and minimum stay. Review-based predictors, ratings and host badges are excluded.</w:t>
       </w:r>
     </w:p>
     <w:p>
@@ -506,7 +506,7 @@
         <w:pStyle w:val="BodyText"/>
       </w:pPr>
       <w:r>
-        <w:t xml:space="preserve">Every model is compared with a segment-average baseline: each listing gets its segment’s attainment among training hosts. AUC is how well the model orders listings that reach the target above those that do not; 0.5 is a coin toss. Average precision summarises precision across prediction thresholds. Brier score is how far its percentages are from what happened; lower is better. R handles cleaning and tables; Python (scikit-learn 1.7.2) runs the models.</w:t>
+        <w:t xml:space="preserve">Every model is compared with a segment-average baseline: each listing gets its segment’s training-host attainment. AUC is how well the model orders listings that reach the target above those that do not; 0.5 is a coin toss. Average precision summarises precision across prediction thresholds. Brier score is how far its percentages are from what happened; lower is better. R handles cleaning and tables; Python (scikit-learn 1.7.2) runs the models.</w:t>
       </w:r>
     </w:p>
     <w:p>
@@ -514,7 +514,7 @@
         <w:pStyle w:val="BodyText"/>
       </w:pPr>
       <w:r>
-        <w:t xml:space="preserve">Because candidates were compared after seeing fold results, selection is repeated in a nested check where models are selected using only each outer training fold; property details may also have changed during the outcome year.</w:t>
+        <w:t xml:space="preserve">Because candidates were compared after seeing fold results, selection is repeated in a nested check where models are selected using only each outer training fold; property details may have changed during the outcome year.</w:t>
       </w:r>
     </w:p>
     <w:bookmarkEnd w:id="29"/>
@@ -532,7 +532,7 @@
         <w:pStyle w:val="FirstParagraph"/>
       </w:pPr>
       <w:r>
-        <w:t xml:space="preserve">Following Week 5 feedback, we dropped the earlier rent-versus-revenue (ROI) design, which needed external rental data, and now compare within the snapshot.</w:t>
+        <w:t xml:space="preserve">Following Week 5 feedback, we dropped the earlier rent-versus-revenue (ROI) design, which needed external rental data.</w:t>
       </w:r>
     </w:p>
     <w:p>
@@ -748,7 +748,7 @@
         <w:pStyle w:val="BodyText"/>
       </w:pPr>
       <w:r>
-        <w:t xml:space="preserve">The enhanced random forest beats the segment average in all five folds and, across 20 further host splits, on AUC every time and on Brier in 16. A nested check that re-selects the model inside each outer training fold chooses the forest every time: AUC +0.059 (host-resampled 95% range +0.02 to +0.10), Brier −0.0055 (−0.010 to −0.001). Across five probability bins, predicted and observed rates differ by about two percentage points.</w:t>
+        <w:t xml:space="preserve">The enhanced random forest beats the segment average in all five folds and, across 20 further host splits on AUC every time and on Brier in 16. A nested check that re-selects the model inside each outer training fold chooses the forest every time: AUC +0.059 (host-resampled 95% range +0.02 to +0.10), Brier −0.0055 (−0.010 to −0.001). Across five probability bins, predicted and observed rates differ by about two percentage points.</w:t>
       </w:r>
     </w:p>
     <w:p>
@@ -1010,7 +1010,7 @@
         <w:pStyle w:val="BodyText"/>
       </w:pPr>
       <w:r>
-        <w:t xml:space="preserve">All reported host-resampled ranges hold predictions fixed and exclude refitting, selection and threshold uncertainty; Table 3’s are much narrower than Figure 1’s observed-rate ranges. Descriptive evidence supports H1: segments differ (8.25% to 36.60%), though neighbours overlap. H2 is supported by nested host-grouped validation on ranking metrics but not on the shortlist: the model improves overall listing-level prediction but leaves the shortlist unchanged. Segment rates guide the search, while the model provides a supplementary historical score for individual listings (within-segment AUC 0.555). Descriptively, the same three segments lead under support rules of 30, 50 and 75 listings, without the history or price rule, and at review targets of 25, 30, 34 and 35 (the top two swap at 34 and 35); the forest’s top three recur in 19 of 20 host splits.</w:t>
+        <w:t xml:space="preserve">All reported host-resampled ranges hold predictions fixed and exclude refitting, selection and threshold uncertainty; Table 3’s are much narrower than Figure 1’s observed-rate ranges. Descriptive evidence supports H1: segments differ (8.25% to 36.60%), though neighbours overlap. H2 is supported by nested host-grouped validation on ranking metrics: the model improves overall listing-level prediction but leaves the shortlist unchanged. Segment rates guide the search; the model provides a supplementary historical score for individual listings (within-segment AUC 0.555). Descriptively, the same three segments lead under support rules of 30, 50 and 75 listings, without the history or price rule, and at review targets of 25, 30, 34 and 35 (the top two swap at 34 and 35); the forest’s top three recur in 19 of 20 host splits.</w:t>
       </w:r>
     </w:p>
     <w:p>
@@ -1078,7 +1078,7 @@
         <w:pStyle w:val="FirstParagraph"/>
       </w:pPr>
       <w:r>
-        <w:t xml:space="preserve">If the gain does not persist under wider rules, segment rates remain the main screening tool; if rankings change, we will present a broader candidate set.</w:t>
+        <w:t xml:space="preserve">If the gain does not persist under wider rules, segment rates remain the main screening tool; if rankings change, we present a broader candidate set.</w:t>
       </w:r>
     </w:p>
     <w:bookmarkEnd w:id="30"/>
@@ -1138,7 +1138,7 @@
         <w:pStyle w:val="FirstParagraph"/>
       </w:pPr>
       <w:r>
-        <w:t xml:space="preserve">We used OpenAI ChatGPT/Codex and Anthropic Claude Code to support project planning, analysis-code development, interpretation of results, report drafting and English editing. This included refining the research question and reviewing the validation approach. AI-assisted text and code are included in the project. The group is responsible for the accuracy and content of the final submission.</w:t>
+        <w:t xml:space="preserve">The business problem, research questions, scope rules, choice of methods, data decisions and interpretation of results are the group’s own. We used OpenAI ChatGPT/Codex and Anthropic Claude Code to polish the English of report text written from our results, to implement and debug analysis scripts to our specification, and to check quoted figures against the repository tables. The group reviewed all AI-assisted text and code and is responsible for the accuracy and content of this submission.</w:t>
       </w:r>
     </w:p>
     <w:bookmarkEnd w:id="32"/>

</xml_diff>